<commit_message>
Se agrego la caratula y las consignas
</commit_message>
<xml_diff>
--- a/TPI-ASI-2026.docx
+++ b/TPI-ASI-2026.docx
@@ -10,10 +10,143 @@
       </w:pPr>
       <w:r>
         <w:rPr>
+          <w:noProof/>
+          <w:bdr w:val="none" w:sz="0" w:space="0" w:color="auto" w:frame="1"/>
+        </w:rPr>
+        <w:drawing>
+          <wp:anchor distT="0" distB="0" distL="114300" distR="114300" simplePos="0" relativeHeight="251658240" behindDoc="0" locked="0" layoutInCell="1" allowOverlap="1" wp14:anchorId="46F55579" wp14:editId="5F9B6CE8">
+            <wp:simplePos x="0" y="0"/>
+            <wp:positionH relativeFrom="column">
+              <wp:posOffset>573405</wp:posOffset>
+            </wp:positionH>
+            <wp:positionV relativeFrom="paragraph">
+              <wp:posOffset>0</wp:posOffset>
+            </wp:positionV>
+            <wp:extent cx="3368040" cy="998220"/>
+            <wp:effectExtent l="0" t="0" r="3810" b="0"/>
+            <wp:wrapSquare wrapText="bothSides"/>
+            <wp:docPr id="1019801643" name="Imagen 1"/>
+            <wp:cNvGraphicFramePr>
+              <a:graphicFrameLocks xmlns:a="http://schemas.openxmlformats.org/drawingml/2006/main" noChangeAspect="1"/>
+            </wp:cNvGraphicFramePr>
+            <a:graphic xmlns:a="http://schemas.openxmlformats.org/drawingml/2006/main">
+              <a:graphicData uri="http://schemas.openxmlformats.org/drawingml/2006/picture">
+                <pic:pic xmlns:pic="http://schemas.openxmlformats.org/drawingml/2006/picture">
+                  <pic:nvPicPr>
+                    <pic:cNvPr id="0" name="Picture 1"/>
+                    <pic:cNvPicPr>
+                      <a:picLocks noChangeAspect="1" noChangeArrowheads="1"/>
+                    </pic:cNvPicPr>
+                  </pic:nvPicPr>
+                  <pic:blipFill>
+                    <a:blip r:embed="rId4">
+                      <a:extLst>
+                        <a:ext uri="{28A0092B-C50C-407E-A947-70E740481C1C}">
+                          <a14:useLocalDpi xmlns:a14="http://schemas.microsoft.com/office/drawing/2010/main" val="0"/>
+                        </a:ext>
+                      </a:extLst>
+                    </a:blip>
+                    <a:srcRect/>
+                    <a:stretch>
+                      <a:fillRect/>
+                    </a:stretch>
+                  </pic:blipFill>
+                  <pic:spPr bwMode="auto">
+                    <a:xfrm>
+                      <a:off x="0" y="0"/>
+                      <a:ext cx="3368040" cy="998220"/>
+                    </a:xfrm>
+                    <a:prstGeom prst="rect">
+                      <a:avLst/>
+                    </a:prstGeom>
+                    <a:noFill/>
+                    <a:ln>
+                      <a:noFill/>
+                    </a:ln>
+                  </pic:spPr>
+                </pic:pic>
+              </a:graphicData>
+            </a:graphic>
+          </wp:anchor>
+        </w:drawing>
+      </w:r>
+      <w:r>
+        <w:rPr>
+          <w:rFonts w:ascii="Arial" w:hAnsi="Arial" w:cs="Arial"/>
+          <w:noProof/>
+          <w:color w:val="000000"/>
+          <w:bdr w:val="none" w:sz="0" w:space="0" w:color="auto" w:frame="1"/>
+        </w:rPr>
+        <w:drawing>
+          <wp:anchor distT="0" distB="0" distL="114300" distR="114300" simplePos="0" relativeHeight="251659264" behindDoc="1" locked="0" layoutInCell="1" allowOverlap="1" wp14:anchorId="053EF99F" wp14:editId="05D877F5">
+            <wp:simplePos x="0" y="0"/>
+            <wp:positionH relativeFrom="column">
+              <wp:posOffset>5198745</wp:posOffset>
+            </wp:positionH>
+            <wp:positionV relativeFrom="paragraph">
+              <wp:posOffset>-899795</wp:posOffset>
+            </wp:positionV>
+            <wp:extent cx="1275080" cy="10736580"/>
+            <wp:effectExtent l="0" t="0" r="1270" b="7620"/>
+            <wp:wrapNone/>
+            <wp:docPr id="1612125081" name="Imagen 2"/>
+            <wp:cNvGraphicFramePr>
+              <a:graphicFrameLocks xmlns:a="http://schemas.openxmlformats.org/drawingml/2006/main" noChangeAspect="1"/>
+            </wp:cNvGraphicFramePr>
+            <a:graphic xmlns:a="http://schemas.openxmlformats.org/drawingml/2006/main">
+              <a:graphicData uri="http://schemas.openxmlformats.org/drawingml/2006/picture">
+                <pic:pic xmlns:pic="http://schemas.openxmlformats.org/drawingml/2006/picture">
+                  <pic:nvPicPr>
+                    <pic:cNvPr id="0" name="Picture 3"/>
+                    <pic:cNvPicPr>
+                      <a:picLocks noChangeAspect="1" noChangeArrowheads="1"/>
+                    </pic:cNvPicPr>
+                  </pic:nvPicPr>
+                  <pic:blipFill>
+                    <a:blip r:embed="rId5">
+                      <a:extLst>
+                        <a:ext uri="{28A0092B-C50C-407E-A947-70E740481C1C}">
+                          <a14:useLocalDpi xmlns:a14="http://schemas.microsoft.com/office/drawing/2010/main" val="0"/>
+                        </a:ext>
+                      </a:extLst>
+                    </a:blip>
+                    <a:srcRect/>
+                    <a:stretch>
+                      <a:fillRect/>
+                    </a:stretch>
+                  </pic:blipFill>
+                  <pic:spPr bwMode="auto">
+                    <a:xfrm flipH="1">
+                      <a:off x="0" y="0"/>
+                      <a:ext cx="1275080" cy="10736580"/>
+                    </a:xfrm>
+                    <a:prstGeom prst="rect">
+                      <a:avLst/>
+                    </a:prstGeom>
+                    <a:noFill/>
+                    <a:ln>
+                      <a:noFill/>
+                    </a:ln>
+                  </pic:spPr>
+                </pic:pic>
+              </a:graphicData>
+            </a:graphic>
+            <wp14:sizeRelH relativeFrom="margin">
+              <wp14:pctWidth>0</wp14:pctWidth>
+            </wp14:sizeRelH>
+            <wp14:sizeRelV relativeFrom="margin">
+              <wp14:pctHeight>0</wp14:pctHeight>
+            </wp14:sizeRelV>
+          </wp:anchor>
+        </w:drawing>
+      </w:r>
+    </w:p>
+    <w:p>
+      <w:pPr>
+        <w:rPr>
           <w:lang w:val="es-ES"/>
         </w:rPr>
-        <w:t>TPI-ASI-2026</w:t>
-      </w:r>
+      </w:pPr>
     </w:p>
     <w:p>
       <w:pPr>
@@ -21,6 +154,1196 @@
           <w:lang w:val="es-ES"/>
         </w:rPr>
       </w:pPr>
+    </w:p>
+    <w:p>
+      <w:pPr>
+        <w:rPr>
+          <w:lang w:val="es-ES"/>
+        </w:rPr>
+      </w:pPr>
+    </w:p>
+    <w:p>
+      <w:pPr>
+        <w:spacing w:after="0" w:line="240" w:lineRule="auto"/>
+        <w:rPr>
+          <w:lang w:val="es-ES"/>
+        </w:rPr>
+      </w:pPr>
+    </w:p>
+    <w:p>
+      <w:pPr>
+        <w:spacing w:after="0" w:line="240" w:lineRule="auto"/>
+        <w:rPr>
+          <w:rFonts w:ascii="Times New Roman" w:eastAsia="Times New Roman" w:hAnsi="Times New Roman" w:cs="Times New Roman"/>
+          <w:kern w:val="0"/>
+          <w:sz w:val="24"/>
+          <w:szCs w:val="24"/>
+          <w:lang w:eastAsia="es-AR"/>
+          <w14:ligatures w14:val="none"/>
+        </w:rPr>
+      </w:pPr>
+      <w:r>
+        <w:rPr>
+          <w:lang w:val="es-ES"/>
+        </w:rPr>
+        <w:t xml:space="preserve">          </w:t>
+      </w:r>
+      <w:r>
+        <w:rPr>
+          <w:rFonts w:ascii="Arial" w:eastAsia="Times New Roman" w:hAnsi="Arial" w:cs="Arial"/>
+          <w:i/>
+          <w:iCs/>
+          <w:color w:val="000000"/>
+          <w:kern w:val="0"/>
+          <w:sz w:val="28"/>
+          <w:szCs w:val="28"/>
+          <w:lang w:eastAsia="es-AR"/>
+          <w14:ligatures w14:val="none"/>
+        </w:rPr>
+        <w:t>INGENIERÍA EN SISTEMAS DE INFORMACIÓN</w:t>
+      </w:r>
+    </w:p>
+    <w:p>
+      <w:pPr>
+        <w:spacing w:after="0" w:line="240" w:lineRule="auto"/>
+        <w:rPr>
+          <w:rFonts w:ascii="Times New Roman" w:eastAsia="Times New Roman" w:hAnsi="Times New Roman" w:cs="Times New Roman"/>
+          <w:kern w:val="0"/>
+          <w:sz w:val="24"/>
+          <w:szCs w:val="24"/>
+          <w:lang w:eastAsia="es-AR"/>
+          <w14:ligatures w14:val="none"/>
+        </w:rPr>
+      </w:pPr>
+    </w:p>
+    <w:p>
+      <w:pPr>
+        <w:spacing w:after="0" w:line="240" w:lineRule="auto"/>
+        <w:rPr>
+          <w:rFonts w:ascii="Times New Roman" w:eastAsia="Times New Roman" w:hAnsi="Times New Roman" w:cs="Times New Roman"/>
+          <w:kern w:val="0"/>
+          <w:sz w:val="24"/>
+          <w:szCs w:val="24"/>
+          <w:lang w:eastAsia="es-AR"/>
+          <w14:ligatures w14:val="none"/>
+        </w:rPr>
+      </w:pPr>
+      <w:r>
+        <w:rPr>
+          <w:rFonts w:ascii="Arial" w:eastAsia="Times New Roman" w:hAnsi="Arial" w:cs="Arial"/>
+          <w:color w:val="000000"/>
+          <w:kern w:val="0"/>
+          <w:sz w:val="20"/>
+          <w:szCs w:val="20"/>
+          <w:lang w:eastAsia="es-AR"/>
+          <w14:ligatures w14:val="none"/>
+        </w:rPr>
+        <w:t xml:space="preserve">                                                    </w:t>
+      </w:r>
+      <w:r>
+        <w:rPr>
+          <w:rFonts w:ascii="Arial" w:eastAsia="Times New Roman" w:hAnsi="Arial" w:cs="Arial"/>
+          <w:color w:val="000000"/>
+          <w:kern w:val="0"/>
+          <w:sz w:val="20"/>
+          <w:szCs w:val="20"/>
+          <w:u w:val="single"/>
+          <w:lang w:eastAsia="es-AR"/>
+          <w14:ligatures w14:val="none"/>
+        </w:rPr>
+        <w:t>ASIGNATURA:</w:t>
+      </w:r>
+    </w:p>
+    <w:p>
+      <w:pPr>
+        <w:spacing w:after="0" w:line="240" w:lineRule="auto"/>
+        <w:rPr>
+          <w:rFonts w:ascii="Times New Roman" w:eastAsia="Times New Roman" w:hAnsi="Times New Roman" w:cs="Times New Roman"/>
+          <w:kern w:val="0"/>
+          <w:sz w:val="24"/>
+          <w:szCs w:val="24"/>
+          <w:lang w:eastAsia="es-AR"/>
+          <w14:ligatures w14:val="none"/>
+        </w:rPr>
+      </w:pPr>
+      <w:r>
+        <w:rPr>
+          <w:rFonts w:ascii="Arial" w:eastAsia="Times New Roman" w:hAnsi="Arial" w:cs="Arial"/>
+          <w:i/>
+          <w:iCs/>
+          <w:color w:val="000000"/>
+          <w:kern w:val="0"/>
+          <w:sz w:val="28"/>
+          <w:szCs w:val="28"/>
+          <w:lang w:eastAsia="es-AR"/>
+          <w14:ligatures w14:val="none"/>
+        </w:rPr>
+        <w:t xml:space="preserve">       </w:t>
+      </w:r>
+      <w:r>
+        <w:rPr>
+          <w:rFonts w:ascii="Arial" w:eastAsia="Times New Roman" w:hAnsi="Arial" w:cs="Arial"/>
+          <w:i/>
+          <w:iCs/>
+          <w:color w:val="000000"/>
+          <w:kern w:val="0"/>
+          <w:sz w:val="28"/>
+          <w:szCs w:val="28"/>
+          <w:lang w:eastAsia="es-AR"/>
+          <w14:ligatures w14:val="none"/>
+        </w:rPr>
+        <w:t>ANÁLISIS DE SISTEMAS DE INFORMACIÓN</w:t>
+      </w:r>
+    </w:p>
+    <w:p>
+      <w:pPr>
+        <w:spacing w:after="0" w:line="240" w:lineRule="auto"/>
+        <w:rPr>
+          <w:rFonts w:ascii="Times New Roman" w:eastAsia="Times New Roman" w:hAnsi="Times New Roman" w:cs="Times New Roman"/>
+          <w:kern w:val="0"/>
+          <w:sz w:val="24"/>
+          <w:szCs w:val="24"/>
+          <w:lang w:eastAsia="es-AR"/>
+          <w14:ligatures w14:val="none"/>
+        </w:rPr>
+      </w:pPr>
+    </w:p>
+    <w:p>
+      <w:pPr>
+        <w:spacing w:after="0" w:line="240" w:lineRule="auto"/>
+        <w:rPr>
+          <w:rFonts w:ascii="Times New Roman" w:eastAsia="Times New Roman" w:hAnsi="Times New Roman" w:cs="Times New Roman"/>
+          <w:kern w:val="0"/>
+          <w:sz w:val="24"/>
+          <w:szCs w:val="24"/>
+          <w:lang w:eastAsia="es-AR"/>
+          <w14:ligatures w14:val="none"/>
+        </w:rPr>
+      </w:pPr>
+      <w:r>
+        <w:rPr>
+          <w:rFonts w:ascii="Arial" w:eastAsia="Times New Roman" w:hAnsi="Arial" w:cs="Arial"/>
+          <w:b/>
+          <w:bCs/>
+          <w:color w:val="000000"/>
+          <w:kern w:val="0"/>
+          <w:sz w:val="24"/>
+          <w:szCs w:val="24"/>
+          <w:lang w:eastAsia="es-AR"/>
+          <w14:ligatures w14:val="none"/>
+        </w:rPr>
+        <w:t xml:space="preserve">                    </w:t>
+      </w:r>
+      <w:r>
+        <w:rPr>
+          <w:rFonts w:ascii="Arial" w:eastAsia="Times New Roman" w:hAnsi="Arial" w:cs="Arial"/>
+          <w:b/>
+          <w:bCs/>
+          <w:color w:val="000000"/>
+          <w:kern w:val="0"/>
+          <w:sz w:val="24"/>
+          <w:szCs w:val="24"/>
+          <w:lang w:eastAsia="es-AR"/>
+          <w14:ligatures w14:val="none"/>
+        </w:rPr>
+        <w:t>TRABAJO PRÁCTICO INTEGRADOR</w:t>
+      </w:r>
+    </w:p>
+    <w:p>
+      <w:pPr>
+        <w:spacing w:after="0" w:line="240" w:lineRule="auto"/>
+        <w:rPr>
+          <w:rFonts w:ascii="Times New Roman" w:eastAsia="Times New Roman" w:hAnsi="Times New Roman" w:cs="Times New Roman"/>
+          <w:kern w:val="0"/>
+          <w:sz w:val="24"/>
+          <w:szCs w:val="24"/>
+          <w:lang w:eastAsia="es-AR"/>
+          <w14:ligatures w14:val="none"/>
+        </w:rPr>
+      </w:pPr>
+    </w:p>
+    <w:p>
+      <w:pPr>
+        <w:spacing w:after="0" w:line="240" w:lineRule="auto"/>
+        <w:rPr>
+          <w:rFonts w:ascii="Times New Roman" w:eastAsia="Times New Roman" w:hAnsi="Times New Roman" w:cs="Times New Roman"/>
+          <w:kern w:val="0"/>
+          <w:sz w:val="24"/>
+          <w:szCs w:val="24"/>
+          <w:lang w:eastAsia="es-AR"/>
+          <w14:ligatures w14:val="none"/>
+        </w:rPr>
+      </w:pPr>
+      <w:r>
+        <w:rPr>
+          <w:rFonts w:ascii="Arial" w:eastAsia="Times New Roman" w:hAnsi="Arial" w:cs="Arial"/>
+          <w:b/>
+          <w:bCs/>
+          <w:color w:val="000000"/>
+          <w:kern w:val="0"/>
+          <w:sz w:val="24"/>
+          <w:szCs w:val="24"/>
+          <w:lang w:eastAsia="es-AR"/>
+          <w14:ligatures w14:val="none"/>
+        </w:rPr>
+        <w:t xml:space="preserve">                                         </w:t>
+      </w:r>
+      <w:r>
+        <w:rPr>
+          <w:rFonts w:ascii="Arial" w:eastAsia="Times New Roman" w:hAnsi="Arial" w:cs="Arial"/>
+          <w:b/>
+          <w:bCs/>
+          <w:color w:val="000000"/>
+          <w:kern w:val="0"/>
+          <w:sz w:val="24"/>
+          <w:szCs w:val="24"/>
+          <w:lang w:eastAsia="es-AR"/>
+          <w14:ligatures w14:val="none"/>
+        </w:rPr>
+        <w:t>ENTRE</w:t>
+      </w:r>
+      <w:r>
+        <w:rPr>
+          <w:rFonts w:ascii="Arial" w:eastAsia="Times New Roman" w:hAnsi="Arial" w:cs="Arial"/>
+          <w:b/>
+          <w:bCs/>
+          <w:color w:val="000000"/>
+          <w:kern w:val="0"/>
+          <w:sz w:val="24"/>
+          <w:szCs w:val="24"/>
+          <w:lang w:eastAsia="es-AR"/>
+          <w14:ligatures w14:val="none"/>
+        </w:rPr>
+        <w:t>GA Nº1</w:t>
+      </w:r>
+    </w:p>
+    <w:p>
+      <w:pPr>
+        <w:spacing w:after="0" w:line="240" w:lineRule="auto"/>
+        <w:rPr>
+          <w:rFonts w:ascii="Times New Roman" w:eastAsia="Times New Roman" w:hAnsi="Times New Roman" w:cs="Times New Roman"/>
+          <w:kern w:val="0"/>
+          <w:sz w:val="24"/>
+          <w:szCs w:val="24"/>
+          <w:lang w:eastAsia="es-AR"/>
+          <w14:ligatures w14:val="none"/>
+        </w:rPr>
+      </w:pPr>
+    </w:p>
+    <w:p>
+      <w:pPr>
+        <w:spacing w:after="0" w:line="240" w:lineRule="auto"/>
+        <w:rPr>
+          <w:rFonts w:ascii="Times New Roman" w:eastAsia="Times New Roman" w:hAnsi="Times New Roman" w:cs="Times New Roman"/>
+          <w:kern w:val="0"/>
+          <w:sz w:val="24"/>
+          <w:szCs w:val="24"/>
+          <w:lang w:eastAsia="es-AR"/>
+          <w14:ligatures w14:val="none"/>
+        </w:rPr>
+      </w:pPr>
+    </w:p>
+    <w:p>
+      <w:pPr>
+        <w:spacing w:after="0" w:line="240" w:lineRule="auto"/>
+        <w:rPr>
+          <w:rFonts w:ascii="Times New Roman" w:eastAsia="Times New Roman" w:hAnsi="Times New Roman" w:cs="Times New Roman"/>
+          <w:kern w:val="0"/>
+          <w:sz w:val="24"/>
+          <w:szCs w:val="24"/>
+          <w:lang w:eastAsia="es-AR"/>
+          <w14:ligatures w14:val="none"/>
+        </w:rPr>
+      </w:pPr>
+    </w:p>
+    <w:p>
+      <w:pPr>
+        <w:spacing w:after="0" w:line="240" w:lineRule="auto"/>
+        <w:rPr>
+          <w:rFonts w:ascii="Times New Roman" w:eastAsia="Times New Roman" w:hAnsi="Times New Roman" w:cs="Times New Roman"/>
+          <w:kern w:val="0"/>
+          <w:sz w:val="24"/>
+          <w:szCs w:val="24"/>
+          <w:lang w:eastAsia="es-AR"/>
+          <w14:ligatures w14:val="none"/>
+        </w:rPr>
+      </w:pPr>
+      <w:r>
+        <w:rPr>
+          <w:rFonts w:ascii="Arial" w:eastAsia="Times New Roman" w:hAnsi="Arial" w:cs="Arial"/>
+          <w:color w:val="000000"/>
+          <w:kern w:val="0"/>
+          <w:sz w:val="20"/>
+          <w:szCs w:val="20"/>
+          <w:u w:val="single"/>
+          <w:lang w:eastAsia="es-AR"/>
+          <w14:ligatures w14:val="none"/>
+        </w:rPr>
+        <w:t>DOCENTES:</w:t>
+      </w:r>
+    </w:p>
+    <w:p>
+      <w:pPr>
+        <w:spacing w:after="0" w:line="240" w:lineRule="auto"/>
+        <w:rPr>
+          <w:rFonts w:ascii="Arial" w:eastAsia="Times New Roman" w:hAnsi="Arial" w:cs="Arial"/>
+          <w:kern w:val="0"/>
+          <w:sz w:val="20"/>
+          <w:szCs w:val="20"/>
+          <w:lang w:eastAsia="es-AR"/>
+          <w14:ligatures w14:val="none"/>
+        </w:rPr>
+      </w:pPr>
+      <w:r>
+        <w:rPr>
+          <w:rFonts w:ascii="Arial" w:eastAsia="Times New Roman" w:hAnsi="Arial" w:cs="Arial"/>
+          <w:kern w:val="0"/>
+          <w:sz w:val="20"/>
+          <w:szCs w:val="20"/>
+          <w:lang w:eastAsia="es-AR"/>
+          <w14:ligatures w14:val="none"/>
+        </w:rPr>
+        <w:t>Esp. Ing. Valeria Ortiz Quiroz</w:t>
+      </w:r>
+    </w:p>
+    <w:p>
+      <w:pPr>
+        <w:spacing w:after="0" w:line="240" w:lineRule="auto"/>
+        <w:rPr>
+          <w:rFonts w:ascii="Arial" w:eastAsia="Times New Roman" w:hAnsi="Arial" w:cs="Arial"/>
+          <w:kern w:val="0"/>
+          <w:sz w:val="20"/>
+          <w:szCs w:val="20"/>
+          <w:lang w:eastAsia="es-AR"/>
+          <w14:ligatures w14:val="none"/>
+        </w:rPr>
+      </w:pPr>
+      <w:r>
+        <w:rPr>
+          <w:rFonts w:ascii="Arial" w:eastAsia="Times New Roman" w:hAnsi="Arial" w:cs="Arial"/>
+          <w:kern w:val="0"/>
+          <w:sz w:val="20"/>
+          <w:szCs w:val="20"/>
+          <w:lang w:eastAsia="es-AR"/>
+          <w14:ligatures w14:val="none"/>
+        </w:rPr>
+        <w:t>Ing. Paola Mariana Simieli</w:t>
+      </w:r>
+    </w:p>
+    <w:p>
+      <w:pPr>
+        <w:spacing w:after="0" w:line="240" w:lineRule="auto"/>
+        <w:rPr>
+          <w:rFonts w:ascii="Arial" w:eastAsia="Times New Roman" w:hAnsi="Arial" w:cs="Arial"/>
+          <w:kern w:val="0"/>
+          <w:sz w:val="20"/>
+          <w:szCs w:val="20"/>
+          <w:lang w:eastAsia="es-AR"/>
+          <w14:ligatures w14:val="none"/>
+        </w:rPr>
+      </w:pPr>
+      <w:r>
+        <w:rPr>
+          <w:rFonts w:ascii="Arial" w:eastAsia="Times New Roman" w:hAnsi="Arial" w:cs="Arial"/>
+          <w:kern w:val="0"/>
+          <w:sz w:val="20"/>
+          <w:szCs w:val="20"/>
+          <w:lang w:eastAsia="es-AR"/>
+          <w14:ligatures w14:val="none"/>
+        </w:rPr>
+        <w:t>Ing. Laura Achetta</w:t>
+      </w:r>
+    </w:p>
+    <w:p>
+      <w:pPr>
+        <w:spacing w:after="0" w:line="240" w:lineRule="auto"/>
+        <w:rPr>
+          <w:rFonts w:ascii="Times New Roman" w:eastAsia="Times New Roman" w:hAnsi="Times New Roman" w:cs="Times New Roman"/>
+          <w:kern w:val="0"/>
+          <w:sz w:val="24"/>
+          <w:szCs w:val="24"/>
+          <w:lang w:eastAsia="es-AR"/>
+          <w14:ligatures w14:val="none"/>
+        </w:rPr>
+      </w:pPr>
+    </w:p>
+    <w:p>
+      <w:pPr>
+        <w:spacing w:after="0" w:line="240" w:lineRule="auto"/>
+        <w:rPr>
+          <w:rFonts w:ascii="Times New Roman" w:eastAsia="Times New Roman" w:hAnsi="Times New Roman" w:cs="Times New Roman"/>
+          <w:kern w:val="0"/>
+          <w:sz w:val="24"/>
+          <w:szCs w:val="24"/>
+          <w:lang w:eastAsia="es-AR"/>
+          <w14:ligatures w14:val="none"/>
+        </w:rPr>
+      </w:pPr>
+      <w:r>
+        <w:rPr>
+          <w:rFonts w:ascii="Arial" w:eastAsia="Times New Roman" w:hAnsi="Arial" w:cs="Arial"/>
+          <w:color w:val="000000"/>
+          <w:kern w:val="0"/>
+          <w:sz w:val="20"/>
+          <w:szCs w:val="20"/>
+          <w:u w:val="single"/>
+          <w:lang w:eastAsia="es-AR"/>
+          <w14:ligatures w14:val="none"/>
+        </w:rPr>
+        <w:t>GRUPO:</w:t>
+      </w:r>
+      <w:r>
+        <w:rPr>
+          <w:rFonts w:ascii="Arial" w:eastAsia="Times New Roman" w:hAnsi="Arial" w:cs="Arial"/>
+          <w:color w:val="000000"/>
+          <w:kern w:val="0"/>
+          <w:sz w:val="20"/>
+          <w:szCs w:val="20"/>
+          <w:lang w:eastAsia="es-AR"/>
+          <w14:ligatures w14:val="none"/>
+        </w:rPr>
+        <w:t xml:space="preserve"> </w:t>
+      </w:r>
+      <w:r>
+        <w:rPr>
+          <w:rFonts w:ascii="Arial" w:eastAsia="Times New Roman" w:hAnsi="Arial" w:cs="Arial"/>
+          <w:color w:val="000000"/>
+          <w:kern w:val="0"/>
+          <w:sz w:val="20"/>
+          <w:szCs w:val="20"/>
+          <w:highlight w:val="yellow"/>
+          <w:lang w:eastAsia="es-AR"/>
+          <w14:ligatures w14:val="none"/>
+        </w:rPr>
+        <w:t>AGREGAR NOMBRE</w:t>
+      </w:r>
+    </w:p>
+    <w:p>
+      <w:pPr>
+        <w:spacing w:after="0" w:line="240" w:lineRule="auto"/>
+        <w:rPr>
+          <w:rFonts w:ascii="Times New Roman" w:eastAsia="Times New Roman" w:hAnsi="Times New Roman" w:cs="Times New Roman"/>
+          <w:kern w:val="0"/>
+          <w:sz w:val="24"/>
+          <w:szCs w:val="24"/>
+          <w:lang w:eastAsia="es-AR"/>
+          <w14:ligatures w14:val="none"/>
+        </w:rPr>
+      </w:pPr>
+    </w:p>
+    <w:p>
+      <w:pPr>
+        <w:spacing w:after="0" w:line="240" w:lineRule="auto"/>
+        <w:rPr>
+          <w:rFonts w:ascii="Times New Roman" w:eastAsia="Times New Roman" w:hAnsi="Times New Roman" w:cs="Times New Roman"/>
+          <w:kern w:val="0"/>
+          <w:sz w:val="24"/>
+          <w:szCs w:val="24"/>
+          <w:lang w:eastAsia="es-AR"/>
+          <w14:ligatures w14:val="none"/>
+        </w:rPr>
+      </w:pPr>
+      <w:r>
+        <w:rPr>
+          <w:rFonts w:ascii="Arial" w:eastAsia="Times New Roman" w:hAnsi="Arial" w:cs="Arial"/>
+          <w:color w:val="000000"/>
+          <w:kern w:val="0"/>
+          <w:sz w:val="20"/>
+          <w:szCs w:val="20"/>
+          <w:u w:val="single"/>
+          <w:lang w:eastAsia="es-AR"/>
+          <w14:ligatures w14:val="none"/>
+        </w:rPr>
+        <w:t>ALUMNOS:</w:t>
+      </w:r>
+    </w:p>
+    <w:p>
+      <w:pPr>
+        <w:rPr>
+          <w:rFonts w:ascii="Arial" w:eastAsia="Times New Roman" w:hAnsi="Arial" w:cs="Arial"/>
+          <w:color w:val="000000"/>
+          <w:kern w:val="0"/>
+          <w:sz w:val="20"/>
+          <w:szCs w:val="20"/>
+          <w:lang w:eastAsia="es-AR"/>
+          <w14:ligatures w14:val="none"/>
+        </w:rPr>
+      </w:pPr>
+      <w:r>
+        <w:rPr>
+          <w:rFonts w:ascii="Arial" w:eastAsia="Times New Roman" w:hAnsi="Arial" w:cs="Arial"/>
+          <w:color w:val="000000"/>
+          <w:kern w:val="0"/>
+          <w:sz w:val="20"/>
+          <w:szCs w:val="20"/>
+          <w:lang w:eastAsia="es-AR"/>
+          <w14:ligatures w14:val="none"/>
+        </w:rPr>
+        <w:t>Aguirre Costa</w:t>
+      </w:r>
+      <w:r>
+        <w:rPr>
+          <w:rFonts w:ascii="Arial" w:eastAsia="Times New Roman" w:hAnsi="Arial" w:cs="Arial"/>
+          <w:color w:val="000000"/>
+          <w:kern w:val="0"/>
+          <w:sz w:val="20"/>
+          <w:szCs w:val="20"/>
+          <w:lang w:eastAsia="es-AR"/>
+          <w14:ligatures w14:val="none"/>
+        </w:rPr>
+        <w:t xml:space="preserve">, </w:t>
+      </w:r>
+      <w:r>
+        <w:rPr>
+          <w:rFonts w:ascii="Arial" w:eastAsia="Times New Roman" w:hAnsi="Arial" w:cs="Arial"/>
+          <w:color w:val="000000"/>
+          <w:kern w:val="0"/>
+          <w:sz w:val="20"/>
+          <w:szCs w:val="20"/>
+          <w:lang w:eastAsia="es-AR"/>
+          <w14:ligatures w14:val="none"/>
+        </w:rPr>
+        <w:t>Geremias</w:t>
+      </w:r>
+      <w:r>
+        <w:rPr>
+          <w:rFonts w:ascii="Arial" w:eastAsia="Times New Roman" w:hAnsi="Arial" w:cs="Arial"/>
+          <w:color w:val="000000"/>
+          <w:kern w:val="0"/>
+          <w:sz w:val="20"/>
+          <w:szCs w:val="20"/>
+          <w:lang w:eastAsia="es-AR"/>
+          <w14:ligatures w14:val="none"/>
+        </w:rPr>
+        <w:t>.</w:t>
+      </w:r>
+      <w:r>
+        <w:rPr>
+          <w:rFonts w:ascii="Arial" w:eastAsia="Times New Roman" w:hAnsi="Arial" w:cs="Arial"/>
+          <w:color w:val="000000"/>
+          <w:kern w:val="0"/>
+          <w:sz w:val="20"/>
+          <w:szCs w:val="20"/>
+          <w:lang w:eastAsia="es-AR"/>
+          <w14:ligatures w14:val="none"/>
+        </w:rPr>
+        <w:t xml:space="preserve"> </w:t>
+      </w:r>
+      <w:r>
+        <w:rPr>
+          <w:rFonts w:ascii="Arial" w:eastAsia="Times New Roman" w:hAnsi="Arial" w:cs="Arial"/>
+          <w:color w:val="000000"/>
+          <w:kern w:val="0"/>
+          <w:sz w:val="20"/>
+          <w:szCs w:val="20"/>
+          <w:lang w:eastAsia="es-AR"/>
+          <w14:ligatures w14:val="none"/>
+        </w:rPr>
+        <w:br/>
+      </w:r>
+      <w:proofErr w:type="spellStart"/>
+      <w:r>
+        <w:rPr>
+          <w:rFonts w:ascii="Arial" w:eastAsia="Times New Roman" w:hAnsi="Arial" w:cs="Arial"/>
+          <w:color w:val="000000"/>
+          <w:kern w:val="0"/>
+          <w:sz w:val="20"/>
+          <w:szCs w:val="20"/>
+          <w:lang w:eastAsia="es-AR"/>
+          <w14:ligatures w14:val="none"/>
+        </w:rPr>
+        <w:t>Bertorello</w:t>
+      </w:r>
+      <w:proofErr w:type="spellEnd"/>
+      <w:r>
+        <w:rPr>
+          <w:rFonts w:ascii="Arial" w:eastAsia="Times New Roman" w:hAnsi="Arial" w:cs="Arial"/>
+          <w:color w:val="000000"/>
+          <w:kern w:val="0"/>
+          <w:sz w:val="20"/>
+          <w:szCs w:val="20"/>
+          <w:lang w:eastAsia="es-AR"/>
+          <w14:ligatures w14:val="none"/>
+        </w:rPr>
+        <w:t xml:space="preserve">, </w:t>
+      </w:r>
+      <w:r>
+        <w:rPr>
+          <w:rFonts w:ascii="Arial" w:eastAsia="Times New Roman" w:hAnsi="Arial" w:cs="Arial"/>
+          <w:color w:val="000000"/>
+          <w:kern w:val="0"/>
+          <w:sz w:val="20"/>
+          <w:szCs w:val="20"/>
+          <w:lang w:eastAsia="es-AR"/>
+          <w14:ligatures w14:val="none"/>
+        </w:rPr>
+        <w:t>Juan Manuel</w:t>
+      </w:r>
+      <w:r>
+        <w:rPr>
+          <w:rFonts w:ascii="Arial" w:eastAsia="Times New Roman" w:hAnsi="Arial" w:cs="Arial"/>
+          <w:color w:val="000000"/>
+          <w:kern w:val="0"/>
+          <w:sz w:val="20"/>
+          <w:szCs w:val="20"/>
+          <w:lang w:eastAsia="es-AR"/>
+          <w14:ligatures w14:val="none"/>
+        </w:rPr>
+        <w:t>.</w:t>
+      </w:r>
+      <w:r>
+        <w:rPr>
+          <w:rFonts w:ascii="Arial" w:eastAsia="Times New Roman" w:hAnsi="Arial" w:cs="Arial"/>
+          <w:color w:val="000000"/>
+          <w:kern w:val="0"/>
+          <w:sz w:val="20"/>
+          <w:szCs w:val="20"/>
+          <w:lang w:eastAsia="es-AR"/>
+          <w14:ligatures w14:val="none"/>
+        </w:rPr>
+        <w:br/>
+        <w:t>Buffa</w:t>
+      </w:r>
+      <w:r>
+        <w:rPr>
+          <w:rFonts w:ascii="Arial" w:eastAsia="Times New Roman" w:hAnsi="Arial" w:cs="Arial"/>
+          <w:color w:val="000000"/>
+          <w:kern w:val="0"/>
+          <w:sz w:val="20"/>
+          <w:szCs w:val="20"/>
+          <w:lang w:eastAsia="es-AR"/>
+          <w14:ligatures w14:val="none"/>
+        </w:rPr>
+        <w:t xml:space="preserve">, </w:t>
+      </w:r>
+      <w:r>
+        <w:rPr>
+          <w:rFonts w:ascii="Arial" w:eastAsia="Times New Roman" w:hAnsi="Arial" w:cs="Arial"/>
+          <w:color w:val="000000"/>
+          <w:kern w:val="0"/>
+          <w:sz w:val="20"/>
+          <w:szCs w:val="20"/>
+          <w:lang w:eastAsia="es-AR"/>
+          <w14:ligatures w14:val="none"/>
+        </w:rPr>
+        <w:t>Matías Nicolás</w:t>
+      </w:r>
+      <w:r>
+        <w:rPr>
+          <w:rFonts w:ascii="Arial" w:eastAsia="Times New Roman" w:hAnsi="Arial" w:cs="Arial"/>
+          <w:color w:val="000000"/>
+          <w:kern w:val="0"/>
+          <w:sz w:val="20"/>
+          <w:szCs w:val="20"/>
+          <w:lang w:eastAsia="es-AR"/>
+          <w14:ligatures w14:val="none"/>
+        </w:rPr>
+        <w:t>.</w:t>
+      </w:r>
+      <w:r>
+        <w:rPr>
+          <w:rFonts w:ascii="Arial" w:eastAsia="Times New Roman" w:hAnsi="Arial" w:cs="Arial"/>
+          <w:color w:val="000000"/>
+          <w:kern w:val="0"/>
+          <w:sz w:val="20"/>
+          <w:szCs w:val="20"/>
+          <w:lang w:eastAsia="es-AR"/>
+          <w14:ligatures w14:val="none"/>
+        </w:rPr>
+        <w:br/>
+        <w:t>Canevari</w:t>
+      </w:r>
+      <w:r>
+        <w:rPr>
+          <w:rFonts w:ascii="Arial" w:eastAsia="Times New Roman" w:hAnsi="Arial" w:cs="Arial"/>
+          <w:color w:val="000000"/>
+          <w:kern w:val="0"/>
+          <w:sz w:val="20"/>
+          <w:szCs w:val="20"/>
+          <w:lang w:eastAsia="es-AR"/>
+          <w14:ligatures w14:val="none"/>
+        </w:rPr>
+        <w:t xml:space="preserve">, </w:t>
+      </w:r>
+      <w:r>
+        <w:rPr>
+          <w:rFonts w:ascii="Arial" w:eastAsia="Times New Roman" w:hAnsi="Arial" w:cs="Arial"/>
+          <w:color w:val="000000"/>
+          <w:kern w:val="0"/>
+          <w:sz w:val="20"/>
+          <w:szCs w:val="20"/>
+          <w:lang w:eastAsia="es-AR"/>
+          <w14:ligatures w14:val="none"/>
+        </w:rPr>
+        <w:t>Juan Manuel</w:t>
+      </w:r>
+      <w:r>
+        <w:rPr>
+          <w:rFonts w:ascii="Arial" w:eastAsia="Times New Roman" w:hAnsi="Arial" w:cs="Arial"/>
+          <w:color w:val="000000"/>
+          <w:kern w:val="0"/>
+          <w:sz w:val="20"/>
+          <w:szCs w:val="20"/>
+          <w:lang w:eastAsia="es-AR"/>
+          <w14:ligatures w14:val="none"/>
+        </w:rPr>
+        <w:t>.</w:t>
+      </w:r>
+      <w:r>
+        <w:rPr>
+          <w:rFonts w:ascii="Arial" w:eastAsia="Times New Roman" w:hAnsi="Arial" w:cs="Arial"/>
+          <w:color w:val="000000"/>
+          <w:kern w:val="0"/>
+          <w:sz w:val="20"/>
+          <w:szCs w:val="20"/>
+          <w:lang w:eastAsia="es-AR"/>
+          <w14:ligatures w14:val="none"/>
+        </w:rPr>
+        <w:t xml:space="preserve"> </w:t>
+      </w:r>
+      <w:r>
+        <w:rPr>
+          <w:rFonts w:ascii="Arial" w:eastAsia="Times New Roman" w:hAnsi="Arial" w:cs="Arial"/>
+          <w:color w:val="000000"/>
+          <w:kern w:val="0"/>
+          <w:sz w:val="20"/>
+          <w:szCs w:val="20"/>
+          <w:lang w:eastAsia="es-AR"/>
+          <w14:ligatures w14:val="none"/>
+        </w:rPr>
+        <w:br/>
+      </w:r>
+      <w:proofErr w:type="spellStart"/>
+      <w:r>
+        <w:rPr>
+          <w:rFonts w:ascii="Arial" w:eastAsia="Times New Roman" w:hAnsi="Arial" w:cs="Arial"/>
+          <w:color w:val="000000"/>
+          <w:kern w:val="0"/>
+          <w:sz w:val="20"/>
+          <w:szCs w:val="20"/>
+          <w:lang w:eastAsia="es-AR"/>
+          <w14:ligatures w14:val="none"/>
+        </w:rPr>
+        <w:t>Issoglio</w:t>
+      </w:r>
+      <w:proofErr w:type="spellEnd"/>
+      <w:r>
+        <w:rPr>
+          <w:rFonts w:ascii="Arial" w:eastAsia="Times New Roman" w:hAnsi="Arial" w:cs="Arial"/>
+          <w:color w:val="000000"/>
+          <w:kern w:val="0"/>
+          <w:sz w:val="20"/>
+          <w:szCs w:val="20"/>
+          <w:lang w:eastAsia="es-AR"/>
+          <w14:ligatures w14:val="none"/>
+        </w:rPr>
+        <w:t xml:space="preserve">, </w:t>
+      </w:r>
+      <w:proofErr w:type="gramStart"/>
+      <w:r>
+        <w:rPr>
+          <w:rFonts w:ascii="Arial" w:eastAsia="Times New Roman" w:hAnsi="Arial" w:cs="Arial"/>
+          <w:color w:val="000000"/>
+          <w:kern w:val="0"/>
+          <w:sz w:val="20"/>
+          <w:szCs w:val="20"/>
+          <w:lang w:eastAsia="es-AR"/>
+          <w14:ligatures w14:val="none"/>
+        </w:rPr>
+        <w:t>Abril</w:t>
+      </w:r>
+      <w:proofErr w:type="gramEnd"/>
+      <w:r>
+        <w:rPr>
+          <w:rFonts w:ascii="Arial" w:eastAsia="Times New Roman" w:hAnsi="Arial" w:cs="Arial"/>
+          <w:color w:val="000000"/>
+          <w:kern w:val="0"/>
+          <w:sz w:val="20"/>
+          <w:szCs w:val="20"/>
+          <w:lang w:eastAsia="es-AR"/>
+          <w14:ligatures w14:val="none"/>
+        </w:rPr>
+        <w:t>.</w:t>
+      </w:r>
+      <w:r>
+        <w:rPr>
+          <w:rFonts w:ascii="Arial" w:eastAsia="Times New Roman" w:hAnsi="Arial" w:cs="Arial"/>
+          <w:color w:val="000000"/>
+          <w:kern w:val="0"/>
+          <w:sz w:val="20"/>
+          <w:szCs w:val="20"/>
+          <w:lang w:eastAsia="es-AR"/>
+          <w14:ligatures w14:val="none"/>
+        </w:rPr>
+        <w:br/>
+        <w:t>Mihaljevich</w:t>
+      </w:r>
+      <w:r>
+        <w:rPr>
+          <w:rFonts w:ascii="Arial" w:eastAsia="Times New Roman" w:hAnsi="Arial" w:cs="Arial"/>
+          <w:color w:val="000000"/>
+          <w:kern w:val="0"/>
+          <w:sz w:val="20"/>
+          <w:szCs w:val="20"/>
+          <w:lang w:eastAsia="es-AR"/>
+          <w14:ligatures w14:val="none"/>
+        </w:rPr>
+        <w:t xml:space="preserve">, </w:t>
+      </w:r>
+      <w:r>
+        <w:rPr>
+          <w:rFonts w:ascii="Arial" w:eastAsia="Times New Roman" w:hAnsi="Arial" w:cs="Arial"/>
+          <w:color w:val="000000"/>
+          <w:kern w:val="0"/>
+          <w:sz w:val="20"/>
+          <w:szCs w:val="20"/>
+          <w:lang w:eastAsia="es-AR"/>
+          <w14:ligatures w14:val="none"/>
+        </w:rPr>
+        <w:t>Deian</w:t>
+      </w:r>
+      <w:r>
+        <w:rPr>
+          <w:rFonts w:ascii="Arial" w:eastAsia="Times New Roman" w:hAnsi="Arial" w:cs="Arial"/>
+          <w:color w:val="000000"/>
+          <w:kern w:val="0"/>
+          <w:sz w:val="20"/>
+          <w:szCs w:val="20"/>
+          <w:lang w:eastAsia="es-AR"/>
+          <w14:ligatures w14:val="none"/>
+        </w:rPr>
+        <w:t>.</w:t>
+      </w:r>
+      <w:r>
+        <w:rPr>
+          <w:rFonts w:ascii="Arial" w:eastAsia="Times New Roman" w:hAnsi="Arial" w:cs="Arial"/>
+          <w:color w:val="000000"/>
+          <w:kern w:val="0"/>
+          <w:sz w:val="20"/>
+          <w:szCs w:val="20"/>
+          <w:lang w:eastAsia="es-AR"/>
+          <w14:ligatures w14:val="none"/>
+        </w:rPr>
+        <w:t xml:space="preserve"> </w:t>
+      </w:r>
+      <w:r>
+        <w:rPr>
+          <w:rFonts w:ascii="Arial" w:eastAsia="Times New Roman" w:hAnsi="Arial" w:cs="Arial"/>
+          <w:color w:val="000000"/>
+          <w:kern w:val="0"/>
+          <w:sz w:val="20"/>
+          <w:szCs w:val="20"/>
+          <w:lang w:eastAsia="es-AR"/>
+          <w14:ligatures w14:val="none"/>
+        </w:rPr>
+        <w:br/>
+        <w:t>Milani</w:t>
+      </w:r>
+      <w:r>
+        <w:rPr>
+          <w:rFonts w:ascii="Arial" w:eastAsia="Times New Roman" w:hAnsi="Arial" w:cs="Arial"/>
+          <w:color w:val="000000"/>
+          <w:kern w:val="0"/>
+          <w:sz w:val="20"/>
+          <w:szCs w:val="20"/>
+          <w:lang w:eastAsia="es-AR"/>
+          <w14:ligatures w14:val="none"/>
+        </w:rPr>
+        <w:t xml:space="preserve">, </w:t>
+      </w:r>
+      <w:r>
+        <w:rPr>
+          <w:rFonts w:ascii="Arial" w:eastAsia="Times New Roman" w:hAnsi="Arial" w:cs="Arial"/>
+          <w:color w:val="000000"/>
+          <w:kern w:val="0"/>
+          <w:sz w:val="20"/>
+          <w:szCs w:val="20"/>
+          <w:lang w:eastAsia="es-AR"/>
+          <w14:ligatures w14:val="none"/>
+        </w:rPr>
+        <w:t>Nicolás Tomás</w:t>
+      </w:r>
+      <w:r>
+        <w:rPr>
+          <w:rFonts w:ascii="Arial" w:eastAsia="Times New Roman" w:hAnsi="Arial" w:cs="Arial"/>
+          <w:color w:val="000000"/>
+          <w:kern w:val="0"/>
+          <w:sz w:val="20"/>
+          <w:szCs w:val="20"/>
+          <w:lang w:eastAsia="es-AR"/>
+          <w14:ligatures w14:val="none"/>
+        </w:rPr>
+        <w:t>.</w:t>
+      </w:r>
+      <w:r>
+        <w:rPr>
+          <w:rFonts w:ascii="Arial" w:eastAsia="Times New Roman" w:hAnsi="Arial" w:cs="Arial"/>
+          <w:color w:val="000000"/>
+          <w:kern w:val="0"/>
+          <w:sz w:val="20"/>
+          <w:szCs w:val="20"/>
+          <w:lang w:eastAsia="es-AR"/>
+          <w14:ligatures w14:val="none"/>
+        </w:rPr>
+        <w:br/>
+        <w:t>Rubio Santichia</w:t>
+      </w:r>
+      <w:r>
+        <w:rPr>
+          <w:rFonts w:ascii="Arial" w:eastAsia="Times New Roman" w:hAnsi="Arial" w:cs="Arial"/>
+          <w:color w:val="000000"/>
+          <w:kern w:val="0"/>
+          <w:sz w:val="20"/>
+          <w:szCs w:val="20"/>
+          <w:lang w:eastAsia="es-AR"/>
+          <w14:ligatures w14:val="none"/>
+        </w:rPr>
+        <w:t xml:space="preserve">, </w:t>
+      </w:r>
+      <w:r>
+        <w:rPr>
+          <w:rFonts w:ascii="Arial" w:eastAsia="Times New Roman" w:hAnsi="Arial" w:cs="Arial"/>
+          <w:color w:val="000000"/>
+          <w:kern w:val="0"/>
+          <w:sz w:val="20"/>
+          <w:szCs w:val="20"/>
+          <w:lang w:eastAsia="es-AR"/>
+          <w14:ligatures w14:val="none"/>
+        </w:rPr>
+        <w:t>Victoria</w:t>
+      </w:r>
+      <w:r>
+        <w:rPr>
+          <w:rFonts w:ascii="Arial" w:eastAsia="Times New Roman" w:hAnsi="Arial" w:cs="Arial"/>
+          <w:color w:val="000000"/>
+          <w:kern w:val="0"/>
+          <w:sz w:val="20"/>
+          <w:szCs w:val="20"/>
+          <w:lang w:eastAsia="es-AR"/>
+          <w14:ligatures w14:val="none"/>
+        </w:rPr>
+        <w:t>.</w:t>
+      </w:r>
+      <w:r>
+        <w:rPr>
+          <w:rFonts w:ascii="Arial" w:eastAsia="Times New Roman" w:hAnsi="Arial" w:cs="Arial"/>
+          <w:color w:val="000000"/>
+          <w:kern w:val="0"/>
+          <w:sz w:val="20"/>
+          <w:szCs w:val="20"/>
+          <w:lang w:eastAsia="es-AR"/>
+          <w14:ligatures w14:val="none"/>
+        </w:rPr>
+        <w:t xml:space="preserve"> </w:t>
+      </w:r>
+    </w:p>
+    <w:p>
+      <w:pPr>
+        <w:rPr>
+          <w:rFonts w:ascii="Arial" w:eastAsia="Times New Roman" w:hAnsi="Arial" w:cs="Arial"/>
+          <w:color w:val="000000"/>
+          <w:kern w:val="0"/>
+          <w:sz w:val="20"/>
+          <w:szCs w:val="20"/>
+          <w:lang w:eastAsia="es-AR"/>
+          <w14:ligatures w14:val="none"/>
+        </w:rPr>
+      </w:pPr>
+    </w:p>
+    <w:p>
+      <w:pPr>
+        <w:rPr>
+          <w:rFonts w:ascii="Arial" w:eastAsia="Times New Roman" w:hAnsi="Arial" w:cs="Arial"/>
+          <w:color w:val="000000"/>
+          <w:kern w:val="0"/>
+          <w:sz w:val="20"/>
+          <w:szCs w:val="20"/>
+          <w:lang w:eastAsia="es-AR"/>
+          <w14:ligatures w14:val="none"/>
+        </w:rPr>
+      </w:pPr>
+    </w:p>
+    <w:p>
+      <w:pPr>
+        <w:rPr>
+          <w:rFonts w:ascii="Arial" w:eastAsia="Times New Roman" w:hAnsi="Arial" w:cs="Arial"/>
+          <w:color w:val="000000"/>
+          <w:kern w:val="0"/>
+          <w:sz w:val="20"/>
+          <w:szCs w:val="20"/>
+          <w:lang w:eastAsia="es-AR"/>
+          <w14:ligatures w14:val="none"/>
+        </w:rPr>
+      </w:pPr>
+    </w:p>
+    <w:p>
+      <w:pPr>
+        <w:rPr>
+          <w:rFonts w:ascii="Arial" w:eastAsia="Times New Roman" w:hAnsi="Arial" w:cs="Arial"/>
+          <w:color w:val="000000"/>
+          <w:kern w:val="0"/>
+          <w:sz w:val="20"/>
+          <w:szCs w:val="20"/>
+          <w:lang w:eastAsia="es-AR"/>
+          <w14:ligatures w14:val="none"/>
+        </w:rPr>
+      </w:pPr>
+    </w:p>
+    <w:p>
+      <w:pPr>
+        <w:rPr>
+          <w:rFonts w:ascii="Arial" w:eastAsia="Times New Roman" w:hAnsi="Arial" w:cs="Arial"/>
+          <w:color w:val="000000"/>
+          <w:kern w:val="0"/>
+          <w:sz w:val="20"/>
+          <w:szCs w:val="20"/>
+          <w:lang w:eastAsia="es-AR"/>
+          <w14:ligatures w14:val="none"/>
+        </w:rPr>
+      </w:pPr>
+    </w:p>
+    <w:p>
+      <w:pPr>
+        <w:rPr>
+          <w:rFonts w:ascii="Arial" w:eastAsia="Times New Roman" w:hAnsi="Arial" w:cs="Arial"/>
+          <w:color w:val="000000"/>
+          <w:kern w:val="0"/>
+          <w:sz w:val="20"/>
+          <w:szCs w:val="20"/>
+          <w:lang w:eastAsia="es-AR"/>
+          <w14:ligatures w14:val="none"/>
+        </w:rPr>
+      </w:pPr>
+    </w:p>
+    <w:p>
+      <w:pPr>
+        <w:rPr>
+          <w:rFonts w:ascii="Arial" w:eastAsia="Times New Roman" w:hAnsi="Arial" w:cs="Arial"/>
+          <w:color w:val="000000"/>
+          <w:kern w:val="0"/>
+          <w:sz w:val="20"/>
+          <w:szCs w:val="20"/>
+          <w:lang w:eastAsia="es-AR"/>
+          <w14:ligatures w14:val="none"/>
+        </w:rPr>
+      </w:pPr>
+    </w:p>
+    <w:p>
+      <w:pPr>
+        <w:rPr>
+          <w:rFonts w:ascii="Arial" w:eastAsia="Times New Roman" w:hAnsi="Arial" w:cs="Arial"/>
+          <w:color w:val="000000"/>
+          <w:kern w:val="0"/>
+          <w:sz w:val="20"/>
+          <w:szCs w:val="20"/>
+          <w:lang w:eastAsia="es-AR"/>
+          <w14:ligatures w14:val="none"/>
+        </w:rPr>
+      </w:pPr>
+    </w:p>
+    <w:p>
+      <w:pPr>
+        <w:rPr>
+          <w:rFonts w:ascii="Arial" w:eastAsia="Times New Roman" w:hAnsi="Arial" w:cs="Arial"/>
+          <w:color w:val="000000"/>
+          <w:kern w:val="0"/>
+          <w:sz w:val="20"/>
+          <w:szCs w:val="20"/>
+          <w:lang w:eastAsia="es-AR"/>
+          <w14:ligatures w14:val="none"/>
+        </w:rPr>
+      </w:pPr>
+    </w:p>
+    <w:p>
+      <w:pPr>
+        <w:rPr>
+          <w:rFonts w:ascii="Arial" w:eastAsia="Times New Roman" w:hAnsi="Arial" w:cs="Arial"/>
+          <w:color w:val="000000"/>
+          <w:kern w:val="0"/>
+          <w:sz w:val="20"/>
+          <w:szCs w:val="20"/>
+          <w:lang w:eastAsia="es-AR"/>
+          <w14:ligatures w14:val="none"/>
+        </w:rPr>
+      </w:pPr>
+    </w:p>
+    <w:p>
+      <w:pPr>
+        <w:jc w:val="center"/>
+        <w:rPr>
+          <w:color w:val="767171" w:themeColor="background2" w:themeShade="80"/>
+        </w:rPr>
+      </w:pPr>
+      <w:r>
+        <w:rPr>
+          <w:color w:val="767171" w:themeColor="background2" w:themeShade="80"/>
+        </w:rPr>
+        <w:t xml:space="preserve">Villa María, </w:t>
+      </w:r>
+      <w:r>
+        <w:rPr>
+          <w:color w:val="767171" w:themeColor="background2" w:themeShade="80"/>
+        </w:rPr>
+        <w:t>9</w:t>
+      </w:r>
+      <w:r>
+        <w:rPr>
+          <w:color w:val="767171" w:themeColor="background2" w:themeShade="80"/>
+        </w:rPr>
+        <w:t xml:space="preserve"> de </w:t>
+      </w:r>
+      <w:r>
+        <w:rPr>
+          <w:color w:val="767171" w:themeColor="background2" w:themeShade="80"/>
+        </w:rPr>
+        <w:t>junio</w:t>
+      </w:r>
+      <w:r>
+        <w:rPr>
+          <w:color w:val="767171" w:themeColor="background2" w:themeShade="80"/>
+        </w:rPr>
+        <w:t xml:space="preserve"> de 202</w:t>
+      </w:r>
+      <w:r>
+        <w:rPr>
+          <w:color w:val="767171" w:themeColor="background2" w:themeShade="80"/>
+        </w:rPr>
+        <w:t>6</w:t>
+      </w:r>
+    </w:p>
+    <w:p>
+      <w:pPr>
+        <w:rPr>
+          <w:lang w:val="es-ES"/>
+        </w:rPr>
+      </w:pPr>
+      <w:r>
+        <w:lastRenderedPageBreak/>
+        <w:t>1) Coloca un nombre a tu grupo, breve presentación y crea un logotipo.</w:t>
+      </w:r>
+      <w:r>
+        <w:br/>
+        <w:t>2) Redacta el enunciado del caso relevado explicando toda la problemática y necesidad para el sistema de información.</w:t>
+      </w:r>
+      <w:r>
+        <w:br/>
+        <w:t>3) Lista los requerimientos funcionales del S.I.</w:t>
+      </w:r>
+      <w:r>
+        <w:br/>
+        <w:t>4) Anexo: coloca imágenes de las páginas, links consultados para la </w:t>
+      </w:r>
+      <w:hyperlink r:id="rId6" w:tooltip="Elicitación" w:history="1">
+        <w:r>
+          <w:rPr>
+            <w:rStyle w:val="Hipervnculo"/>
+          </w:rPr>
+          <w:t>elicitación</w:t>
+        </w:r>
+      </w:hyperlink>
+      <w:r>
+        <w:t>, comenta qué relevaste en cada caso.</w:t>
+      </w:r>
     </w:p>
     <w:sectPr>
       <w:pgSz w:w="11906" w:h="16838"/>
@@ -635,7 +1958,6 @@
   <w:style w:type="character" w:default="1" w:styleId="Fuentedeprrafopredeter">
     <w:name w:val="Default Paragraph Font"/>
     <w:uiPriority w:val="1"/>
-    <w:semiHidden/>
     <w:unhideWhenUsed/>
   </w:style>
   <w:style w:type="table" w:default="1" w:styleId="Tablanormal">
@@ -947,6 +2269,29 @@
       <w:smallCaps/>
       <w:color w:val="2F5496" w:themeColor="accent1" w:themeShade="BF"/>
       <w:spacing w:val="5"/>
+    </w:rPr>
+  </w:style>
+  <w:style w:type="character" w:styleId="Hipervnculo">
+    <w:name w:val="Hyperlink"/>
+    <w:basedOn w:val="Fuentedeprrafopredeter"/>
+    <w:uiPriority w:val="99"/>
+    <w:unhideWhenUsed/>
+    <w:rsid w:val="00CA2FFB"/>
+    <w:rPr>
+      <w:color w:val="0563C1" w:themeColor="hyperlink"/>
+      <w:u w:val="single"/>
+    </w:rPr>
+  </w:style>
+  <w:style w:type="character" w:styleId="Mencinsinresolver">
+    <w:name w:val="Unresolved Mention"/>
+    <w:basedOn w:val="Fuentedeprrafopredeter"/>
+    <w:uiPriority w:val="99"/>
+    <w:semiHidden/>
+    <w:unhideWhenUsed/>
+    <w:rsid w:val="00CA2FFB"/>
+    <w:rPr>
+      <w:color w:val="605E5C"/>
+      <w:shd w:val="clear" w:color="auto" w:fill="E1DFDD"/>
     </w:rPr>
   </w:style>
 </w:styles>

</xml_diff>

<commit_message>
Se agrego parte de los requerimientos funcionales
</commit_message>
<xml_diff>
--- a/TPI-ASI-2026.docx
+++ b/TPI-ASI-2026.docx
@@ -1,6 +1,6 @@
 
 <file path=word/document.xml><?xml version="1.0" encoding="utf-8"?>
-<w:document xmlns:wpc="http://schemas.microsoft.com/office/word/2010/wordprocessingCanvas" xmlns:cx="http://schemas.microsoft.com/office/drawing/2014/chartex" xmlns:cx1="http://schemas.microsoft.com/office/drawing/2015/9/8/chartex" xmlns:cx2="http://schemas.microsoft.com/office/drawing/2015/10/21/chartex" xmlns:cx3="http://schemas.microsoft.com/office/drawing/2016/5/9/chartex" xmlns:cx4="http://schemas.microsoft.com/office/drawing/2016/5/10/chartex" xmlns:cx5="http://schemas.microsoft.com/office/drawing/2016/5/11/chartex" xmlns:cx6="http://schemas.microsoft.com/office/drawing/2016/5/12/chartex" xmlns:cx7="http://schemas.microsoft.com/office/drawing/2016/5/13/chartex" xmlns:cx8="http://schemas.microsoft.com/office/drawing/2016/5/14/chartex" xmlns:mc="http://schemas.openxmlformats.org/markup-compatibility/2006" xmlns:aink="http://schemas.microsoft.com/office/drawing/2016/ink" xmlns:am3d="http://schemas.microsoft.com/office/drawing/2017/model3d" xmlns:o="urn:schemas-microsoft-com:office:office" xmlns:oel="http://schemas.microsoft.com/office/2019/extlst" xmlns:r="http://schemas.openxmlformats.org/officeDocument/2006/relationships" xmlns:m="http://schemas.openxmlformats.org/officeDocument/2006/math" xmlns:v="urn:schemas-microsoft-com:vml" xmlns:wp14="http://schemas.microsoft.com/office/word/2010/wordprocessingDrawing" xmlns:wp="http://schemas.openxmlformats.org/drawingml/2006/wordprocessingDrawing" xmlns:w10="urn:schemas-microsoft-com:office:word" xmlns:w="http://schemas.openxmlformats.org/wordprocessingml/2006/main" xmlns:w14="http://schemas.microsoft.com/office/word/2010/wordml" xmlns:w15="http://schemas.microsoft.com/office/word/2012/wordml" xmlns:w16cex="http://schemas.microsoft.com/office/word/2018/wordml/cex" xmlns:w16cid="http://schemas.microsoft.com/office/word/2016/wordml/cid" xmlns:w16="http://schemas.microsoft.com/office/word/2018/wordml" xmlns:w16du="http://schemas.microsoft.com/office/word/2023/wordml/word16du" xmlns:w16sdtdh="http://schemas.microsoft.com/office/word/2020/wordml/sdtdatahash" xmlns:w16sdtfl="http://schemas.microsoft.com/office/word/2024/wordml/sdtformatlock" xmlns:w16se="http://schemas.microsoft.com/office/word/2015/wordml/symex" xmlns:wpg="http://schemas.microsoft.com/office/word/2010/wordprocessingGroup" xmlns:wpi="http://schemas.microsoft.com/office/word/2010/wordprocessingInk" xmlns:wne="http://schemas.microsoft.com/office/word/2006/wordml" xmlns:wps="http://schemas.microsoft.com/office/word/2010/wordprocessingShape" mc:Ignorable="w14 w15 w16se w16cid w16 w16cex w16sdtdh w16sdtfl w16du wp14">
+<w:document xmlns:wpc="http://schemas.microsoft.com/office/word/2010/wordprocessingCanvas" xmlns:cx="http://schemas.microsoft.com/office/drawing/2014/chartex" xmlns:cx1="http://schemas.microsoft.com/office/drawing/2015/9/8/chartex" xmlns:cx2="http://schemas.microsoft.com/office/drawing/2015/10/21/chartex" xmlns:cx3="http://schemas.microsoft.com/office/drawing/2016/5/9/chartex" xmlns:cx4="http://schemas.microsoft.com/office/drawing/2016/5/10/chartex" xmlns:cx5="http://schemas.microsoft.com/office/drawing/2016/5/11/chartex" xmlns:cx6="http://schemas.microsoft.com/office/drawing/2016/5/12/chartex" xmlns:cx7="http://schemas.microsoft.com/office/drawing/2016/5/13/chartex" xmlns:cx8="http://schemas.microsoft.com/office/drawing/2016/5/14/chartex" xmlns:mc="http://schemas.openxmlformats.org/markup-compatibility/2006" xmlns:aink="http://schemas.microsoft.com/office/drawing/2016/ink" xmlns:am3d="http://schemas.microsoft.com/office/drawing/2017/model3d" xmlns:o="urn:schemas-microsoft-com:office:office" xmlns:r="http://schemas.openxmlformats.org/officeDocument/2006/relationships" xmlns:m="http://schemas.openxmlformats.org/officeDocument/2006/math" xmlns:v="urn:schemas-microsoft-com:vml" xmlns:wp14="http://schemas.microsoft.com/office/word/2010/wordprocessingDrawing" xmlns:wp="http://schemas.openxmlformats.org/drawingml/2006/wordprocessingDrawing" xmlns:w10="urn:schemas-microsoft-com:office:word" xmlns:w="http://schemas.openxmlformats.org/wordprocessingml/2006/main" xmlns:w14="http://schemas.microsoft.com/office/word/2010/wordml" xmlns:w15="http://schemas.microsoft.com/office/word/2012/wordml" xmlns:w16cex="http://schemas.microsoft.com/office/word/2018/wordml/cex" xmlns:w16cid="http://schemas.microsoft.com/office/word/2016/wordml/cid" xmlns:w16="http://schemas.microsoft.com/office/word/2018/wordml" xmlns:w16sdtdh="http://schemas.microsoft.com/office/word/2020/wordml/sdtdatahash" xmlns:w16se="http://schemas.microsoft.com/office/word/2015/wordml/symex" xmlns:wpg="http://schemas.microsoft.com/office/word/2010/wordprocessingGroup" xmlns:wpi="http://schemas.microsoft.com/office/word/2010/wordprocessingInk" xmlns:wne="http://schemas.microsoft.com/office/word/2006/wordml" xmlns:wps="http://schemas.microsoft.com/office/word/2010/wordprocessingShape" mc:Ignorable="w14 w15 w16se w16cid w16 w16cex w16sdtdh wp14">
   <w:body>
     <w:p>
       <w:pPr>
@@ -740,21 +740,8 @@
           <w14:ligatures w14:val="none"/>
         </w:rPr>
         <w:br/>
-      </w:r>
-      <w:proofErr w:type="spellStart"/>
-      <w:r>
-        <w:rPr>
-          <w:rFonts w:ascii="Arial" w:eastAsia="Times New Roman" w:hAnsi="Arial" w:cs="Arial"/>
-          <w:color w:val="000000"/>
-          <w:kern w:val="0"/>
-          <w:sz w:val="20"/>
-          <w:szCs w:val="20"/>
-          <w:lang w:eastAsia="es-AR"/>
-          <w14:ligatures w14:val="none"/>
-        </w:rPr>
         <w:t>Bertorello</w:t>
       </w:r>
-      <w:proofErr w:type="spellEnd"/>
       <w:r>
         <w:rPr>
           <w:rFonts w:ascii="Arial" w:eastAsia="Times New Roman" w:hAnsi="Arial" w:cs="Arial"/>
@@ -912,21 +899,8 @@
           <w14:ligatures w14:val="none"/>
         </w:rPr>
         <w:br/>
-      </w:r>
-      <w:proofErr w:type="spellStart"/>
-      <w:r>
-        <w:rPr>
-          <w:rFonts w:ascii="Arial" w:eastAsia="Times New Roman" w:hAnsi="Arial" w:cs="Arial"/>
-          <w:color w:val="000000"/>
-          <w:kern w:val="0"/>
-          <w:sz w:val="20"/>
-          <w:szCs w:val="20"/>
-          <w:lang w:eastAsia="es-AR"/>
-          <w14:ligatures w14:val="none"/>
-        </w:rPr>
         <w:t>Issoglio</w:t>
       </w:r>
-      <w:proofErr w:type="spellEnd"/>
       <w:r>
         <w:rPr>
           <w:rFonts w:ascii="Arial" w:eastAsia="Times New Roman" w:hAnsi="Arial" w:cs="Arial"/>
@@ -939,7 +913,6 @@
         </w:rPr>
         <w:t xml:space="preserve">, </w:t>
       </w:r>
-      <w:proofErr w:type="gramStart"/>
       <w:r>
         <w:rPr>
           <w:rFonts w:ascii="Arial" w:eastAsia="Times New Roman" w:hAnsi="Arial" w:cs="Arial"/>
@@ -952,7 +925,6 @@
         </w:rPr>
         <w:t>Abril</w:t>
       </w:r>
-      <w:proofErr w:type="gramEnd"/>
       <w:r>
         <w:rPr>
           <w:rFonts w:ascii="Arial" w:eastAsia="Times New Roman" w:hAnsi="Arial" w:cs="Arial"/>
@@ -1312,11 +1284,6 @@
       </w:r>
     </w:p>
     <w:p>
-      <w:pPr>
-        <w:rPr>
-          <w:lang w:val="es-ES"/>
-        </w:rPr>
-      </w:pPr>
       <w:r>
         <w:lastRenderedPageBreak/>
         <w:t>1) Coloca un nombre a tu grupo, breve presentación y crea un logotipo.</w:t>
@@ -1343,6 +1310,158 @@
       </w:hyperlink>
       <w:r>
         <w:t>, comenta qué relevaste en cada caso.</w:t>
+      </w:r>
+    </w:p>
+    <w:p/>
+    <w:p/>
+    <w:p>
+      <w:pPr>
+        <w:rPr>
+          <w:i/>
+          <w:iCs/>
+          <w:sz w:val="28"/>
+          <w:szCs w:val="28"/>
+          <w:u w:val="single"/>
+        </w:rPr>
+      </w:pPr>
+      <w:r>
+        <w:rPr>
+          <w:i/>
+          <w:iCs/>
+          <w:sz w:val="28"/>
+          <w:szCs w:val="28"/>
+          <w:u w:val="single"/>
+        </w:rPr>
+        <w:t>Listado de requerimientos funcionales</w:t>
+      </w:r>
+    </w:p>
+    <w:p/>
+    <w:p>
+      <w:pPr>
+        <w:rPr>
+          <w:u w:val="single"/>
+        </w:rPr>
+      </w:pPr>
+      <w:r>
+        <w:rPr>
+          <w:u w:val="single"/>
+        </w:rPr>
+        <w:t>Gestión de retiros</w:t>
+      </w:r>
+    </w:p>
+    <w:p>
+      <w:r>
+        <w:t>RF1: El sistema debe permitir al usuario agendar el retiro solicitado ingresando: tipo de retiro, costo estimado, página/persona que organiza el retiro, vía de contacto, metodologías de pago aceptadas por el organizador.</w:t>
+      </w:r>
+    </w:p>
+    <w:p>
+      <w:r>
+        <w:t>RF2: El sistema debe permitir al usuario modificar o eliminar los retiros que ya han sido agendados.</w:t>
+      </w:r>
+    </w:p>
+    <w:p>
+      <w:r>
+        <w:t xml:space="preserve">RF3:  El sistema debe permitir al usuario visualizar el listado de los retiros que ha agendado y la información detallada de cada uno de estos, permitiendo aplicar filtros para la búsqueda de </w:t>
+      </w:r>
+      <w:r>
+        <w:t>retiros según estado, tipo o fecha.</w:t>
+      </w:r>
+    </w:p>
+    <w:p/>
+    <w:p>
+      <w:pPr>
+        <w:rPr>
+          <w:u w:val="single"/>
+        </w:rPr>
+      </w:pPr>
+      <w:r>
+        <w:rPr>
+          <w:u w:val="single"/>
+        </w:rPr>
+        <w:t>Planificación</w:t>
+      </w:r>
+    </w:p>
+    <w:p>
+      <w:r>
+        <w:t>RF4: El sistema debe permitir al usuario asignar un retiro a una fecha específica, permitiendo que se puedan visualizar los retiros de forma cronológica</w:t>
+      </w:r>
+      <w:r>
+        <w:t>.</w:t>
+      </w:r>
+    </w:p>
+    <w:p/>
+    <w:p>
+      <w:pPr>
+        <w:rPr>
+          <w:u w:val="single"/>
+        </w:rPr>
+      </w:pPr>
+      <w:r>
+        <w:rPr>
+          <w:u w:val="single"/>
+        </w:rPr>
+        <w:t>Control de gastos</w:t>
+      </w:r>
+    </w:p>
+    <w:p>
+      <w:r>
+        <w:t xml:space="preserve">RF5: El sistema debe permitir al usuario registrar los pagos realizados </w:t>
+      </w:r>
+      <w:r>
+        <w:t>registrando la fecha del pago, el monto y el estado correspondiente (Seña, Pago parcial o Pago total)</w:t>
+      </w:r>
+    </w:p>
+    <w:p>
+      <w:r>
+        <w:t>RF6: El sistema debe permitir al usuario visualizar el listado de pagos realizados y calcular el monto total gastado en retiros filtrando por un rango de fechas determinado.</w:t>
+      </w:r>
+    </w:p>
+    <w:p/>
+    <w:p>
+      <w:pPr>
+        <w:rPr>
+          <w:u w:val="single"/>
+        </w:rPr>
+      </w:pPr>
+      <w:r>
+        <w:rPr>
+          <w:u w:val="single"/>
+        </w:rPr>
+        <w:t>Alertas</w:t>
+      </w:r>
+    </w:p>
+    <w:p>
+      <w:r>
+        <w:t>RF7: El sistema debe enviar notificaciones al usuario para alertar sobre la proximidad de la fecha de inicio del retiro.</w:t>
+      </w:r>
+    </w:p>
+    <w:p>
+      <w:r>
+        <w:t xml:space="preserve">RF8: El sistema debe enviar notificaciones al usuario para recordar las fechas </w:t>
+      </w:r>
+      <w:r>
+        <w:t>límites</w:t>
+      </w:r>
+      <w:r>
+        <w:t xml:space="preserve"> de</w:t>
+      </w:r>
+      <w:r>
+        <w:t xml:space="preserve"> los compromisos de pago (vencimiento de reserva o cuotas pendientes)</w:t>
+      </w:r>
+    </w:p>
+    <w:p/>
+    <w:p>
+      <w:r>
+        <w:rPr>
+          <w:u w:val="single"/>
+        </w:rPr>
+        <w:lastRenderedPageBreak/>
+        <w:t>Valoraciones</w:t>
+      </w:r>
+    </w:p>
+    <w:p>
+      <w:r>
+        <w:t>RF9: El sistema debe permitir al usuario realizar una valoración de los retiros que ya han sido realizados permitiendo calificar su experiencia (mediante puntuación) y guardar sus comentarios personales sobre el retiro.</w:t>
       </w:r>
     </w:p>
     <w:sectPr>
@@ -1356,7 +1475,7 @@
 </file>
 
 <file path=word/styles.xml><?xml version="1.0" encoding="utf-8"?>
-<w:styles xmlns:mc="http://schemas.openxmlformats.org/markup-compatibility/2006" xmlns:r="http://schemas.openxmlformats.org/officeDocument/2006/relationships" xmlns:w="http://schemas.openxmlformats.org/wordprocessingml/2006/main" xmlns:w14="http://schemas.microsoft.com/office/word/2010/wordml" xmlns:w15="http://schemas.microsoft.com/office/word/2012/wordml" xmlns:w16cex="http://schemas.microsoft.com/office/word/2018/wordml/cex" xmlns:w16cid="http://schemas.microsoft.com/office/word/2016/wordml/cid" xmlns:w16="http://schemas.microsoft.com/office/word/2018/wordml" xmlns:w16du="http://schemas.microsoft.com/office/word/2023/wordml/word16du" xmlns:w16sdtdh="http://schemas.microsoft.com/office/word/2020/wordml/sdtdatahash" xmlns:w16sdtfl="http://schemas.microsoft.com/office/word/2024/wordml/sdtformatlock" xmlns:w16se="http://schemas.microsoft.com/office/word/2015/wordml/symex" mc:Ignorable="w14 w15 w16se w16cid w16 w16cex w16sdtdh w16sdtfl w16du">
+<w:styles xmlns:mc="http://schemas.openxmlformats.org/markup-compatibility/2006" xmlns:r="http://schemas.openxmlformats.org/officeDocument/2006/relationships" xmlns:w="http://schemas.openxmlformats.org/wordprocessingml/2006/main" xmlns:w14="http://schemas.microsoft.com/office/word/2010/wordml" xmlns:w15="http://schemas.microsoft.com/office/word/2012/wordml" xmlns:w16cex="http://schemas.microsoft.com/office/word/2018/wordml/cex" xmlns:w16cid="http://schemas.microsoft.com/office/word/2016/wordml/cid" xmlns:w16="http://schemas.microsoft.com/office/word/2018/wordml" xmlns:w16sdtdh="http://schemas.microsoft.com/office/word/2020/wordml/sdtdatahash" xmlns:w16se="http://schemas.microsoft.com/office/word/2015/wordml/symex" mc:Ignorable="w14 w15 w16se w16cid w16 w16cex w16sdtdh">
   <w:docDefaults>
     <w:rPrDefault>
       <w:rPr>
@@ -1958,6 +2077,7 @@
   <w:style w:type="character" w:default="1" w:styleId="Fuentedeprrafopredeter">
     <w:name w:val="Default Paragraph Font"/>
     <w:uiPriority w:val="1"/>
+    <w:semiHidden/>
     <w:unhideWhenUsed/>
   </w:style>
   <w:style w:type="table" w:default="1" w:styleId="Tablanormal">

</xml_diff>

<commit_message>
Agregué el enunciado del caso
</commit_message>
<xml_diff>
--- a/TPI-ASI-2026.docx
+++ b/TPI-ASI-2026.docx
@@ -1,6 +1,6 @@
 
 <file path=word/document.xml><?xml version="1.0" encoding="utf-8"?>
-<w:document xmlns:wpc="http://schemas.microsoft.com/office/word/2010/wordprocessingCanvas" xmlns:cx="http://schemas.microsoft.com/office/drawing/2014/chartex" xmlns:cx1="http://schemas.microsoft.com/office/drawing/2015/9/8/chartex" xmlns:cx2="http://schemas.microsoft.com/office/drawing/2015/10/21/chartex" xmlns:cx3="http://schemas.microsoft.com/office/drawing/2016/5/9/chartex" xmlns:cx4="http://schemas.microsoft.com/office/drawing/2016/5/10/chartex" xmlns:cx5="http://schemas.microsoft.com/office/drawing/2016/5/11/chartex" xmlns:cx6="http://schemas.microsoft.com/office/drawing/2016/5/12/chartex" xmlns:cx7="http://schemas.microsoft.com/office/drawing/2016/5/13/chartex" xmlns:cx8="http://schemas.microsoft.com/office/drawing/2016/5/14/chartex" xmlns:mc="http://schemas.openxmlformats.org/markup-compatibility/2006" xmlns:aink="http://schemas.microsoft.com/office/drawing/2016/ink" xmlns:am3d="http://schemas.microsoft.com/office/drawing/2017/model3d" xmlns:o="urn:schemas-microsoft-com:office:office" xmlns:r="http://schemas.openxmlformats.org/officeDocument/2006/relationships" xmlns:m="http://schemas.openxmlformats.org/officeDocument/2006/math" xmlns:v="urn:schemas-microsoft-com:vml" xmlns:wp14="http://schemas.microsoft.com/office/word/2010/wordprocessingDrawing" xmlns:wp="http://schemas.openxmlformats.org/drawingml/2006/wordprocessingDrawing" xmlns:w10="urn:schemas-microsoft-com:office:word" xmlns:w="http://schemas.openxmlformats.org/wordprocessingml/2006/main" xmlns:w14="http://schemas.microsoft.com/office/word/2010/wordml" xmlns:w15="http://schemas.microsoft.com/office/word/2012/wordml" xmlns:w16cex="http://schemas.microsoft.com/office/word/2018/wordml/cex" xmlns:w16cid="http://schemas.microsoft.com/office/word/2016/wordml/cid" xmlns:w16="http://schemas.microsoft.com/office/word/2018/wordml" xmlns:w16sdtdh="http://schemas.microsoft.com/office/word/2020/wordml/sdtdatahash" xmlns:w16se="http://schemas.microsoft.com/office/word/2015/wordml/symex" xmlns:wpg="http://schemas.microsoft.com/office/word/2010/wordprocessingGroup" xmlns:wpi="http://schemas.microsoft.com/office/word/2010/wordprocessingInk" xmlns:wne="http://schemas.microsoft.com/office/word/2006/wordml" xmlns:wps="http://schemas.microsoft.com/office/word/2010/wordprocessingShape" mc:Ignorable="w14 w15 w16se w16cid w16 w16cex w16sdtdh wp14">
+<w:document xmlns:wpc="http://schemas.microsoft.com/office/word/2010/wordprocessingCanvas" xmlns:cx="http://schemas.microsoft.com/office/drawing/2014/chartex" xmlns:cx1="http://schemas.microsoft.com/office/drawing/2015/9/8/chartex" xmlns:cx2="http://schemas.microsoft.com/office/drawing/2015/10/21/chartex" xmlns:cx3="http://schemas.microsoft.com/office/drawing/2016/5/9/chartex" xmlns:cx4="http://schemas.microsoft.com/office/drawing/2016/5/10/chartex" xmlns:cx5="http://schemas.microsoft.com/office/drawing/2016/5/11/chartex" xmlns:cx6="http://schemas.microsoft.com/office/drawing/2016/5/12/chartex" xmlns:cx7="http://schemas.microsoft.com/office/drawing/2016/5/13/chartex" xmlns:cx8="http://schemas.microsoft.com/office/drawing/2016/5/14/chartex" xmlns:mc="http://schemas.openxmlformats.org/markup-compatibility/2006" xmlns:aink="http://schemas.microsoft.com/office/drawing/2016/ink" xmlns:am3d="http://schemas.microsoft.com/office/drawing/2017/model3d" xmlns:o="urn:schemas-microsoft-com:office:office" xmlns:oel="http://schemas.microsoft.com/office/2019/extlst" xmlns:r="http://schemas.openxmlformats.org/officeDocument/2006/relationships" xmlns:m="http://schemas.openxmlformats.org/officeDocument/2006/math" xmlns:v="urn:schemas-microsoft-com:vml" xmlns:wp14="http://schemas.microsoft.com/office/word/2010/wordprocessingDrawing" xmlns:wp="http://schemas.openxmlformats.org/drawingml/2006/wordprocessingDrawing" xmlns:w10="urn:schemas-microsoft-com:office:word" xmlns:w="http://schemas.openxmlformats.org/wordprocessingml/2006/main" xmlns:w14="http://schemas.microsoft.com/office/word/2010/wordml" xmlns:w15="http://schemas.microsoft.com/office/word/2012/wordml" xmlns:w16cex="http://schemas.microsoft.com/office/word/2018/wordml/cex" xmlns:w16cid="http://schemas.microsoft.com/office/word/2016/wordml/cid" xmlns:w16="http://schemas.microsoft.com/office/word/2018/wordml" xmlns:w16sdtdh="http://schemas.microsoft.com/office/word/2020/wordml/sdtdatahash" xmlns:w16se="http://schemas.microsoft.com/office/word/2015/wordml/symex" xmlns:wpg="http://schemas.microsoft.com/office/word/2010/wordprocessingGroup" xmlns:wpi="http://schemas.microsoft.com/office/word/2010/wordprocessingInk" xmlns:wne="http://schemas.microsoft.com/office/word/2006/wordml" xmlns:wps="http://schemas.microsoft.com/office/word/2010/wordprocessingShape" mc:Ignorable="w14 w15 w16se w16cid w16 w16cex w16sdtdh wp14">
   <w:body>
     <w:p>
       <w:pPr>
@@ -39,7 +39,7 @@
                     </pic:cNvPicPr>
                   </pic:nvPicPr>
                   <pic:blipFill>
-                    <a:blip r:embed="rId4">
+                    <a:blip r:embed="rId5">
                       <a:extLst>
                         <a:ext uri="{28A0092B-C50C-407E-A947-70E740481C1C}">
                           <a14:useLocalDpi xmlns:a14="http://schemas.microsoft.com/office/drawing/2010/main" val="0"/>
@@ -103,7 +103,7 @@
                     </pic:cNvPicPr>
                   </pic:nvPicPr>
                   <pic:blipFill>
-                    <a:blip r:embed="rId5">
+                    <a:blip r:embed="rId6">
                       <a:extLst>
                         <a:ext uri="{28A0092B-C50C-407E-A947-70E740481C1C}">
                           <a14:useLocalDpi xmlns:a14="http://schemas.microsoft.com/office/drawing/2010/main" val="0"/>
@@ -527,8 +527,21 @@
           <w:lang w:eastAsia="es-AR"/>
           <w14:ligatures w14:val="none"/>
         </w:rPr>
-        <w:t>Ing. Paola Mariana Simieli</w:t>
-      </w:r>
+        <w:t xml:space="preserve">Ing. Paola Mariana </w:t>
+      </w:r>
+      <w:proofErr w:type="spellStart"/>
+      <w:r>
+        <w:rPr>
+          <w:rFonts w:ascii="Arial" w:eastAsia="Times New Roman" w:hAnsi="Arial" w:cs="Arial"/>
+          <w:kern w:val="0"/>
+          <w:sz w:val="20"/>
+          <w:szCs w:val="20"/>
+          <w:lang w:eastAsia="es-AR"/>
+          <w14:ligatures w14:val="none"/>
+        </w:rPr>
+        <w:t>Simieli</w:t>
+      </w:r>
+      <w:proofErr w:type="spellEnd"/>
     </w:p>
     <w:p>
       <w:pPr>
@@ -551,8 +564,21 @@
           <w:lang w:eastAsia="es-AR"/>
           <w14:ligatures w14:val="none"/>
         </w:rPr>
-        <w:t>Ing. Laura Achetta</w:t>
-      </w:r>
+        <w:t xml:space="preserve">Ing. Laura </w:t>
+      </w:r>
+      <w:proofErr w:type="spellStart"/>
+      <w:r>
+        <w:rPr>
+          <w:rFonts w:ascii="Arial" w:eastAsia="Times New Roman" w:hAnsi="Arial" w:cs="Arial"/>
+          <w:kern w:val="0"/>
+          <w:sz w:val="20"/>
+          <w:szCs w:val="20"/>
+          <w:lang w:eastAsia="es-AR"/>
+          <w14:ligatures w14:val="none"/>
+        </w:rPr>
+        <w:t>Achetta</w:t>
+      </w:r>
+      <w:proofErr w:type="spellEnd"/>
     </w:p>
     <w:p>
       <w:pPr>
@@ -693,6 +719,7 @@
         </w:rPr>
         <w:t xml:space="preserve">, </w:t>
       </w:r>
+      <w:proofErr w:type="spellStart"/>
       <w:r>
         <w:rPr>
           <w:rFonts w:ascii="Arial" w:eastAsia="Times New Roman" w:hAnsi="Arial" w:cs="Arial"/>
@@ -705,6 +732,7 @@
         </w:rPr>
         <w:t>Geremias</w:t>
       </w:r>
+      <w:proofErr w:type="spellEnd"/>
       <w:r>
         <w:rPr>
           <w:rFonts w:ascii="Arial" w:eastAsia="Times New Roman" w:hAnsi="Arial" w:cs="Arial"/>
@@ -740,8 +768,21 @@
           <w14:ligatures w14:val="none"/>
         </w:rPr>
         <w:br/>
+      </w:r>
+      <w:proofErr w:type="spellStart"/>
+      <w:r>
+        <w:rPr>
+          <w:rFonts w:ascii="Arial" w:eastAsia="Times New Roman" w:hAnsi="Arial" w:cs="Arial"/>
+          <w:color w:val="000000"/>
+          <w:kern w:val="0"/>
+          <w:sz w:val="20"/>
+          <w:szCs w:val="20"/>
+          <w:lang w:eastAsia="es-AR"/>
+          <w14:ligatures w14:val="none"/>
+        </w:rPr>
         <w:t>Bertorello</w:t>
       </w:r>
+      <w:proofErr w:type="spellEnd"/>
       <w:r>
         <w:rPr>
           <w:rFonts w:ascii="Arial" w:eastAsia="Times New Roman" w:hAnsi="Arial" w:cs="Arial"/>
@@ -789,8 +830,21 @@
           <w14:ligatures w14:val="none"/>
         </w:rPr>
         <w:br/>
+      </w:r>
+      <w:proofErr w:type="spellStart"/>
+      <w:r>
+        <w:rPr>
+          <w:rFonts w:ascii="Arial" w:eastAsia="Times New Roman" w:hAnsi="Arial" w:cs="Arial"/>
+          <w:color w:val="000000"/>
+          <w:kern w:val="0"/>
+          <w:sz w:val="20"/>
+          <w:szCs w:val="20"/>
+          <w:lang w:eastAsia="es-AR"/>
+          <w14:ligatures w14:val="none"/>
+        </w:rPr>
         <w:t>Buffa</w:t>
       </w:r>
+      <w:proofErr w:type="spellEnd"/>
       <w:r>
         <w:rPr>
           <w:rFonts w:ascii="Arial" w:eastAsia="Times New Roman" w:hAnsi="Arial" w:cs="Arial"/>
@@ -838,8 +892,21 @@
           <w14:ligatures w14:val="none"/>
         </w:rPr>
         <w:br/>
+      </w:r>
+      <w:proofErr w:type="spellStart"/>
+      <w:r>
+        <w:rPr>
+          <w:rFonts w:ascii="Arial" w:eastAsia="Times New Roman" w:hAnsi="Arial" w:cs="Arial"/>
+          <w:color w:val="000000"/>
+          <w:kern w:val="0"/>
+          <w:sz w:val="20"/>
+          <w:szCs w:val="20"/>
+          <w:lang w:eastAsia="es-AR"/>
+          <w14:ligatures w14:val="none"/>
+        </w:rPr>
         <w:t>Canevari</w:t>
       </w:r>
+      <w:proofErr w:type="spellEnd"/>
       <w:r>
         <w:rPr>
           <w:rFonts w:ascii="Arial" w:eastAsia="Times New Roman" w:hAnsi="Arial" w:cs="Arial"/>
@@ -899,8 +966,21 @@
           <w14:ligatures w14:val="none"/>
         </w:rPr>
         <w:br/>
+      </w:r>
+      <w:proofErr w:type="spellStart"/>
+      <w:r>
+        <w:rPr>
+          <w:rFonts w:ascii="Arial" w:eastAsia="Times New Roman" w:hAnsi="Arial" w:cs="Arial"/>
+          <w:color w:val="000000"/>
+          <w:kern w:val="0"/>
+          <w:sz w:val="20"/>
+          <w:szCs w:val="20"/>
+          <w:lang w:eastAsia="es-AR"/>
+          <w14:ligatures w14:val="none"/>
+        </w:rPr>
         <w:t>Issoglio</w:t>
       </w:r>
+      <w:proofErr w:type="spellEnd"/>
       <w:r>
         <w:rPr>
           <w:rFonts w:ascii="Arial" w:eastAsia="Times New Roman" w:hAnsi="Arial" w:cs="Arial"/>
@@ -913,6 +993,7 @@
         </w:rPr>
         <w:t xml:space="preserve">, </w:t>
       </w:r>
+      <w:proofErr w:type="gramStart"/>
       <w:r>
         <w:rPr>
           <w:rFonts w:ascii="Arial" w:eastAsia="Times New Roman" w:hAnsi="Arial" w:cs="Arial"/>
@@ -925,6 +1006,7 @@
         </w:rPr>
         <w:t>Abril</w:t>
       </w:r>
+      <w:proofErr w:type="gramEnd"/>
       <w:r>
         <w:rPr>
           <w:rFonts w:ascii="Arial" w:eastAsia="Times New Roman" w:hAnsi="Arial" w:cs="Arial"/>
@@ -948,8 +1030,21 @@
           <w14:ligatures w14:val="none"/>
         </w:rPr>
         <w:br/>
+      </w:r>
+      <w:proofErr w:type="spellStart"/>
+      <w:r>
+        <w:rPr>
+          <w:rFonts w:ascii="Arial" w:eastAsia="Times New Roman" w:hAnsi="Arial" w:cs="Arial"/>
+          <w:color w:val="000000"/>
+          <w:kern w:val="0"/>
+          <w:sz w:val="20"/>
+          <w:szCs w:val="20"/>
+          <w:lang w:eastAsia="es-AR"/>
+          <w14:ligatures w14:val="none"/>
+        </w:rPr>
         <w:t>Mihaljevich</w:t>
       </w:r>
+      <w:proofErr w:type="spellEnd"/>
       <w:r>
         <w:rPr>
           <w:rFonts w:ascii="Arial" w:eastAsia="Times New Roman" w:hAnsi="Arial" w:cs="Arial"/>
@@ -962,6 +1057,7 @@
         </w:rPr>
         <w:t xml:space="preserve">, </w:t>
       </w:r>
+      <w:proofErr w:type="spellStart"/>
       <w:r>
         <w:rPr>
           <w:rFonts w:ascii="Arial" w:eastAsia="Times New Roman" w:hAnsi="Arial" w:cs="Arial"/>
@@ -974,6 +1070,7 @@
         </w:rPr>
         <w:t>Deian</w:t>
       </w:r>
+      <w:proofErr w:type="spellEnd"/>
       <w:r>
         <w:rPr>
           <w:rFonts w:ascii="Arial" w:eastAsia="Times New Roman" w:hAnsi="Arial" w:cs="Arial"/>
@@ -1058,8 +1155,22 @@
           <w14:ligatures w14:val="none"/>
         </w:rPr>
         <w:br/>
-        <w:t>Rubio Santichia</w:t>
-      </w:r>
+        <w:t xml:space="preserve">Rubio </w:t>
+      </w:r>
+      <w:proofErr w:type="spellStart"/>
+      <w:r>
+        <w:rPr>
+          <w:rFonts w:ascii="Arial" w:eastAsia="Times New Roman" w:hAnsi="Arial" w:cs="Arial"/>
+          <w:color w:val="000000"/>
+          <w:kern w:val="0"/>
+          <w:sz w:val="20"/>
+          <w:szCs w:val="20"/>
+          <w:lang w:eastAsia="es-AR"/>
+          <w14:ligatures w14:val="none"/>
+        </w:rPr>
+        <w:t>Santichia</w:t>
+      </w:r>
+      <w:proofErr w:type="spellEnd"/>
       <w:r>
         <w:rPr>
           <w:rFonts w:ascii="Arial" w:eastAsia="Times New Roman" w:hAnsi="Arial" w:cs="Arial"/>
@@ -1300,7 +1411,7 @@
         <w:br/>
         <w:t>4) Anexo: coloca imágenes de las páginas, links consultados para la </w:t>
       </w:r>
-      <w:hyperlink r:id="rId6" w:tooltip="Elicitación" w:history="1">
+      <w:hyperlink r:id="rId7" w:tooltip="Elicitación" w:history="1">
         <w:r>
           <w:rPr>
             <w:rStyle w:val="Hipervnculo"/>
@@ -1313,7 +1424,6 @@
       </w:r>
     </w:p>
     <w:p/>
-    <w:p/>
     <w:p>
       <w:pPr>
         <w:rPr>
@@ -1332,6 +1442,501 @@
           <w:szCs w:val="28"/>
           <w:u w:val="single"/>
         </w:rPr>
+        <w:t>Enunciado del caso</w:t>
+      </w:r>
+    </w:p>
+    <w:p>
+      <w:pPr>
+        <w:rPr>
+          <w:sz w:val="24"/>
+          <w:szCs w:val="24"/>
+        </w:rPr>
+      </w:pPr>
+      <w:r>
+        <w:rPr>
+          <w:sz w:val="24"/>
+          <w:szCs w:val="24"/>
+        </w:rPr>
+        <w:t>Caso: Sistema de Gestión y Descubrimiento de Retiros</w:t>
+      </w:r>
+    </w:p>
+    <w:p>
+      <w:pPr>
+        <w:rPr>
+          <w:b/>
+          <w:bCs/>
+          <w:sz w:val="24"/>
+          <w:szCs w:val="24"/>
+        </w:rPr>
+      </w:pPr>
+      <w:r>
+        <w:rPr>
+          <w:sz w:val="24"/>
+          <w:szCs w:val="24"/>
+        </w:rPr>
+        <w:br/>
+      </w:r>
+      <w:r>
+        <w:rPr>
+          <w:b/>
+          <w:bCs/>
+          <w:sz w:val="24"/>
+          <w:szCs w:val="24"/>
+        </w:rPr>
+        <w:t>1. Contexto y Descripción del Problema (Situación Actual)</w:t>
+      </w:r>
+    </w:p>
+    <w:p>
+      <w:pPr>
+        <w:jc w:val="both"/>
+      </w:pPr>
+      <w:r>
+        <w:t>Actualmente, la cliente participa y organiza su asistencia a diversos retiros temáticos (meditación, yoga, ayuno, senderismo, ceremonias, entre otros). Para gestionar esta información, depende de herramientas rudimentarias y procesos manuales, tales como el registro en planillas de cálculo (Excel) y anotaciones dispersas sobre los datos de contacto (páginas web, WhatsApp, Instagram).</w:t>
+      </w:r>
+    </w:p>
+    <w:p/>
+    <w:p>
+      <w:r>
+        <w:t>Esta modalidad de trabajo manual presenta las siguientes problemáticas:</w:t>
+      </w:r>
+    </w:p>
+    <w:p>
+      <w:pPr>
+        <w:numPr>
+          <w:ilvl w:val="0"/>
+          <w:numId w:val="1"/>
+        </w:numPr>
+        <w:jc w:val="both"/>
+      </w:pPr>
+      <w:r>
+        <w:rPr>
+          <w:b/>
+          <w:bCs/>
+        </w:rPr>
+        <w:t>Falta de centralización:</w:t>
+      </w:r>
+      <w:r>
+        <w:t xml:space="preserve"> La información sobre fechas, costos, actividades y estados de reserva se encuentra dispersa, lo que dificulta una consulta ágil.</w:t>
+      </w:r>
+    </w:p>
+    <w:p>
+      <w:pPr>
+        <w:numPr>
+          <w:ilvl w:val="0"/>
+          <w:numId w:val="1"/>
+        </w:numPr>
+        <w:jc w:val="both"/>
+      </w:pPr>
+      <w:r>
+        <w:rPr>
+          <w:b/>
+          <w:bCs/>
+        </w:rPr>
+        <w:t>Riesgo de pérdida de información o vencimientos:</w:t>
+      </w:r>
+      <w:r>
+        <w:t xml:space="preserve"> Al no contar con un sistema de alertas, existe el riesgo latente de olvidar fechas límite de señas, pagos de cuotas o la proximidad de un retiro de interés.</w:t>
+      </w:r>
+    </w:p>
+    <w:p>
+      <w:pPr>
+        <w:numPr>
+          <w:ilvl w:val="0"/>
+          <w:numId w:val="1"/>
+        </w:numPr>
+        <w:jc w:val="both"/>
+      </w:pPr>
+      <w:r>
+        <w:rPr>
+          <w:b/>
+          <w:bCs/>
+        </w:rPr>
+        <w:t>Complejidad en el cálculo de costos:</w:t>
+      </w:r>
+      <w:r>
+        <w:t xml:space="preserve"> El seguimiento de gastos individuales y grupales (cuando se asiste con amigos o familiares) se vuelve tedioso y propenso a errores de cálculo.</w:t>
+      </w:r>
+    </w:p>
+    <w:p>
+      <w:pPr>
+        <w:numPr>
+          <w:ilvl w:val="0"/>
+          <w:numId w:val="1"/>
+        </w:numPr>
+        <w:jc w:val="both"/>
+      </w:pPr>
+      <w:r>
+        <w:rPr>
+          <w:b/>
+          <w:bCs/>
+        </w:rPr>
+        <w:t>Experiencia de usuario fragmentada:</w:t>
+      </w:r>
+      <w:r>
+        <w:t xml:space="preserve"> No es posible visualizar de manera </w:t>
+      </w:r>
+      <w:r>
+        <w:t>general</w:t>
+      </w:r>
+      <w:r>
+        <w:t xml:space="preserve"> y visual (fotos, comparativas, itinerarios) las opciones disponibles para tomar una decisión eficiente.</w:t>
+      </w:r>
+    </w:p>
+    <w:p>
+      <w:pPr>
+        <w:rPr>
+          <w:b/>
+          <w:bCs/>
+          <w:sz w:val="24"/>
+          <w:szCs w:val="24"/>
+        </w:rPr>
+      </w:pPr>
+    </w:p>
+    <w:p>
+      <w:pPr>
+        <w:rPr>
+          <w:b/>
+          <w:bCs/>
+          <w:sz w:val="24"/>
+          <w:szCs w:val="24"/>
+        </w:rPr>
+      </w:pPr>
+      <w:r>
+        <w:rPr>
+          <w:b/>
+          <w:bCs/>
+          <w:sz w:val="24"/>
+          <w:szCs w:val="24"/>
+        </w:rPr>
+        <w:t>2. Necesidad del Sistema de Información (Situación Propuesta)</w:t>
+      </w:r>
+    </w:p>
+    <w:p>
+      <w:pPr>
+        <w:jc w:val="both"/>
+      </w:pPr>
+      <w:r>
+        <w:t xml:space="preserve">Para resolver esta problemática, se identifica la necesidad de desarrollar una Aplicación Móvil (App Celular) orientada al usuario final (los asistentes a los retiros). El objetivo principal del sistema es </w:t>
+      </w:r>
+      <w:r>
+        <w:rPr>
+          <w:b/>
+          <w:bCs/>
+        </w:rPr>
+        <w:t>permitir la organización personal de los retiros de interés</w:t>
+      </w:r>
+      <w:r>
+        <w:t>, centralizando la búsqueda, selección, control de pagos y planificación de los mismos en una única plataforma intuitiva.</w:t>
+      </w:r>
+    </w:p>
+    <w:p>
+      <w:pPr>
+        <w:jc w:val="both"/>
+      </w:pPr>
+      <w:r>
+        <w:t>El sistema debe transformarse en el asistente digital del usuario, automatizando los recordatorios financieros y logísticos, y facilitando la toma de decisiones mediante filtros avanzados y cuadros de gastos.</w:t>
+      </w:r>
+    </w:p>
+    <w:p>
+      <w:pPr>
+        <w:rPr>
+          <w:sz w:val="24"/>
+          <w:szCs w:val="24"/>
+        </w:rPr>
+      </w:pPr>
+    </w:p>
+    <w:p>
+      <w:pPr>
+        <w:rPr>
+          <w:b/>
+          <w:bCs/>
+          <w:sz w:val="24"/>
+          <w:szCs w:val="24"/>
+        </w:rPr>
+      </w:pPr>
+      <w:r>
+        <w:rPr>
+          <w:b/>
+          <w:bCs/>
+          <w:sz w:val="24"/>
+          <w:szCs w:val="24"/>
+        </w:rPr>
+        <w:t>3. Objetivos del Sistema</w:t>
+      </w:r>
+    </w:p>
+    <w:p>
+      <w:pPr>
+        <w:numPr>
+          <w:ilvl w:val="0"/>
+          <w:numId w:val="2"/>
+        </w:numPr>
+        <w:jc w:val="both"/>
+      </w:pPr>
+      <w:r>
+        <w:rPr>
+          <w:b/>
+          <w:bCs/>
+        </w:rPr>
+        <w:t>Optimizar la organización:</w:t>
+      </w:r>
+      <w:r>
+        <w:t xml:space="preserve"> Permitir al usuario buscar, filtrar y seleccionar retiros en rangos de fechas específicos, comparando sus características clave (costos, actividades, locación).</w:t>
+      </w:r>
+    </w:p>
+    <w:p>
+      <w:pPr>
+        <w:numPr>
+          <w:ilvl w:val="0"/>
+          <w:numId w:val="2"/>
+        </w:numPr>
+        <w:jc w:val="both"/>
+      </w:pPr>
+      <w:r>
+        <w:rPr>
+          <w:b/>
+          <w:bCs/>
+        </w:rPr>
+        <w:t>Garantizar el control financiero:</w:t>
+      </w:r>
+      <w:r>
+        <w:t xml:space="preserve"> Ofrecer un módulo para registrar pagos (reservas, pagos parciales/cuotas, totales), almacenar comprobantes y emitir informes analíticos de gastos.</w:t>
+      </w:r>
+    </w:p>
+    <w:p>
+      <w:pPr>
+        <w:numPr>
+          <w:ilvl w:val="0"/>
+          <w:numId w:val="2"/>
+        </w:numPr>
+        <w:jc w:val="both"/>
+      </w:pPr>
+      <w:r>
+        <w:rPr>
+          <w:b/>
+          <w:bCs/>
+        </w:rPr>
+        <w:t>Mejorar la experiencia de planificación social:</w:t>
+      </w:r>
+      <w:r>
+        <w:t xml:space="preserve"> Facilitar la inclusión de acompañantes (amigos/familiares) en la agenda y el cálculo de gastos asociados.</w:t>
+      </w:r>
+    </w:p>
+    <w:p>
+      <w:pPr>
+        <w:numPr>
+          <w:ilvl w:val="0"/>
+          <w:numId w:val="2"/>
+        </w:numPr>
+        <w:jc w:val="both"/>
+      </w:pPr>
+      <w:r>
+        <w:rPr>
+          <w:b/>
+          <w:bCs/>
+        </w:rPr>
+        <w:t>Disminuir</w:t>
+      </w:r>
+      <w:r>
+        <w:rPr>
+          <w:b/>
+          <w:bCs/>
+        </w:rPr>
+        <w:t xml:space="preserve"> el olvido de </w:t>
+      </w:r>
+      <w:r>
+        <w:rPr>
+          <w:b/>
+          <w:bCs/>
+        </w:rPr>
+        <w:t>eventos</w:t>
+      </w:r>
+      <w:r>
+        <w:rPr>
+          <w:b/>
+          <w:bCs/>
+        </w:rPr>
+        <w:t xml:space="preserve"> clave:</w:t>
+      </w:r>
+      <w:r>
+        <w:t xml:space="preserve"> Implementar un sistema de notificaciones proactivas para fechas de pago, límites de reserva y proximidad de eventos.</w:t>
+      </w:r>
+    </w:p>
+    <w:p>
+      <w:pPr>
+        <w:rPr>
+          <w:b/>
+          <w:bCs/>
+          <w:sz w:val="24"/>
+          <w:szCs w:val="24"/>
+        </w:rPr>
+      </w:pPr>
+    </w:p>
+    <w:p>
+      <w:pPr>
+        <w:rPr>
+          <w:b/>
+          <w:bCs/>
+          <w:sz w:val="24"/>
+          <w:szCs w:val="24"/>
+        </w:rPr>
+      </w:pPr>
+      <w:r>
+        <w:rPr>
+          <w:b/>
+          <w:bCs/>
+          <w:sz w:val="24"/>
+          <w:szCs w:val="24"/>
+        </w:rPr>
+        <w:t>4. Alcance General del Caso Relevado</w:t>
+      </w:r>
+    </w:p>
+    <w:p>
+      <w:pPr>
+        <w:jc w:val="both"/>
+      </w:pPr>
+      <w:r>
+        <w:t>Para cumplir con las necesidades planteadas por el cliente, la aplicación móvil deberá cubrir los siguientes módulos funcionales:</w:t>
+      </w:r>
+    </w:p>
+    <w:p>
+      <w:pPr>
+        <w:numPr>
+          <w:ilvl w:val="0"/>
+          <w:numId w:val="3"/>
+        </w:numPr>
+        <w:jc w:val="both"/>
+      </w:pPr>
+      <w:r>
+        <w:rPr>
+          <w:b/>
+          <w:bCs/>
+        </w:rPr>
+        <w:t>Módulo de Consulta y Filtros:</w:t>
+      </w:r>
+      <w:r>
+        <w:t xml:space="preserve"> Visualización de retiros disponibles con datos precisos: origen/destino, fecha, hora de arranque y final, duración, costos, fotos del lugar y detalle de actividades (ej. </w:t>
+      </w:r>
+      <w:r>
+        <w:rPr>
+          <w:i/>
+          <w:iCs/>
+        </w:rPr>
+        <w:t xml:space="preserve">armonización sonora, regresión a vidas pasadas, </w:t>
+      </w:r>
+      <w:proofErr w:type="spellStart"/>
+      <w:r>
+        <w:rPr>
+          <w:i/>
+          <w:iCs/>
+        </w:rPr>
+        <w:t>trekking</w:t>
+      </w:r>
+      <w:proofErr w:type="spellEnd"/>
+      <w:r>
+        <w:t>, etc.).</w:t>
+      </w:r>
+    </w:p>
+    <w:p>
+      <w:pPr>
+        <w:numPr>
+          <w:ilvl w:val="0"/>
+          <w:numId w:val="3"/>
+        </w:numPr>
+        <w:jc w:val="both"/>
+      </w:pPr>
+      <w:r>
+        <w:rPr>
+          <w:b/>
+          <w:bCs/>
+        </w:rPr>
+        <w:t>Módulo de Agenda y Registro:</w:t>
+      </w:r>
+      <w:r>
+        <w:t xml:space="preserve"> Herramienta para agendar retiros de interés, asociar datos de acompañantes y realizar valoraciones personales sobre las experiencias.</w:t>
+      </w:r>
+    </w:p>
+    <w:p>
+      <w:pPr>
+        <w:numPr>
+          <w:ilvl w:val="0"/>
+          <w:numId w:val="3"/>
+        </w:numPr>
+        <w:jc w:val="both"/>
+      </w:pPr>
+      <w:r>
+        <w:rPr>
+          <w:b/>
+          <w:bCs/>
+        </w:rPr>
+        <w:t>Módulo de Gestión de Pagos y Finanzas:</w:t>
+      </w:r>
+      <w:r>
+        <w:t xml:space="preserve"> Registro del estado del retiro (</w:t>
+      </w:r>
+      <w:r>
+        <w:rPr>
+          <w:i/>
+          <w:iCs/>
+        </w:rPr>
+        <w:t>me interesa, no me interesa, señado, pagado</w:t>
+      </w:r>
+      <w:r>
+        <w:t>), métodos de pago (transferencia o efectivo), control de cuotas con guardado de comprobantes y panel de informe de gastos totales.</w:t>
+      </w:r>
+    </w:p>
+    <w:p>
+      <w:pPr>
+        <w:numPr>
+          <w:ilvl w:val="0"/>
+          <w:numId w:val="3"/>
+        </w:numPr>
+        <w:jc w:val="both"/>
+      </w:pPr>
+      <w:r>
+        <w:rPr>
+          <w:b/>
+          <w:bCs/>
+        </w:rPr>
+        <w:t>Módulo de Notificaciones y Seguridad:</w:t>
+      </w:r>
+      <w:r>
+        <w:t xml:space="preserve"> Alertas automáticas ante la proximidad de un retiro de interés, días límite para reserva o pago de cuotas, bajo un marco que incluya políticas de cancelación y términos de seguridad claramente visibles.</w:t>
+      </w:r>
+    </w:p>
+    <w:p>
+      <w:pPr>
+        <w:rPr>
+          <w:sz w:val="24"/>
+          <w:szCs w:val="24"/>
+        </w:rPr>
+      </w:pPr>
+    </w:p>
+    <w:p>
+      <w:pPr>
+        <w:rPr>
+          <w:sz w:val="24"/>
+          <w:szCs w:val="24"/>
+        </w:rPr>
+      </w:pPr>
+    </w:p>
+    <w:p>
+      <w:pPr>
+        <w:rPr>
+          <w:i/>
+          <w:iCs/>
+          <w:sz w:val="28"/>
+          <w:szCs w:val="28"/>
+          <w:u w:val="single"/>
+        </w:rPr>
+      </w:pPr>
+      <w:r>
+        <w:rPr>
+          <w:i/>
+          <w:iCs/>
+          <w:sz w:val="28"/>
+          <w:szCs w:val="28"/>
+          <w:u w:val="single"/>
+        </w:rPr>
         <w:t>Listado de requerimientos funcionales</w:t>
       </w:r>
     </w:p>
@@ -1361,6 +1966,7 @@
     </w:p>
     <w:p>
       <w:r>
+        <w:lastRenderedPageBreak/>
         <w:t xml:space="preserve">RF3:  El sistema debe permitir al usuario visualizar el listado de los retiros que ha agendado y la información detallada de cada uno de estos, permitiendo aplicar filtros para la búsqueda de </w:t>
       </w:r>
       <w:r>
@@ -1455,7 +2061,6 @@
         <w:rPr>
           <w:u w:val="single"/>
         </w:rPr>
-        <w:lastRenderedPageBreak/>
         <w:t>Valoraciones</w:t>
       </w:r>
     </w:p>
@@ -1472,6 +2077,467 @@
     </w:sectPr>
   </w:body>
 </w:document>
+</file>
+
+<file path=word/numbering.xml><?xml version="1.0" encoding="utf-8"?>
+<w:numbering xmlns:wpc="http://schemas.microsoft.com/office/word/2010/wordprocessingCanvas" xmlns:cx="http://schemas.microsoft.com/office/drawing/2014/chartex" xmlns:cx1="http://schemas.microsoft.com/office/drawing/2015/9/8/chartex" xmlns:cx2="http://schemas.microsoft.com/office/drawing/2015/10/21/chartex" xmlns:cx3="http://schemas.microsoft.com/office/drawing/2016/5/9/chartex" xmlns:cx4="http://schemas.microsoft.com/office/drawing/2016/5/10/chartex" xmlns:cx5="http://schemas.microsoft.com/office/drawing/2016/5/11/chartex" xmlns:cx6="http://schemas.microsoft.com/office/drawing/2016/5/12/chartex" xmlns:cx7="http://schemas.microsoft.com/office/drawing/2016/5/13/chartex" xmlns:cx8="http://schemas.microsoft.com/office/drawing/2016/5/14/chartex" xmlns:mc="http://schemas.openxmlformats.org/markup-compatibility/2006" xmlns:aink="http://schemas.microsoft.com/office/drawing/2016/ink" xmlns:am3d="http://schemas.microsoft.com/office/drawing/2017/model3d" xmlns:o="urn:schemas-microsoft-com:office:office" xmlns:oel="http://schemas.microsoft.com/office/2019/extlst" xmlns:r="http://schemas.openxmlformats.org/officeDocument/2006/relationships" xmlns:m="http://schemas.openxmlformats.org/officeDocument/2006/math" xmlns:v="urn:schemas-microsoft-com:vml" xmlns:wp14="http://schemas.microsoft.com/office/word/2010/wordprocessingDrawing" xmlns:wp="http://schemas.openxmlformats.org/drawingml/2006/wordprocessingDrawing" xmlns:w10="urn:schemas-microsoft-com:office:word" xmlns:w="http://schemas.openxmlformats.org/wordprocessingml/2006/main" xmlns:w14="http://schemas.microsoft.com/office/word/2010/wordml" xmlns:w15="http://schemas.microsoft.com/office/word/2012/wordml" xmlns:w16cex="http://schemas.microsoft.com/office/word/2018/wordml/cex" xmlns:w16cid="http://schemas.microsoft.com/office/word/2016/wordml/cid" xmlns:w16="http://schemas.microsoft.com/office/word/2018/wordml" xmlns:w16sdtdh="http://schemas.microsoft.com/office/word/2020/wordml/sdtdatahash" xmlns:w16se="http://schemas.microsoft.com/office/word/2015/wordml/symex" xmlns:wpg="http://schemas.microsoft.com/office/word/2010/wordprocessingGroup" xmlns:wpi="http://schemas.microsoft.com/office/word/2010/wordprocessingInk" xmlns:wne="http://schemas.microsoft.com/office/word/2006/wordml" xmlns:wps="http://schemas.microsoft.com/office/word/2010/wordprocessingShape" mc:Ignorable="w14 w15 w16se w16cid w16 w16cex w16sdtdh wp14">
+  <w:abstractNum w:abstractNumId="0" w15:restartNumberingAfterBreak="0">
+    <w:nsid w:val="37046016"/>
+    <w:multiLevelType w:val="multilevel"/>
+    <w:tmpl w:val="D7A0B512"/>
+    <w:lvl w:ilvl="0">
+      <w:start w:val="1"/>
+      <w:numFmt w:val="bullet"/>
+      <w:lvlText w:val=""/>
+      <w:lvlJc w:val="left"/>
+      <w:pPr>
+        <w:tabs>
+          <w:tab w:val="num" w:pos="720"/>
+        </w:tabs>
+        <w:ind w:left="720" w:hanging="360"/>
+      </w:pPr>
+      <w:rPr>
+        <w:rFonts w:ascii="Symbol" w:hAnsi="Symbol" w:hint="default"/>
+        <w:sz w:val="20"/>
+      </w:rPr>
+    </w:lvl>
+    <w:lvl w:ilvl="1" w:tentative="1">
+      <w:start w:val="1"/>
+      <w:numFmt w:val="bullet"/>
+      <w:lvlText w:val="o"/>
+      <w:lvlJc w:val="left"/>
+      <w:pPr>
+        <w:tabs>
+          <w:tab w:val="num" w:pos="1440"/>
+        </w:tabs>
+        <w:ind w:left="1440" w:hanging="360"/>
+      </w:pPr>
+      <w:rPr>
+        <w:rFonts w:ascii="Courier New" w:hAnsi="Courier New" w:hint="default"/>
+        <w:sz w:val="20"/>
+      </w:rPr>
+    </w:lvl>
+    <w:lvl w:ilvl="2" w:tentative="1">
+      <w:start w:val="1"/>
+      <w:numFmt w:val="bullet"/>
+      <w:lvlText w:val=""/>
+      <w:lvlJc w:val="left"/>
+      <w:pPr>
+        <w:tabs>
+          <w:tab w:val="num" w:pos="2160"/>
+        </w:tabs>
+        <w:ind w:left="2160" w:hanging="360"/>
+      </w:pPr>
+      <w:rPr>
+        <w:rFonts w:ascii="Wingdings" w:hAnsi="Wingdings" w:hint="default"/>
+        <w:sz w:val="20"/>
+      </w:rPr>
+    </w:lvl>
+    <w:lvl w:ilvl="3" w:tentative="1">
+      <w:start w:val="1"/>
+      <w:numFmt w:val="bullet"/>
+      <w:lvlText w:val=""/>
+      <w:lvlJc w:val="left"/>
+      <w:pPr>
+        <w:tabs>
+          <w:tab w:val="num" w:pos="2880"/>
+        </w:tabs>
+        <w:ind w:left="2880" w:hanging="360"/>
+      </w:pPr>
+      <w:rPr>
+        <w:rFonts w:ascii="Wingdings" w:hAnsi="Wingdings" w:hint="default"/>
+        <w:sz w:val="20"/>
+      </w:rPr>
+    </w:lvl>
+    <w:lvl w:ilvl="4" w:tentative="1">
+      <w:start w:val="1"/>
+      <w:numFmt w:val="bullet"/>
+      <w:lvlText w:val=""/>
+      <w:lvlJc w:val="left"/>
+      <w:pPr>
+        <w:tabs>
+          <w:tab w:val="num" w:pos="3600"/>
+        </w:tabs>
+        <w:ind w:left="3600" w:hanging="360"/>
+      </w:pPr>
+      <w:rPr>
+        <w:rFonts w:ascii="Wingdings" w:hAnsi="Wingdings" w:hint="default"/>
+        <w:sz w:val="20"/>
+      </w:rPr>
+    </w:lvl>
+    <w:lvl w:ilvl="5" w:tentative="1">
+      <w:start w:val="1"/>
+      <w:numFmt w:val="bullet"/>
+      <w:lvlText w:val=""/>
+      <w:lvlJc w:val="left"/>
+      <w:pPr>
+        <w:tabs>
+          <w:tab w:val="num" w:pos="4320"/>
+        </w:tabs>
+        <w:ind w:left="4320" w:hanging="360"/>
+      </w:pPr>
+      <w:rPr>
+        <w:rFonts w:ascii="Wingdings" w:hAnsi="Wingdings" w:hint="default"/>
+        <w:sz w:val="20"/>
+      </w:rPr>
+    </w:lvl>
+    <w:lvl w:ilvl="6" w:tentative="1">
+      <w:start w:val="1"/>
+      <w:numFmt w:val="bullet"/>
+      <w:lvlText w:val=""/>
+      <w:lvlJc w:val="left"/>
+      <w:pPr>
+        <w:tabs>
+          <w:tab w:val="num" w:pos="5040"/>
+        </w:tabs>
+        <w:ind w:left="5040" w:hanging="360"/>
+      </w:pPr>
+      <w:rPr>
+        <w:rFonts w:ascii="Wingdings" w:hAnsi="Wingdings" w:hint="default"/>
+        <w:sz w:val="20"/>
+      </w:rPr>
+    </w:lvl>
+    <w:lvl w:ilvl="7" w:tentative="1">
+      <w:start w:val="1"/>
+      <w:numFmt w:val="bullet"/>
+      <w:lvlText w:val=""/>
+      <w:lvlJc w:val="left"/>
+      <w:pPr>
+        <w:tabs>
+          <w:tab w:val="num" w:pos="5760"/>
+        </w:tabs>
+        <w:ind w:left="5760" w:hanging="360"/>
+      </w:pPr>
+      <w:rPr>
+        <w:rFonts w:ascii="Wingdings" w:hAnsi="Wingdings" w:hint="default"/>
+        <w:sz w:val="20"/>
+      </w:rPr>
+    </w:lvl>
+    <w:lvl w:ilvl="8" w:tentative="1">
+      <w:start w:val="1"/>
+      <w:numFmt w:val="bullet"/>
+      <w:lvlText w:val=""/>
+      <w:lvlJc w:val="left"/>
+      <w:pPr>
+        <w:tabs>
+          <w:tab w:val="num" w:pos="6480"/>
+        </w:tabs>
+        <w:ind w:left="6480" w:hanging="360"/>
+      </w:pPr>
+      <w:rPr>
+        <w:rFonts w:ascii="Wingdings" w:hAnsi="Wingdings" w:hint="default"/>
+        <w:sz w:val="20"/>
+      </w:rPr>
+    </w:lvl>
+  </w:abstractNum>
+  <w:abstractNum w:abstractNumId="1" w15:restartNumberingAfterBreak="0">
+    <w:nsid w:val="4BDC017E"/>
+    <w:multiLevelType w:val="multilevel"/>
+    <w:tmpl w:val="0132552E"/>
+    <w:lvl w:ilvl="0">
+      <w:start w:val="1"/>
+      <w:numFmt w:val="bullet"/>
+      <w:lvlText w:val=""/>
+      <w:lvlJc w:val="left"/>
+      <w:pPr>
+        <w:tabs>
+          <w:tab w:val="num" w:pos="720"/>
+        </w:tabs>
+        <w:ind w:left="720" w:hanging="360"/>
+      </w:pPr>
+      <w:rPr>
+        <w:rFonts w:ascii="Symbol" w:hAnsi="Symbol" w:hint="default"/>
+        <w:sz w:val="20"/>
+      </w:rPr>
+    </w:lvl>
+    <w:lvl w:ilvl="1" w:tentative="1">
+      <w:start w:val="1"/>
+      <w:numFmt w:val="bullet"/>
+      <w:lvlText w:val="o"/>
+      <w:lvlJc w:val="left"/>
+      <w:pPr>
+        <w:tabs>
+          <w:tab w:val="num" w:pos="1440"/>
+        </w:tabs>
+        <w:ind w:left="1440" w:hanging="360"/>
+      </w:pPr>
+      <w:rPr>
+        <w:rFonts w:ascii="Courier New" w:hAnsi="Courier New" w:hint="default"/>
+        <w:sz w:val="20"/>
+      </w:rPr>
+    </w:lvl>
+    <w:lvl w:ilvl="2" w:tentative="1">
+      <w:start w:val="1"/>
+      <w:numFmt w:val="bullet"/>
+      <w:lvlText w:val=""/>
+      <w:lvlJc w:val="left"/>
+      <w:pPr>
+        <w:tabs>
+          <w:tab w:val="num" w:pos="2160"/>
+        </w:tabs>
+        <w:ind w:left="2160" w:hanging="360"/>
+      </w:pPr>
+      <w:rPr>
+        <w:rFonts w:ascii="Wingdings" w:hAnsi="Wingdings" w:hint="default"/>
+        <w:sz w:val="20"/>
+      </w:rPr>
+    </w:lvl>
+    <w:lvl w:ilvl="3" w:tentative="1">
+      <w:start w:val="1"/>
+      <w:numFmt w:val="bullet"/>
+      <w:lvlText w:val=""/>
+      <w:lvlJc w:val="left"/>
+      <w:pPr>
+        <w:tabs>
+          <w:tab w:val="num" w:pos="2880"/>
+        </w:tabs>
+        <w:ind w:left="2880" w:hanging="360"/>
+      </w:pPr>
+      <w:rPr>
+        <w:rFonts w:ascii="Wingdings" w:hAnsi="Wingdings" w:hint="default"/>
+        <w:sz w:val="20"/>
+      </w:rPr>
+    </w:lvl>
+    <w:lvl w:ilvl="4" w:tentative="1">
+      <w:start w:val="1"/>
+      <w:numFmt w:val="bullet"/>
+      <w:lvlText w:val=""/>
+      <w:lvlJc w:val="left"/>
+      <w:pPr>
+        <w:tabs>
+          <w:tab w:val="num" w:pos="3600"/>
+        </w:tabs>
+        <w:ind w:left="3600" w:hanging="360"/>
+      </w:pPr>
+      <w:rPr>
+        <w:rFonts w:ascii="Wingdings" w:hAnsi="Wingdings" w:hint="default"/>
+        <w:sz w:val="20"/>
+      </w:rPr>
+    </w:lvl>
+    <w:lvl w:ilvl="5" w:tentative="1">
+      <w:start w:val="1"/>
+      <w:numFmt w:val="bullet"/>
+      <w:lvlText w:val=""/>
+      <w:lvlJc w:val="left"/>
+      <w:pPr>
+        <w:tabs>
+          <w:tab w:val="num" w:pos="4320"/>
+        </w:tabs>
+        <w:ind w:left="4320" w:hanging="360"/>
+      </w:pPr>
+      <w:rPr>
+        <w:rFonts w:ascii="Wingdings" w:hAnsi="Wingdings" w:hint="default"/>
+        <w:sz w:val="20"/>
+      </w:rPr>
+    </w:lvl>
+    <w:lvl w:ilvl="6" w:tentative="1">
+      <w:start w:val="1"/>
+      <w:numFmt w:val="bullet"/>
+      <w:lvlText w:val=""/>
+      <w:lvlJc w:val="left"/>
+      <w:pPr>
+        <w:tabs>
+          <w:tab w:val="num" w:pos="5040"/>
+        </w:tabs>
+        <w:ind w:left="5040" w:hanging="360"/>
+      </w:pPr>
+      <w:rPr>
+        <w:rFonts w:ascii="Wingdings" w:hAnsi="Wingdings" w:hint="default"/>
+        <w:sz w:val="20"/>
+      </w:rPr>
+    </w:lvl>
+    <w:lvl w:ilvl="7" w:tentative="1">
+      <w:start w:val="1"/>
+      <w:numFmt w:val="bullet"/>
+      <w:lvlText w:val=""/>
+      <w:lvlJc w:val="left"/>
+      <w:pPr>
+        <w:tabs>
+          <w:tab w:val="num" w:pos="5760"/>
+        </w:tabs>
+        <w:ind w:left="5760" w:hanging="360"/>
+      </w:pPr>
+      <w:rPr>
+        <w:rFonts w:ascii="Wingdings" w:hAnsi="Wingdings" w:hint="default"/>
+        <w:sz w:val="20"/>
+      </w:rPr>
+    </w:lvl>
+    <w:lvl w:ilvl="8" w:tentative="1">
+      <w:start w:val="1"/>
+      <w:numFmt w:val="bullet"/>
+      <w:lvlText w:val=""/>
+      <w:lvlJc w:val="left"/>
+      <w:pPr>
+        <w:tabs>
+          <w:tab w:val="num" w:pos="6480"/>
+        </w:tabs>
+        <w:ind w:left="6480" w:hanging="360"/>
+      </w:pPr>
+      <w:rPr>
+        <w:rFonts w:ascii="Wingdings" w:hAnsi="Wingdings" w:hint="default"/>
+        <w:sz w:val="20"/>
+      </w:rPr>
+    </w:lvl>
+  </w:abstractNum>
+  <w:abstractNum w:abstractNumId="2" w15:restartNumberingAfterBreak="0">
+    <w:nsid w:val="7D976EF1"/>
+    <w:multiLevelType w:val="multilevel"/>
+    <w:tmpl w:val="CDDE4D0E"/>
+    <w:lvl w:ilvl="0">
+      <w:start w:val="1"/>
+      <w:numFmt w:val="bullet"/>
+      <w:lvlText w:val=""/>
+      <w:lvlJc w:val="left"/>
+      <w:pPr>
+        <w:tabs>
+          <w:tab w:val="num" w:pos="720"/>
+        </w:tabs>
+        <w:ind w:left="720" w:hanging="360"/>
+      </w:pPr>
+      <w:rPr>
+        <w:rFonts w:ascii="Symbol" w:hAnsi="Symbol" w:hint="default"/>
+        <w:sz w:val="20"/>
+      </w:rPr>
+    </w:lvl>
+    <w:lvl w:ilvl="1" w:tentative="1">
+      <w:start w:val="1"/>
+      <w:numFmt w:val="bullet"/>
+      <w:lvlText w:val="o"/>
+      <w:lvlJc w:val="left"/>
+      <w:pPr>
+        <w:tabs>
+          <w:tab w:val="num" w:pos="1440"/>
+        </w:tabs>
+        <w:ind w:left="1440" w:hanging="360"/>
+      </w:pPr>
+      <w:rPr>
+        <w:rFonts w:ascii="Courier New" w:hAnsi="Courier New" w:hint="default"/>
+        <w:sz w:val="20"/>
+      </w:rPr>
+    </w:lvl>
+    <w:lvl w:ilvl="2" w:tentative="1">
+      <w:start w:val="1"/>
+      <w:numFmt w:val="bullet"/>
+      <w:lvlText w:val=""/>
+      <w:lvlJc w:val="left"/>
+      <w:pPr>
+        <w:tabs>
+          <w:tab w:val="num" w:pos="2160"/>
+        </w:tabs>
+        <w:ind w:left="2160" w:hanging="360"/>
+      </w:pPr>
+      <w:rPr>
+        <w:rFonts w:ascii="Wingdings" w:hAnsi="Wingdings" w:hint="default"/>
+        <w:sz w:val="20"/>
+      </w:rPr>
+    </w:lvl>
+    <w:lvl w:ilvl="3" w:tentative="1">
+      <w:start w:val="1"/>
+      <w:numFmt w:val="bullet"/>
+      <w:lvlText w:val=""/>
+      <w:lvlJc w:val="left"/>
+      <w:pPr>
+        <w:tabs>
+          <w:tab w:val="num" w:pos="2880"/>
+        </w:tabs>
+        <w:ind w:left="2880" w:hanging="360"/>
+      </w:pPr>
+      <w:rPr>
+        <w:rFonts w:ascii="Wingdings" w:hAnsi="Wingdings" w:hint="default"/>
+        <w:sz w:val="20"/>
+      </w:rPr>
+    </w:lvl>
+    <w:lvl w:ilvl="4" w:tentative="1">
+      <w:start w:val="1"/>
+      <w:numFmt w:val="bullet"/>
+      <w:lvlText w:val=""/>
+      <w:lvlJc w:val="left"/>
+      <w:pPr>
+        <w:tabs>
+          <w:tab w:val="num" w:pos="3600"/>
+        </w:tabs>
+        <w:ind w:left="3600" w:hanging="360"/>
+      </w:pPr>
+      <w:rPr>
+        <w:rFonts w:ascii="Wingdings" w:hAnsi="Wingdings" w:hint="default"/>
+        <w:sz w:val="20"/>
+      </w:rPr>
+    </w:lvl>
+    <w:lvl w:ilvl="5" w:tentative="1">
+      <w:start w:val="1"/>
+      <w:numFmt w:val="bullet"/>
+      <w:lvlText w:val=""/>
+      <w:lvlJc w:val="left"/>
+      <w:pPr>
+        <w:tabs>
+          <w:tab w:val="num" w:pos="4320"/>
+        </w:tabs>
+        <w:ind w:left="4320" w:hanging="360"/>
+      </w:pPr>
+      <w:rPr>
+        <w:rFonts w:ascii="Wingdings" w:hAnsi="Wingdings" w:hint="default"/>
+        <w:sz w:val="20"/>
+      </w:rPr>
+    </w:lvl>
+    <w:lvl w:ilvl="6" w:tentative="1">
+      <w:start w:val="1"/>
+      <w:numFmt w:val="bullet"/>
+      <w:lvlText w:val=""/>
+      <w:lvlJc w:val="left"/>
+      <w:pPr>
+        <w:tabs>
+          <w:tab w:val="num" w:pos="5040"/>
+        </w:tabs>
+        <w:ind w:left="5040" w:hanging="360"/>
+      </w:pPr>
+      <w:rPr>
+        <w:rFonts w:ascii="Wingdings" w:hAnsi="Wingdings" w:hint="default"/>
+        <w:sz w:val="20"/>
+      </w:rPr>
+    </w:lvl>
+    <w:lvl w:ilvl="7" w:tentative="1">
+      <w:start w:val="1"/>
+      <w:numFmt w:val="bullet"/>
+      <w:lvlText w:val=""/>
+      <w:lvlJc w:val="left"/>
+      <w:pPr>
+        <w:tabs>
+          <w:tab w:val="num" w:pos="5760"/>
+        </w:tabs>
+        <w:ind w:left="5760" w:hanging="360"/>
+      </w:pPr>
+      <w:rPr>
+        <w:rFonts w:ascii="Wingdings" w:hAnsi="Wingdings" w:hint="default"/>
+        <w:sz w:val="20"/>
+      </w:rPr>
+    </w:lvl>
+    <w:lvl w:ilvl="8" w:tentative="1">
+      <w:start w:val="1"/>
+      <w:numFmt w:val="bullet"/>
+      <w:lvlText w:val=""/>
+      <w:lvlJc w:val="left"/>
+      <w:pPr>
+        <w:tabs>
+          <w:tab w:val="num" w:pos="6480"/>
+        </w:tabs>
+        <w:ind w:left="6480" w:hanging="360"/>
+      </w:pPr>
+      <w:rPr>
+        <w:rFonts w:ascii="Wingdings" w:hAnsi="Wingdings" w:hint="default"/>
+        <w:sz w:val="20"/>
+      </w:rPr>
+    </w:lvl>
+  </w:abstractNum>
+  <w:num w:numId="1" w16cid:durableId="756753552">
+    <w:abstractNumId w:val="1"/>
+  </w:num>
+  <w:num w:numId="2" w16cid:durableId="1265579403">
+    <w:abstractNumId w:val="2"/>
+  </w:num>
+  <w:num w:numId="3" w16cid:durableId="40055012">
+    <w:abstractNumId w:val="0"/>
+  </w:num>
+</w:numbering>
 </file>
 
 <file path=word/styles.xml><?xml version="1.0" encoding="utf-8"?>
@@ -2077,7 +3143,6 @@
   <w:style w:type="character" w:default="1" w:styleId="Fuentedeprrafopredeter">
     <w:name w:val="Default Paragraph Font"/>
     <w:uiPriority w:val="1"/>
-    <w:semiHidden/>
     <w:unhideWhenUsed/>
   </w:style>
   <w:style w:type="table" w:default="1" w:styleId="Tablanormal">

</xml_diff>

<commit_message>
Juan M Canevari corrijio cambios de entrega 1
</commit_message>
<xml_diff>
--- a/TPI-ASI-2026.docx
+++ b/TPI-ASI-2026.docx
@@ -1,6 +1,6 @@
 
 <file path=word/document.xml><?xml version="1.0" encoding="utf-8"?>
-<w:document xmlns:wpc="http://schemas.microsoft.com/office/word/2010/wordprocessingCanvas" xmlns:cx="http://schemas.microsoft.com/office/drawing/2014/chartex" xmlns:cx1="http://schemas.microsoft.com/office/drawing/2015/9/8/chartex" xmlns:cx2="http://schemas.microsoft.com/office/drawing/2015/10/21/chartex" xmlns:cx3="http://schemas.microsoft.com/office/drawing/2016/5/9/chartex" xmlns:cx4="http://schemas.microsoft.com/office/drawing/2016/5/10/chartex" xmlns:cx5="http://schemas.microsoft.com/office/drawing/2016/5/11/chartex" xmlns:cx6="http://schemas.microsoft.com/office/drawing/2016/5/12/chartex" xmlns:cx7="http://schemas.microsoft.com/office/drawing/2016/5/13/chartex" xmlns:cx8="http://schemas.microsoft.com/office/drawing/2016/5/14/chartex" xmlns:mc="http://schemas.openxmlformats.org/markup-compatibility/2006" xmlns:aink="http://schemas.microsoft.com/office/drawing/2016/ink" xmlns:am3d="http://schemas.microsoft.com/office/drawing/2017/model3d" xmlns:o="urn:schemas-microsoft-com:office:office" xmlns:r="http://schemas.openxmlformats.org/officeDocument/2006/relationships" xmlns:m="http://schemas.openxmlformats.org/officeDocument/2006/math" xmlns:v="urn:schemas-microsoft-com:vml" xmlns:wp14="http://schemas.microsoft.com/office/word/2010/wordprocessingDrawing" xmlns:wp="http://schemas.openxmlformats.org/drawingml/2006/wordprocessingDrawing" xmlns:w10="urn:schemas-microsoft-com:office:word" xmlns:w="http://schemas.openxmlformats.org/wordprocessingml/2006/main" xmlns:w14="http://schemas.microsoft.com/office/word/2010/wordml" xmlns:w15="http://schemas.microsoft.com/office/word/2012/wordml" xmlns:w16cex="http://schemas.microsoft.com/office/word/2018/wordml/cex" xmlns:w16cid="http://schemas.microsoft.com/office/word/2016/wordml/cid" xmlns:w16="http://schemas.microsoft.com/office/word/2018/wordml" xmlns:w16se="http://schemas.microsoft.com/office/word/2015/wordml/symex" xmlns:wpg="http://schemas.microsoft.com/office/word/2010/wordprocessingGroup" xmlns:wpi="http://schemas.microsoft.com/office/word/2010/wordprocessingInk" xmlns:wne="http://schemas.microsoft.com/office/word/2006/wordml" xmlns:wps="http://schemas.microsoft.com/office/word/2010/wordprocessingShape" mc:Ignorable="w14 w15 w16se w16cid w16 w16cex wp14">
+<w:document xmlns:wpc="http://schemas.microsoft.com/office/word/2010/wordprocessingCanvas" xmlns:cx="http://schemas.microsoft.com/office/drawing/2014/chartex" xmlns:cx1="http://schemas.microsoft.com/office/drawing/2015/9/8/chartex" xmlns:cx2="http://schemas.microsoft.com/office/drawing/2015/10/21/chartex" xmlns:cx3="http://schemas.microsoft.com/office/drawing/2016/5/9/chartex" xmlns:cx4="http://schemas.microsoft.com/office/drawing/2016/5/10/chartex" xmlns:cx5="http://schemas.microsoft.com/office/drawing/2016/5/11/chartex" xmlns:cx6="http://schemas.microsoft.com/office/drawing/2016/5/12/chartex" xmlns:cx7="http://schemas.microsoft.com/office/drawing/2016/5/13/chartex" xmlns:cx8="http://schemas.microsoft.com/office/drawing/2016/5/14/chartex" xmlns:mc="http://schemas.openxmlformats.org/markup-compatibility/2006" xmlns:aink="http://schemas.microsoft.com/office/drawing/2016/ink" xmlns:am3d="http://schemas.microsoft.com/office/drawing/2017/model3d" xmlns:o="urn:schemas-microsoft-com:office:office" xmlns:oel="http://schemas.microsoft.com/office/2019/extlst" xmlns:r="http://schemas.openxmlformats.org/officeDocument/2006/relationships" xmlns:m="http://schemas.openxmlformats.org/officeDocument/2006/math" xmlns:v="urn:schemas-microsoft-com:vml" xmlns:wp14="http://schemas.microsoft.com/office/word/2010/wordprocessingDrawing" xmlns:wp="http://schemas.openxmlformats.org/drawingml/2006/wordprocessingDrawing" xmlns:w10="urn:schemas-microsoft-com:office:word" xmlns:w="http://schemas.openxmlformats.org/wordprocessingml/2006/main" xmlns:w14="http://schemas.microsoft.com/office/word/2010/wordml" xmlns:w15="http://schemas.microsoft.com/office/word/2012/wordml" xmlns:w16cei="http://schemas.microsoft.com/office/word/2026/wordml/cei" xmlns:w16cex="http://schemas.microsoft.com/office/word/2018/wordml/cex" xmlns:w16cid="http://schemas.microsoft.com/office/word/2016/wordml/cid" xmlns:w16="http://schemas.microsoft.com/office/word/2018/wordml" xmlns:w16du="http://schemas.microsoft.com/office/word/2023/wordml/word16du" xmlns:w16sdtdh="http://schemas.microsoft.com/office/word/2020/wordml/sdtdatahash" xmlns:w16sdtfl="http://schemas.microsoft.com/office/word/2024/wordml/sdtformatlock" xmlns:w16se="http://schemas.microsoft.com/office/word/2015/wordml/symex" xmlns:wpg="http://schemas.microsoft.com/office/word/2010/wordprocessingGroup" xmlns:wpi="http://schemas.microsoft.com/office/word/2010/wordprocessingInk" xmlns:wne="http://schemas.microsoft.com/office/word/2006/wordml" xmlns:wps="http://schemas.microsoft.com/office/word/2010/wordprocessingShape" mc:Ignorable="w14 w15 w16se w16cid w16 w16cex w16sdtdh w16sdtfl w16du wp14">
   <w:body>
     <w:p>
       <w:pPr>
@@ -370,7 +370,7 @@
           <w:kern w:val="0"/>
           <w:sz w:val="24"/>
           <w:szCs w:val="24"/>
-          <w:lang w:eastAsia="es-AR"/>
+          <w:lang w:val="pt-BR" w:eastAsia="es-AR"/>
           <w14:ligatures w14:val="none"/>
         </w:rPr>
       </w:pPr>
@@ -397,25 +397,24 @@
           <w:kern w:val="0"/>
           <w:sz w:val="24"/>
           <w:szCs w:val="24"/>
-          <w:lang w:eastAsia="es-AR"/>
-          <w14:ligatures w14:val="none"/>
-        </w:rPr>
-        <w:t>ENTRE</w:t>
-      </w:r>
-      <w:r>
-        <w:rPr>
-          <w:rFonts w:ascii="Arial" w:eastAsia="Times New Roman" w:hAnsi="Arial" w:cs="Arial"/>
-          <w:b/>
-          <w:bCs/>
-          <w:color w:val="000000"/>
+          <w:lang w:val="pt-BR" w:eastAsia="es-AR"/>
+          <w14:ligatures w14:val="none"/>
+        </w:rPr>
+        <w:t>ENTREGA Nº1</w:t>
+      </w:r>
+    </w:p>
+    <w:p>
+      <w:pPr>
+        <w:spacing w:after="0" w:line="240" w:lineRule="auto"/>
+        <w:rPr>
+          <w:rFonts w:ascii="Times New Roman" w:eastAsia="Times New Roman" w:hAnsi="Times New Roman" w:cs="Times New Roman"/>
           <w:kern w:val="0"/>
           <w:sz w:val="24"/>
           <w:szCs w:val="24"/>
-          <w:lang w:eastAsia="es-AR"/>
-          <w14:ligatures w14:val="none"/>
-        </w:rPr>
-        <w:t>GA Nº1</w:t>
-      </w:r>
+          <w:lang w:val="pt-BR" w:eastAsia="es-AR"/>
+          <w14:ligatures w14:val="none"/>
+        </w:rPr>
+      </w:pPr>
     </w:p>
     <w:p>
       <w:pPr>
@@ -425,7 +424,7 @@
           <w:kern w:val="0"/>
           <w:sz w:val="24"/>
           <w:szCs w:val="24"/>
-          <w:lang w:eastAsia="es-AR"/>
+          <w:lang w:val="pt-BR" w:eastAsia="es-AR"/>
           <w14:ligatures w14:val="none"/>
         </w:rPr>
       </w:pPr>
@@ -438,7 +437,7 @@
           <w:kern w:val="0"/>
           <w:sz w:val="24"/>
           <w:szCs w:val="24"/>
-          <w:lang w:eastAsia="es-AR"/>
+          <w:lang w:val="pt-BR" w:eastAsia="es-AR"/>
           <w14:ligatures w14:val="none"/>
         </w:rPr>
       </w:pPr>
@@ -451,10 +450,134 @@
           <w:kern w:val="0"/>
           <w:sz w:val="24"/>
           <w:szCs w:val="24"/>
-          <w:lang w:eastAsia="es-AR"/>
-          <w14:ligatures w14:val="none"/>
-        </w:rPr>
-      </w:pPr>
+          <w:lang w:val="pt-BR" w:eastAsia="es-AR"/>
+          <w14:ligatures w14:val="none"/>
+        </w:rPr>
+      </w:pPr>
+      <w:r>
+        <w:rPr>
+          <w:rFonts w:ascii="Arial" w:eastAsia="Times New Roman" w:hAnsi="Arial" w:cs="Arial"/>
+          <w:color w:val="000000"/>
+          <w:kern w:val="0"/>
+          <w:sz w:val="20"/>
+          <w:szCs w:val="20"/>
+          <w:u w:val="single"/>
+          <w:lang w:val="pt-BR" w:eastAsia="es-AR"/>
+          <w14:ligatures w14:val="none"/>
+        </w:rPr>
+        <w:t>DOCENTES:</w:t>
+      </w:r>
+    </w:p>
+    <w:p>
+      <w:pPr>
+        <w:spacing w:after="0" w:line="240" w:lineRule="auto"/>
+        <w:rPr>
+          <w:rFonts w:ascii="Arial" w:eastAsia="Times New Roman" w:hAnsi="Arial" w:cs="Arial"/>
+          <w:kern w:val="0"/>
+          <w:sz w:val="20"/>
+          <w:szCs w:val="20"/>
+          <w:lang w:val="pt-BR" w:eastAsia="es-AR"/>
+          <w14:ligatures w14:val="none"/>
+        </w:rPr>
+      </w:pPr>
+      <w:r>
+        <w:rPr>
+          <w:rFonts w:ascii="Arial" w:eastAsia="Times New Roman" w:hAnsi="Arial" w:cs="Arial"/>
+          <w:kern w:val="0"/>
+          <w:sz w:val="20"/>
+          <w:szCs w:val="20"/>
+          <w:lang w:val="pt-BR" w:eastAsia="es-AR"/>
+          <w14:ligatures w14:val="none"/>
+        </w:rPr>
+        <w:t xml:space="preserve">Esp. Ing. Valeria Ortiz </w:t>
+      </w:r>
+      <w:proofErr w:type="spellStart"/>
+      <w:r>
+        <w:rPr>
+          <w:rFonts w:ascii="Arial" w:eastAsia="Times New Roman" w:hAnsi="Arial" w:cs="Arial"/>
+          <w:kern w:val="0"/>
+          <w:sz w:val="20"/>
+          <w:szCs w:val="20"/>
+          <w:lang w:val="pt-BR" w:eastAsia="es-AR"/>
+          <w14:ligatures w14:val="none"/>
+        </w:rPr>
+        <w:t>Quiroz</w:t>
+      </w:r>
+      <w:proofErr w:type="spellEnd"/>
+    </w:p>
+    <w:p>
+      <w:pPr>
+        <w:spacing w:after="0" w:line="240" w:lineRule="auto"/>
+        <w:rPr>
+          <w:rFonts w:ascii="Arial" w:eastAsia="Times New Roman" w:hAnsi="Arial" w:cs="Arial"/>
+          <w:kern w:val="0"/>
+          <w:sz w:val="20"/>
+          <w:szCs w:val="20"/>
+          <w:lang w:val="pt-BR" w:eastAsia="es-AR"/>
+          <w14:ligatures w14:val="none"/>
+        </w:rPr>
+      </w:pPr>
+      <w:r>
+        <w:rPr>
+          <w:rFonts w:ascii="Arial" w:eastAsia="Times New Roman" w:hAnsi="Arial" w:cs="Arial"/>
+          <w:kern w:val="0"/>
+          <w:sz w:val="20"/>
+          <w:szCs w:val="20"/>
+          <w:lang w:val="pt-BR" w:eastAsia="es-AR"/>
+          <w14:ligatures w14:val="none"/>
+        </w:rPr>
+        <w:t xml:space="preserve">Ing. Paola Mariana </w:t>
+      </w:r>
+      <w:proofErr w:type="spellStart"/>
+      <w:r>
+        <w:rPr>
+          <w:rFonts w:ascii="Arial" w:eastAsia="Times New Roman" w:hAnsi="Arial" w:cs="Arial"/>
+          <w:kern w:val="0"/>
+          <w:sz w:val="20"/>
+          <w:szCs w:val="20"/>
+          <w:lang w:val="pt-BR" w:eastAsia="es-AR"/>
+          <w14:ligatures w14:val="none"/>
+        </w:rPr>
+        <w:t>Simieli</w:t>
+      </w:r>
+      <w:proofErr w:type="spellEnd"/>
+    </w:p>
+    <w:p>
+      <w:pPr>
+        <w:spacing w:after="0" w:line="240" w:lineRule="auto"/>
+        <w:rPr>
+          <w:rFonts w:ascii="Arial" w:eastAsia="Times New Roman" w:hAnsi="Arial" w:cs="Arial"/>
+          <w:kern w:val="0"/>
+          <w:sz w:val="20"/>
+          <w:szCs w:val="20"/>
+          <w:lang w:val="pt-BR" w:eastAsia="es-AR"/>
+          <w14:ligatures w14:val="none"/>
+        </w:rPr>
+      </w:pPr>
+      <w:r>
+        <w:rPr>
+          <w:rFonts w:ascii="Arial" w:eastAsia="Times New Roman" w:hAnsi="Arial" w:cs="Arial"/>
+          <w:kern w:val="0"/>
+          <w:sz w:val="20"/>
+          <w:szCs w:val="20"/>
+          <w:lang w:val="pt-BR" w:eastAsia="es-AR"/>
+          <w14:ligatures w14:val="none"/>
+        </w:rPr>
+        <w:t xml:space="preserve">Ing. Laura </w:t>
+      </w:r>
+      <w:proofErr w:type="spellStart"/>
+      <w:r>
+        <w:rPr>
+          <w:rFonts w:ascii="Arial" w:eastAsia="Times New Roman" w:hAnsi="Arial" w:cs="Arial"/>
+          <w:kern w:val="0"/>
+          <w:sz w:val="20"/>
+          <w:szCs w:val="20"/>
+          <w:lang w:val="pt-BR" w:eastAsia="es-AR"/>
+          <w14:ligatures w14:val="none"/>
+        </w:rPr>
+        <w:t>Achetta</w:t>
+      </w:r>
+      <w:proofErr w:type="spellEnd"/>
     </w:p>
     <w:p>
       <w:pPr>
@@ -464,95 +587,10 @@
           <w:kern w:val="0"/>
           <w:sz w:val="24"/>
           <w:szCs w:val="24"/>
-          <w:lang w:eastAsia="es-AR"/>
-          <w14:ligatures w14:val="none"/>
-        </w:rPr>
-      </w:pPr>
-      <w:r>
-        <w:rPr>
-          <w:rFonts w:ascii="Arial" w:eastAsia="Times New Roman" w:hAnsi="Arial" w:cs="Arial"/>
-          <w:color w:val="000000"/>
-          <w:kern w:val="0"/>
-          <w:sz w:val="20"/>
-          <w:szCs w:val="20"/>
-          <w:u w:val="single"/>
-          <w:lang w:eastAsia="es-AR"/>
-          <w14:ligatures w14:val="none"/>
-        </w:rPr>
-        <w:t>DOCENTES:</w:t>
-      </w:r>
-    </w:p>
-    <w:p>
-      <w:pPr>
-        <w:spacing w:after="0" w:line="240" w:lineRule="auto"/>
-        <w:rPr>
-          <w:rFonts w:ascii="Arial" w:eastAsia="Times New Roman" w:hAnsi="Arial" w:cs="Arial"/>
-          <w:kern w:val="0"/>
-          <w:sz w:val="20"/>
-          <w:szCs w:val="20"/>
-          <w:lang w:eastAsia="es-AR"/>
-          <w14:ligatures w14:val="none"/>
-        </w:rPr>
-      </w:pPr>
-      <w:r>
-        <w:rPr>
-          <w:rFonts w:ascii="Arial" w:eastAsia="Times New Roman" w:hAnsi="Arial" w:cs="Arial"/>
-          <w:kern w:val="0"/>
-          <w:sz w:val="20"/>
-          <w:szCs w:val="20"/>
-          <w:lang w:eastAsia="es-AR"/>
-          <w14:ligatures w14:val="none"/>
-        </w:rPr>
-        <w:t>Esp. Ing. Valeria Ortiz Quiroz</w:t>
-      </w:r>
-    </w:p>
-    <w:p>
-      <w:pPr>
-        <w:spacing w:after="0" w:line="240" w:lineRule="auto"/>
-        <w:rPr>
-          <w:rFonts w:ascii="Arial" w:eastAsia="Times New Roman" w:hAnsi="Arial" w:cs="Arial"/>
-          <w:kern w:val="0"/>
-          <w:sz w:val="20"/>
-          <w:szCs w:val="20"/>
-          <w:lang w:eastAsia="es-AR"/>
-          <w14:ligatures w14:val="none"/>
-        </w:rPr>
-      </w:pPr>
-      <w:r>
-        <w:rPr>
-          <w:rFonts w:ascii="Arial" w:eastAsia="Times New Roman" w:hAnsi="Arial" w:cs="Arial"/>
-          <w:kern w:val="0"/>
-          <w:sz w:val="20"/>
-          <w:szCs w:val="20"/>
-          <w:lang w:eastAsia="es-AR"/>
-          <w14:ligatures w14:val="none"/>
-        </w:rPr>
-        <w:t>Ing. Paola Mariana Simieli</w:t>
-      </w:r>
-    </w:p>
-    <w:p>
-      <w:pPr>
-        <w:spacing w:after="0" w:line="240" w:lineRule="auto"/>
-        <w:rPr>
-          <w:rFonts w:ascii="Arial" w:eastAsia="Times New Roman" w:hAnsi="Arial" w:cs="Arial"/>
-          <w:kern w:val="0"/>
-          <w:sz w:val="20"/>
-          <w:szCs w:val="20"/>
-          <w:lang w:eastAsia="es-AR"/>
-          <w14:ligatures w14:val="none"/>
-        </w:rPr>
-      </w:pPr>
-      <w:r>
-        <w:rPr>
-          <w:rFonts w:ascii="Arial" w:eastAsia="Times New Roman" w:hAnsi="Arial" w:cs="Arial"/>
-          <w:kern w:val="0"/>
-          <w:sz w:val="20"/>
-          <w:szCs w:val="20"/>
-          <w:lang w:eastAsia="es-AR"/>
-          <w14:ligatures w14:val="none"/>
-        </w:rPr>
-        <w:t>Ing. Laura Achetta</w:t>
-      </w:r>
+          <w:lang w:val="pt-BR" w:eastAsia="es-AR"/>
+          <w14:ligatures w14:val="none"/>
+        </w:rPr>
+      </w:pPr>
     </w:p>
     <w:p>
       <w:pPr>
@@ -562,7 +600,7 @@
           <w:kern w:val="0"/>
           <w:sz w:val="24"/>
           <w:szCs w:val="24"/>
-          <w:lang w:eastAsia="es-AR"/>
+          <w:lang w:val="pt-BR" w:eastAsia="es-AR"/>
           <w14:ligatures w14:val="none"/>
         </w:rPr>
       </w:pPr>
@@ -575,231 +613,146 @@
           <w:kern w:val="0"/>
           <w:sz w:val="24"/>
           <w:szCs w:val="24"/>
+          <w:lang w:val="pt-BR" w:eastAsia="es-AR"/>
+          <w14:ligatures w14:val="none"/>
+        </w:rPr>
+      </w:pPr>
+      <w:r>
+        <w:rPr>
+          <w:rFonts w:ascii="Arial" w:eastAsia="Times New Roman" w:hAnsi="Arial" w:cs="Arial"/>
+          <w:color w:val="000000"/>
+          <w:kern w:val="0"/>
+          <w:sz w:val="20"/>
+          <w:szCs w:val="20"/>
+          <w:u w:val="single"/>
+          <w:lang w:val="pt-BR" w:eastAsia="es-AR"/>
+          <w14:ligatures w14:val="none"/>
+        </w:rPr>
+        <w:t>ALUMNOS:</w:t>
+      </w:r>
+    </w:p>
+    <w:p>
+      <w:pPr>
+        <w:rPr>
+          <w:rFonts w:ascii="Arial" w:eastAsia="Times New Roman" w:hAnsi="Arial" w:cs="Arial"/>
+          <w:color w:val="000000"/>
+          <w:kern w:val="0"/>
+          <w:sz w:val="20"/>
+          <w:szCs w:val="20"/>
           <w:lang w:eastAsia="es-AR"/>
           <w14:ligatures w14:val="none"/>
         </w:rPr>
       </w:pPr>
-    </w:p>
-    <w:p>
-      <w:pPr>
-        <w:spacing w:after="0" w:line="240" w:lineRule="auto"/>
-        <w:rPr>
-          <w:rFonts w:ascii="Times New Roman" w:eastAsia="Times New Roman" w:hAnsi="Times New Roman" w:cs="Times New Roman"/>
-          <w:kern w:val="0"/>
-          <w:sz w:val="24"/>
-          <w:szCs w:val="24"/>
+      <w:r>
+        <w:rPr>
+          <w:rFonts w:ascii="Arial" w:eastAsia="Times New Roman" w:hAnsi="Arial" w:cs="Arial"/>
+          <w:color w:val="000000"/>
+          <w:kern w:val="0"/>
+          <w:sz w:val="20"/>
+          <w:szCs w:val="20"/>
+          <w:lang w:val="pt-BR" w:eastAsia="es-AR"/>
+          <w14:ligatures w14:val="none"/>
+        </w:rPr>
+        <w:t xml:space="preserve">Aguirre Costa, Geremias. </w:t>
+      </w:r>
+      <w:r>
+        <w:rPr>
+          <w:rFonts w:ascii="Arial" w:eastAsia="Times New Roman" w:hAnsi="Arial" w:cs="Arial"/>
+          <w:color w:val="000000"/>
+          <w:kern w:val="0"/>
+          <w:sz w:val="20"/>
+          <w:szCs w:val="20"/>
+          <w:lang w:val="pt-BR" w:eastAsia="es-AR"/>
+          <w14:ligatures w14:val="none"/>
+        </w:rPr>
+        <w:br/>
+      </w:r>
+      <w:proofErr w:type="spellStart"/>
+      <w:r>
+        <w:rPr>
+          <w:rFonts w:ascii="Arial" w:eastAsia="Times New Roman" w:hAnsi="Arial" w:cs="Arial"/>
+          <w:color w:val="000000"/>
+          <w:kern w:val="0"/>
+          <w:sz w:val="20"/>
+          <w:szCs w:val="20"/>
+          <w:lang w:val="pt-BR" w:eastAsia="es-AR"/>
+          <w14:ligatures w14:val="none"/>
+        </w:rPr>
+        <w:t>Bertorello</w:t>
+      </w:r>
+      <w:proofErr w:type="spellEnd"/>
+      <w:r>
+        <w:rPr>
+          <w:rFonts w:ascii="Arial" w:eastAsia="Times New Roman" w:hAnsi="Arial" w:cs="Arial"/>
+          <w:color w:val="000000"/>
+          <w:kern w:val="0"/>
+          <w:sz w:val="20"/>
+          <w:szCs w:val="20"/>
+          <w:lang w:val="pt-BR" w:eastAsia="es-AR"/>
+          <w14:ligatures w14:val="none"/>
+        </w:rPr>
+        <w:t>, Juan Manuel.</w:t>
+      </w:r>
+      <w:r>
+        <w:rPr>
+          <w:rFonts w:ascii="Arial" w:eastAsia="Times New Roman" w:hAnsi="Arial" w:cs="Arial"/>
+          <w:color w:val="000000"/>
+          <w:kern w:val="0"/>
+          <w:sz w:val="20"/>
+          <w:szCs w:val="20"/>
+          <w:lang w:val="pt-BR" w:eastAsia="es-AR"/>
+          <w14:ligatures w14:val="none"/>
+        </w:rPr>
+        <w:br/>
+      </w:r>
+      <w:proofErr w:type="spellStart"/>
+      <w:r>
+        <w:rPr>
+          <w:rFonts w:ascii="Arial" w:eastAsia="Times New Roman" w:hAnsi="Arial" w:cs="Arial"/>
+          <w:color w:val="000000"/>
+          <w:kern w:val="0"/>
+          <w:sz w:val="20"/>
+          <w:szCs w:val="20"/>
+          <w:lang w:val="pt-BR" w:eastAsia="es-AR"/>
+          <w14:ligatures w14:val="none"/>
+        </w:rPr>
+        <w:t>Buffa</w:t>
+      </w:r>
+      <w:proofErr w:type="spellEnd"/>
+      <w:r>
+        <w:rPr>
+          <w:rFonts w:ascii="Arial" w:eastAsia="Times New Roman" w:hAnsi="Arial" w:cs="Arial"/>
+          <w:color w:val="000000"/>
+          <w:kern w:val="0"/>
+          <w:sz w:val="20"/>
+          <w:szCs w:val="20"/>
+          <w:lang w:val="pt-BR" w:eastAsia="es-AR"/>
+          <w14:ligatures w14:val="none"/>
+        </w:rPr>
+        <w:t>, Matías Nicolás.</w:t>
+      </w:r>
+      <w:r>
+        <w:rPr>
+          <w:rFonts w:ascii="Arial" w:eastAsia="Times New Roman" w:hAnsi="Arial" w:cs="Arial"/>
+          <w:color w:val="000000"/>
+          <w:kern w:val="0"/>
+          <w:sz w:val="20"/>
+          <w:szCs w:val="20"/>
+          <w:lang w:val="pt-BR" w:eastAsia="es-AR"/>
+          <w14:ligatures w14:val="none"/>
+        </w:rPr>
+        <w:br/>
+      </w:r>
+      <w:r>
+        <w:rPr>
+          <w:rFonts w:ascii="Arial" w:eastAsia="Times New Roman" w:hAnsi="Arial" w:cs="Arial"/>
+          <w:color w:val="000000"/>
+          <w:kern w:val="0"/>
+          <w:sz w:val="20"/>
+          <w:szCs w:val="20"/>
           <w:lang w:eastAsia="es-AR"/>
           <w14:ligatures w14:val="none"/>
         </w:rPr>
-      </w:pPr>
-      <w:r>
-        <w:rPr>
-          <w:rFonts w:ascii="Arial" w:eastAsia="Times New Roman" w:hAnsi="Arial" w:cs="Arial"/>
-          <w:color w:val="000000"/>
-          <w:kern w:val="0"/>
-          <w:sz w:val="20"/>
-          <w:szCs w:val="20"/>
-          <w:u w:val="single"/>
-          <w:lang w:eastAsia="es-AR"/>
-          <w14:ligatures w14:val="none"/>
-        </w:rPr>
-        <w:t>ALUMNOS:</w:t>
-      </w:r>
-    </w:p>
-    <w:p>
-      <w:pPr>
-        <w:rPr>
-          <w:rFonts w:ascii="Arial" w:eastAsia="Times New Roman" w:hAnsi="Arial" w:cs="Arial"/>
-          <w:color w:val="000000"/>
-          <w:kern w:val="0"/>
-          <w:sz w:val="20"/>
-          <w:szCs w:val="20"/>
-          <w:lang w:eastAsia="es-AR"/>
-          <w14:ligatures w14:val="none"/>
-        </w:rPr>
-      </w:pPr>
-      <w:r>
-        <w:rPr>
-          <w:rFonts w:ascii="Arial" w:eastAsia="Times New Roman" w:hAnsi="Arial" w:cs="Arial"/>
-          <w:color w:val="000000"/>
-          <w:kern w:val="0"/>
-          <w:sz w:val="20"/>
-          <w:szCs w:val="20"/>
-          <w:lang w:eastAsia="es-AR"/>
-          <w14:ligatures w14:val="none"/>
-        </w:rPr>
-        <w:t>Aguirre Costa</w:t>
-      </w:r>
-      <w:r>
-        <w:rPr>
-          <w:rFonts w:ascii="Arial" w:eastAsia="Times New Roman" w:hAnsi="Arial" w:cs="Arial"/>
-          <w:color w:val="000000"/>
-          <w:kern w:val="0"/>
-          <w:sz w:val="20"/>
-          <w:szCs w:val="20"/>
-          <w:lang w:eastAsia="es-AR"/>
-          <w14:ligatures w14:val="none"/>
-        </w:rPr>
-        <w:t xml:space="preserve">, </w:t>
-      </w:r>
-      <w:r>
-        <w:rPr>
-          <w:rFonts w:ascii="Arial" w:eastAsia="Times New Roman" w:hAnsi="Arial" w:cs="Arial"/>
-          <w:color w:val="000000"/>
-          <w:kern w:val="0"/>
-          <w:sz w:val="20"/>
-          <w:szCs w:val="20"/>
-          <w:lang w:eastAsia="es-AR"/>
-          <w14:ligatures w14:val="none"/>
-        </w:rPr>
-        <w:t>Geremias</w:t>
-      </w:r>
-      <w:r>
-        <w:rPr>
-          <w:rFonts w:ascii="Arial" w:eastAsia="Times New Roman" w:hAnsi="Arial" w:cs="Arial"/>
-          <w:color w:val="000000"/>
-          <w:kern w:val="0"/>
-          <w:sz w:val="20"/>
-          <w:szCs w:val="20"/>
-          <w:lang w:eastAsia="es-AR"/>
-          <w14:ligatures w14:val="none"/>
-        </w:rPr>
-        <w:t>.</w:t>
-      </w:r>
-      <w:r>
-        <w:rPr>
-          <w:rFonts w:ascii="Arial" w:eastAsia="Times New Roman" w:hAnsi="Arial" w:cs="Arial"/>
-          <w:color w:val="000000"/>
-          <w:kern w:val="0"/>
-          <w:sz w:val="20"/>
-          <w:szCs w:val="20"/>
-          <w:lang w:eastAsia="es-AR"/>
-          <w14:ligatures w14:val="none"/>
-        </w:rPr>
-        <w:t xml:space="preserve"> </w:t>
-      </w:r>
-      <w:r>
-        <w:rPr>
-          <w:rFonts w:ascii="Arial" w:eastAsia="Times New Roman" w:hAnsi="Arial" w:cs="Arial"/>
-          <w:color w:val="000000"/>
-          <w:kern w:val="0"/>
-          <w:sz w:val="20"/>
-          <w:szCs w:val="20"/>
-          <w:lang w:eastAsia="es-AR"/>
-          <w14:ligatures w14:val="none"/>
-        </w:rPr>
-        <w:br/>
-      </w:r>
-      <w:proofErr w:type="spellStart"/>
-      <w:r>
-        <w:rPr>
-          <w:rFonts w:ascii="Arial" w:eastAsia="Times New Roman" w:hAnsi="Arial" w:cs="Arial"/>
-          <w:color w:val="000000"/>
-          <w:kern w:val="0"/>
-          <w:sz w:val="20"/>
-          <w:szCs w:val="20"/>
-          <w:lang w:eastAsia="es-AR"/>
-          <w14:ligatures w14:val="none"/>
-        </w:rPr>
-        <w:t>Bertorello</w:t>
-      </w:r>
-      <w:proofErr w:type="spellEnd"/>
-      <w:r>
-        <w:rPr>
-          <w:rFonts w:ascii="Arial" w:eastAsia="Times New Roman" w:hAnsi="Arial" w:cs="Arial"/>
-          <w:color w:val="000000"/>
-          <w:kern w:val="0"/>
-          <w:sz w:val="20"/>
-          <w:szCs w:val="20"/>
-          <w:lang w:eastAsia="es-AR"/>
-          <w14:ligatures w14:val="none"/>
-        </w:rPr>
-        <w:t xml:space="preserve">, </w:t>
-      </w:r>
-      <w:r>
-        <w:rPr>
-          <w:rFonts w:ascii="Arial" w:eastAsia="Times New Roman" w:hAnsi="Arial" w:cs="Arial"/>
-          <w:color w:val="000000"/>
-          <w:kern w:val="0"/>
-          <w:sz w:val="20"/>
-          <w:szCs w:val="20"/>
-          <w:lang w:eastAsia="es-AR"/>
-          <w14:ligatures w14:val="none"/>
-        </w:rPr>
-        <w:t>Juan Manuel</w:t>
-      </w:r>
-      <w:r>
-        <w:rPr>
-          <w:rFonts w:ascii="Arial" w:eastAsia="Times New Roman" w:hAnsi="Arial" w:cs="Arial"/>
-          <w:color w:val="000000"/>
-          <w:kern w:val="0"/>
-          <w:sz w:val="20"/>
-          <w:szCs w:val="20"/>
-          <w:lang w:eastAsia="es-AR"/>
-          <w14:ligatures w14:val="none"/>
-        </w:rPr>
-        <w:t>.</w:t>
-      </w:r>
-      <w:r>
-        <w:rPr>
-          <w:rFonts w:ascii="Arial" w:eastAsia="Times New Roman" w:hAnsi="Arial" w:cs="Arial"/>
-          <w:color w:val="000000"/>
-          <w:kern w:val="0"/>
-          <w:sz w:val="20"/>
-          <w:szCs w:val="20"/>
-          <w:lang w:eastAsia="es-AR"/>
-          <w14:ligatures w14:val="none"/>
-        </w:rPr>
-        <w:br/>
-        <w:t>Buffa</w:t>
-      </w:r>
-      <w:r>
-        <w:rPr>
-          <w:rFonts w:ascii="Arial" w:eastAsia="Times New Roman" w:hAnsi="Arial" w:cs="Arial"/>
-          <w:color w:val="000000"/>
-          <w:kern w:val="0"/>
-          <w:sz w:val="20"/>
-          <w:szCs w:val="20"/>
-          <w:lang w:eastAsia="es-AR"/>
-          <w14:ligatures w14:val="none"/>
-        </w:rPr>
-        <w:t xml:space="preserve">, </w:t>
-      </w:r>
-      <w:r>
-        <w:rPr>
-          <w:rFonts w:ascii="Arial" w:eastAsia="Times New Roman" w:hAnsi="Arial" w:cs="Arial"/>
-          <w:color w:val="000000"/>
-          <w:kern w:val="0"/>
-          <w:sz w:val="20"/>
-          <w:szCs w:val="20"/>
-          <w:lang w:eastAsia="es-AR"/>
-          <w14:ligatures w14:val="none"/>
-        </w:rPr>
-        <w:t>Matías Nicolás</w:t>
-      </w:r>
-      <w:r>
-        <w:rPr>
-          <w:rFonts w:ascii="Arial" w:eastAsia="Times New Roman" w:hAnsi="Arial" w:cs="Arial"/>
-          <w:color w:val="000000"/>
-          <w:kern w:val="0"/>
-          <w:sz w:val="20"/>
-          <w:szCs w:val="20"/>
-          <w:lang w:eastAsia="es-AR"/>
-          <w14:ligatures w14:val="none"/>
-        </w:rPr>
-        <w:t>.</w:t>
-      </w:r>
-      <w:r>
-        <w:rPr>
-          <w:rFonts w:ascii="Arial" w:eastAsia="Times New Roman" w:hAnsi="Arial" w:cs="Arial"/>
-          <w:color w:val="000000"/>
-          <w:kern w:val="0"/>
-          <w:sz w:val="20"/>
-          <w:szCs w:val="20"/>
-          <w:lang w:eastAsia="es-AR"/>
-          <w14:ligatures w14:val="none"/>
-        </w:rPr>
-        <w:br/>
         <w:t>Canevari</w:t>
       </w:r>
       <w:r>
@@ -875,7 +828,6 @@
         </w:rPr>
         <w:t xml:space="preserve">, </w:t>
       </w:r>
-      <w:proofErr w:type="gramStart"/>
       <w:r>
         <w:rPr>
           <w:rFonts w:ascii="Arial" w:eastAsia="Times New Roman" w:hAnsi="Arial" w:cs="Arial"/>
@@ -888,7 +840,6 @@
         </w:rPr>
         <w:t>Abril</w:t>
       </w:r>
-      <w:proofErr w:type="gramEnd"/>
       <w:r>
         <w:rPr>
           <w:rFonts w:ascii="Arial" w:eastAsia="Times New Roman" w:hAnsi="Arial" w:cs="Arial"/>
@@ -1355,7 +1306,7 @@
       </w:r>
       <w:proofErr w:type="spellEnd"/>
       <w:r>
-        <w:t xml:space="preserve"> es un asistente digital diseñado para centralizar información dispersa de redes sociales, gestionar el control financiero de señas y cuotas, y automatizar recordatorios logísticos. Con </w:t>
+        <w:t xml:space="preserve"> es un asistente digital diseñado para centralizar información dispersa de redes sociales. Con </w:t>
       </w:r>
       <w:proofErr w:type="spellStart"/>
       <w:r>
@@ -1559,30 +1510,16 @@
           <w:b/>
           <w:bCs/>
         </w:rPr>
-        <w:t>Complejidad en el cálculo de costos:</w:t>
-      </w:r>
-      <w:r>
-        <w:t xml:space="preserve"> El seguimiento de gastos individuales y grupales (cuando se asiste con amigos o familiares) se vuelve tedioso y propenso a errores de cálculo.</w:t>
-      </w:r>
-    </w:p>
-    <w:p>
-      <w:pPr>
-        <w:pStyle w:val="Prrafodelista"/>
-        <w:numPr>
-          <w:ilvl w:val="0"/>
-          <w:numId w:val="4"/>
-        </w:numPr>
-        <w:jc w:val="both"/>
-      </w:pPr>
-      <w:r>
-        <w:rPr>
-          <w:b/>
-          <w:bCs/>
-        </w:rPr>
         <w:t>Experiencia de usuario fragmentada:</w:t>
       </w:r>
       <w:r>
-        <w:t xml:space="preserve"> No es posible visualizar de manera general y visual (fotos, comparativas, itinerarios) las opciones disponibles para tomar una decisión eficiente.</w:t>
+        <w:t xml:space="preserve"> No es posible visualizar de manera general y visual</w:t>
+      </w:r>
+      <w:r>
+        <w:t xml:space="preserve"> </w:t>
+      </w:r>
+      <w:r>
+        <w:t>las opciones disponibles para tomar una decisión eficiente.</w:t>
       </w:r>
     </w:p>
     <w:p>
@@ -1662,7 +1599,10 @@
         <w:t>Optimizar la organización:</w:t>
       </w:r>
       <w:r>
-        <w:t xml:space="preserve"> Permitir al usuario buscar, filtrar y seleccionar retiros en rangos de fechas específicos, comparando sus características clave (costos, actividades, locación).</w:t>
+        <w:t xml:space="preserve"> </w:t>
+      </w:r>
+      <w:r>
+        <w:t>Centralizar la información de los retiros de interés en una única plataforma para facilitar la toma de decisiones del usuario.</w:t>
       </w:r>
     </w:p>
     <w:p>
@@ -1682,7 +1622,10 @@
         <w:t>Garantizar el control financiero:</w:t>
       </w:r>
       <w:r>
-        <w:t xml:space="preserve"> Ofrecer un módulo para registrar pagos (reservas, pagos parciales/cuotas, totales), almacenar comprobantes y emitir informes analíticos de gastos.</w:t>
+        <w:t xml:space="preserve"> </w:t>
+      </w:r>
+      <w:r>
+        <w:t>Facilitar el seguimiento de los gastos personales e inversiones realizadas en los distintos retiros.</w:t>
       </w:r>
     </w:p>
     <w:p>
@@ -1702,7 +1645,10 @@
         <w:t>Mejorar la experiencia de planificación social:</w:t>
       </w:r>
       <w:r>
-        <w:t xml:space="preserve"> Facilitar la inclusión de acompañantes (amigos/familiares) en la agenda y el cálculo de gastos asociados.</w:t>
+        <w:t xml:space="preserve"> </w:t>
+      </w:r>
+      <w:r>
+        <w:t>Permitir la contemplación de acompañantes en la organización logística y económica.</w:t>
       </w:r>
     </w:p>
     <w:p>
@@ -1722,7 +1668,10 @@
         <w:t>Disminuir el olvido de eventos clave:</w:t>
       </w:r>
       <w:r>
-        <w:t xml:space="preserve"> Implementar un sistema de notificaciones proactivas para fechas de pago, límites de reserva y proximidad de eventos.</w:t>
+        <w:t xml:space="preserve"> </w:t>
+      </w:r>
+      <w:r>
+        <w:t>Proveer asistencia proactiva para asegurar el cumplimiento de las fechas de pago y la asistencia a los eventos agendados.</w:t>
       </w:r>
     </w:p>
     <w:p>
@@ -1791,17 +1740,32 @@
     </w:p>
     <w:p>
       <w:r>
-        <w:t>RF1: El sistema debe permitir al usuario agendar el retiro solicitado ingresando: tipo de retiro, costo estimado, página/persona que organiza el retiro, vía de contacto, metodologías de pago aceptadas por el organizador.</w:t>
-      </w:r>
-    </w:p>
-    <w:p>
-      <w:r>
-        <w:t>RF2: El sistema debe permitir al usuario modificar o eliminar los retiros que ya han sido agendados.</w:t>
-      </w:r>
-    </w:p>
-    <w:p>
-      <w:r>
-        <w:t xml:space="preserve">RF3:  El sistema debe permitir al usuario visualizar el listado de los retiros que ha agendado y la información detallada de cada uno de estos, permitiendo aplicar filtros para la búsqueda de </w:t>
+        <w:t xml:space="preserve">RF1: </w:t>
+      </w:r>
+      <w:r>
+        <w:t>El sistema debe permitir al usuario registrar un nuevo retiro ingresando: fecha de inicio y fin, tipo de retiro, costo estimado, organizador, vía de contacto y metodologías de pago aceptadas.</w:t>
+      </w:r>
+    </w:p>
+    <w:p>
+      <w:r>
+        <w:t xml:space="preserve">RF2: El sistema debe permitir al usuario modificar o </w:t>
+      </w:r>
+      <w:r>
+        <w:t>dar de baja</w:t>
+      </w:r>
+      <w:r>
+        <w:t xml:space="preserve"> los retiros que ya han sido agendados.</w:t>
+      </w:r>
+    </w:p>
+    <w:p>
+      <w:r>
+        <w:t xml:space="preserve">RF3:  El sistema debe permitir al usuario </w:t>
+      </w:r>
+      <w:r>
+        <w:t>consultar</w:t>
+      </w:r>
+      <w:r>
+        <w:t xml:space="preserve"> los retiros que ha agendado permitiendo aplicar filtros para la búsqueda de </w:t>
       </w:r>
       <w:r>
         <w:t>retiros según estado, tipo o fecha.</w:t>
@@ -1817,15 +1781,32 @@
         <w:rPr>
           <w:u w:val="single"/>
         </w:rPr>
-        <w:t>Planificación</w:t>
-      </w:r>
-    </w:p>
-    <w:p>
-      <w:r>
-        <w:t>RF4: El sistema debe permitir al usuario asignar un retiro a una fecha específica, permitiendo que se puedan visualizar los retiros de forma cronológica</w:t>
-      </w:r>
-      <w:r>
-        <w:t>.</w:t>
+        <w:t>Control de gastos</w:t>
+      </w:r>
+    </w:p>
+    <w:p>
+      <w:r>
+        <w:t>RF</w:t>
+      </w:r>
+      <w:r>
+        <w:t>4</w:t>
+      </w:r>
+      <w:r>
+        <w:t xml:space="preserve">: El sistema debe permitir al usuario registrar los pagos realizados </w:t>
+      </w:r>
+      <w:r>
+        <w:t>registrando la fecha del pago, el monto y el estado correspondiente (Seña, Pago parcial o Pago total)</w:t>
+      </w:r>
+    </w:p>
+    <w:p>
+      <w:r>
+        <w:t>RF</w:t>
+      </w:r>
+      <w:r>
+        <w:t>5</w:t>
+      </w:r>
+      <w:r>
+        <w:t>: El sistema debe permitir al usuario visualizar el listado de pagos realizados y calcular el monto total gastado en retiros filtrando por un rango de fechas determinado.</w:t>
       </w:r>
     </w:p>
     <w:p>
@@ -1838,65 +1819,57 @@
         <w:rPr>
           <w:u w:val="single"/>
         </w:rPr>
-        <w:t>Control de gastos</w:t>
-      </w:r>
-    </w:p>
-    <w:p>
-      <w:r>
-        <w:t xml:space="preserve">RF5: El sistema debe permitir al usuario registrar los pagos realizados </w:t>
-      </w:r>
-      <w:r>
-        <w:t>registrando la fecha del pago, el monto y el estado correspondiente (Seña, Pago parcial o Pago total)</w:t>
-      </w:r>
-    </w:p>
-    <w:p>
-      <w:r>
-        <w:t>RF6: El sistema debe permitir al usuario visualizar el listado de pagos realizados y calcular el monto total gastado en retiros filtrando por un rango de fechas determinado.</w:t>
-      </w:r>
-    </w:p>
-    <w:p>
-      <w:pPr>
+        <w:t>Alertas</w:t>
+      </w:r>
+    </w:p>
+    <w:p>
+      <w:r>
+        <w:t>RF</w:t>
+      </w:r>
+      <w:r>
+        <w:t>6</w:t>
+      </w:r>
+      <w:r>
+        <w:t>: El sistema debe enviar notificaciones al usuario para alertar sobre la proximidad de la fecha de inicio del retiro.</w:t>
+      </w:r>
+    </w:p>
+    <w:p>
+      <w:r>
+        <w:t>RF</w:t>
+      </w:r>
+      <w:r>
+        <w:t>7</w:t>
+      </w:r>
+      <w:r>
+        <w:t xml:space="preserve">: El sistema debe enviar notificaciones al usuario para recordar las fechas </w:t>
+      </w:r>
+      <w:r>
+        <w:t>límites</w:t>
+      </w:r>
+      <w:r>
+        <w:t xml:space="preserve"> de</w:t>
+      </w:r>
+      <w:r>
+        <w:t xml:space="preserve"> los compromisos de pago (vencimiento de reserva o cuotas pendientes)</w:t>
+      </w:r>
+    </w:p>
+    <w:p>
+      <w:r>
         <w:rPr>
           <w:u w:val="single"/>
         </w:rPr>
-      </w:pPr>
-      <w:r>
-        <w:rPr>
-          <w:u w:val="single"/>
-        </w:rPr>
-        <w:t>Alertas</w:t>
-      </w:r>
-    </w:p>
-    <w:p>
-      <w:r>
-        <w:t>RF7: El sistema debe enviar notificaciones al usuario para alertar sobre la proximidad de la fecha de inicio del retiro.</w:t>
-      </w:r>
-    </w:p>
-    <w:p>
-      <w:r>
-        <w:t xml:space="preserve">RF8: El sistema debe enviar notificaciones al usuario para recordar las fechas </w:t>
-      </w:r>
-      <w:r>
-        <w:t>límites</w:t>
-      </w:r>
-      <w:r>
-        <w:t xml:space="preserve"> de</w:t>
-      </w:r>
-      <w:r>
-        <w:t xml:space="preserve"> los compromisos de pago (vencimiento de reserva o cuotas pendientes)</w:t>
-      </w:r>
-    </w:p>
-    <w:p>
-      <w:r>
-        <w:rPr>
-          <w:u w:val="single"/>
-        </w:rPr>
         <w:t>Valoraciones</w:t>
       </w:r>
     </w:p>
     <w:p>
       <w:r>
-        <w:t>RF9: El sistema debe permitir al usuario realizar una valoración de los retiros que ya han sido realizados permitiendo calificar su experiencia (mediante puntuación) y guardar sus comentarios personales sobre el retiro.</w:t>
+        <w:t>RF</w:t>
+      </w:r>
+      <w:r>
+        <w:t>8</w:t>
+      </w:r>
+      <w:r>
+        <w:t>: El sistema debe permitir al usuario realizar una valoración de los retiros que ya han sido realizados permitiendo calificar su experiencia (mediante puntuación) y guardar sus comentarios personales sobre el retiro.</w:t>
       </w:r>
     </w:p>
     <w:p>
@@ -2048,22 +2021,13 @@
       </w:r>
     </w:p>
     <w:p>
-      <w:pPr>
-        <w:rPr>
-          <w:lang w:val="en-US"/>
-        </w:rPr>
-      </w:pPr>
-      <w:r>
-        <w:rPr>
-          <w:lang w:val="en-US"/>
-        </w:rPr>
+      <w:r>
         <w:t xml:space="preserve">Link: </w:t>
       </w:r>
       <w:hyperlink r:id="rId10" w:history="1">
         <w:r>
           <w:rPr>
             <w:rStyle w:val="Hipervnculo"/>
-            <w:lang w:val="en-US"/>
           </w:rPr>
           <w:t>https://www.caminosalser.com/i64-retiro-espiritual-de-caminos-al-ser-en-capilla-del-monte-cordoba-argentina/?utm_source=chatgpt.com</w:t>
         </w:r>
@@ -2176,29 +2140,57 @@
       <w:pPr>
         <w:rPr>
           <w:u w:val="single"/>
-        </w:rPr>
-      </w:pPr>
+          <w:lang w:val="pt-BR"/>
+        </w:rPr>
+      </w:pPr>
+      <w:proofErr w:type="spellStart"/>
       <w:r>
         <w:rPr>
           <w:u w:val="single"/>
-        </w:rPr>
-        <w:t>Análisis de redes sociales</w:t>
-      </w:r>
-    </w:p>
-    <w:p>
-      <w:r>
+          <w:lang w:val="pt-BR"/>
+        </w:rPr>
+        <w:t>Análisis</w:t>
+      </w:r>
+      <w:proofErr w:type="spellEnd"/>
+      <w:r>
+        <w:rPr>
+          <w:u w:val="single"/>
+          <w:lang w:val="pt-BR"/>
+        </w:rPr>
+        <w:t xml:space="preserve"> de redes </w:t>
+      </w:r>
+      <w:proofErr w:type="spellStart"/>
+      <w:r>
+        <w:rPr>
+          <w:u w:val="single"/>
+          <w:lang w:val="pt-BR"/>
+        </w:rPr>
+        <w:t>sociales</w:t>
+      </w:r>
+      <w:proofErr w:type="spellEnd"/>
+    </w:p>
+    <w:p>
+      <w:pPr>
+        <w:rPr>
+          <w:lang w:val="pt-BR"/>
+        </w:rPr>
+      </w:pPr>
+      <w:r>
+        <w:rPr>
+          <w:lang w:val="pt-BR"/>
+        </w:rPr>
         <w:t>Instagram:</w:t>
       </w:r>
     </w:p>
     <w:p>
       <w:pPr>
         <w:rPr>
-          <w:lang w:val="en-US"/>
-        </w:rPr>
-      </w:pPr>
-      <w:r>
-        <w:rPr>
-          <w:lang w:val="en-US"/>
+          <w:lang w:val="pt-BR"/>
+        </w:rPr>
+      </w:pPr>
+      <w:r>
+        <w:rPr>
+          <w:lang w:val="pt-BR"/>
         </w:rPr>
         <w:t xml:space="preserve">Link: </w:t>
       </w:r>
@@ -2206,7 +2198,7 @@
         <w:r>
           <w:rPr>
             <w:rStyle w:val="Hipervnculo"/>
-            <w:lang w:val="en-US"/>
+            <w:lang w:val="pt-BR"/>
           </w:rPr>
           <w:t>https://www.instagram.com/p/DTsmGVMFSHn/?img_index=1</w:t>
         </w:r>
@@ -2545,7 +2537,7 @@
 </file>
 
 <file path=word/numbering.xml><?xml version="1.0" encoding="utf-8"?>
-<w:numbering xmlns:wpc="http://schemas.microsoft.com/office/word/2010/wordprocessingCanvas" xmlns:cx="http://schemas.microsoft.com/office/drawing/2014/chartex" xmlns:cx1="http://schemas.microsoft.com/office/drawing/2015/9/8/chartex" xmlns:cx2="http://schemas.microsoft.com/office/drawing/2015/10/21/chartex" xmlns:cx3="http://schemas.microsoft.com/office/drawing/2016/5/9/chartex" xmlns:cx4="http://schemas.microsoft.com/office/drawing/2016/5/10/chartex" xmlns:cx5="http://schemas.microsoft.com/office/drawing/2016/5/11/chartex" xmlns:cx6="http://schemas.microsoft.com/office/drawing/2016/5/12/chartex" xmlns:cx7="http://schemas.microsoft.com/office/drawing/2016/5/13/chartex" xmlns:cx8="http://schemas.microsoft.com/office/drawing/2016/5/14/chartex" xmlns:mc="http://schemas.openxmlformats.org/markup-compatibility/2006" xmlns:aink="http://schemas.microsoft.com/office/drawing/2016/ink" xmlns:am3d="http://schemas.microsoft.com/office/drawing/2017/model3d" xmlns:o="urn:schemas-microsoft-com:office:office" xmlns:r="http://schemas.openxmlformats.org/officeDocument/2006/relationships" xmlns:m="http://schemas.openxmlformats.org/officeDocument/2006/math" xmlns:v="urn:schemas-microsoft-com:vml" xmlns:wp14="http://schemas.microsoft.com/office/word/2010/wordprocessingDrawing" xmlns:wp="http://schemas.openxmlformats.org/drawingml/2006/wordprocessingDrawing" xmlns:w10="urn:schemas-microsoft-com:office:word" xmlns:w="http://schemas.openxmlformats.org/wordprocessingml/2006/main" xmlns:w14="http://schemas.microsoft.com/office/word/2010/wordml" xmlns:w15="http://schemas.microsoft.com/office/word/2012/wordml" xmlns:w16cex="http://schemas.microsoft.com/office/word/2018/wordml/cex" xmlns:w16cid="http://schemas.microsoft.com/office/word/2016/wordml/cid" xmlns:w16="http://schemas.microsoft.com/office/word/2018/wordml" xmlns:w16se="http://schemas.microsoft.com/office/word/2015/wordml/symex" xmlns:wpg="http://schemas.microsoft.com/office/word/2010/wordprocessingGroup" xmlns:wpi="http://schemas.microsoft.com/office/word/2010/wordprocessingInk" xmlns:wne="http://schemas.microsoft.com/office/word/2006/wordml" xmlns:wps="http://schemas.microsoft.com/office/word/2010/wordprocessingShape" mc:Ignorable="w14 w15 w16se w16cid w16 w16cex wp14">
+<w:numbering xmlns:wpc="http://schemas.microsoft.com/office/word/2010/wordprocessingCanvas" xmlns:cx="http://schemas.microsoft.com/office/drawing/2014/chartex" xmlns:cx1="http://schemas.microsoft.com/office/drawing/2015/9/8/chartex" xmlns:cx2="http://schemas.microsoft.com/office/drawing/2015/10/21/chartex" xmlns:cx3="http://schemas.microsoft.com/office/drawing/2016/5/9/chartex" xmlns:cx4="http://schemas.microsoft.com/office/drawing/2016/5/10/chartex" xmlns:cx5="http://schemas.microsoft.com/office/drawing/2016/5/11/chartex" xmlns:cx6="http://schemas.microsoft.com/office/drawing/2016/5/12/chartex" xmlns:cx7="http://schemas.microsoft.com/office/drawing/2016/5/13/chartex" xmlns:cx8="http://schemas.microsoft.com/office/drawing/2016/5/14/chartex" xmlns:mc="http://schemas.openxmlformats.org/markup-compatibility/2006" xmlns:aink="http://schemas.microsoft.com/office/drawing/2016/ink" xmlns:am3d="http://schemas.microsoft.com/office/drawing/2017/model3d" xmlns:o="urn:schemas-microsoft-com:office:office" xmlns:oel="http://schemas.microsoft.com/office/2019/extlst" xmlns:r="http://schemas.openxmlformats.org/officeDocument/2006/relationships" xmlns:m="http://schemas.openxmlformats.org/officeDocument/2006/math" xmlns:v="urn:schemas-microsoft-com:vml" xmlns:wp14="http://schemas.microsoft.com/office/word/2010/wordprocessingDrawing" xmlns:wp="http://schemas.openxmlformats.org/drawingml/2006/wordprocessingDrawing" xmlns:w10="urn:schemas-microsoft-com:office:word" xmlns:w="http://schemas.openxmlformats.org/wordprocessingml/2006/main" xmlns:w14="http://schemas.microsoft.com/office/word/2010/wordml" xmlns:w15="http://schemas.microsoft.com/office/word/2012/wordml" xmlns:w16cei="http://schemas.microsoft.com/office/word/2026/wordml/cei" xmlns:w16cex="http://schemas.microsoft.com/office/word/2018/wordml/cex" xmlns:w16cid="http://schemas.microsoft.com/office/word/2016/wordml/cid" xmlns:w16="http://schemas.microsoft.com/office/word/2018/wordml" xmlns:w16du="http://schemas.microsoft.com/office/word/2023/wordml/word16du" xmlns:w16sdtdh="http://schemas.microsoft.com/office/word/2020/wordml/sdtdatahash" xmlns:w16sdtfl="http://schemas.microsoft.com/office/word/2024/wordml/sdtformatlock" xmlns:w16se="http://schemas.microsoft.com/office/word/2015/wordml/symex" xmlns:wpg="http://schemas.microsoft.com/office/word/2010/wordprocessingGroup" xmlns:wpi="http://schemas.microsoft.com/office/word/2010/wordprocessingInk" xmlns:wne="http://schemas.microsoft.com/office/word/2006/wordml" xmlns:wps="http://schemas.microsoft.com/office/word/2010/wordprocessingShape" mc:Ignorable="w14 w15 w16se w16cid w16 w16cex w16sdtdh w16sdtfl w16du wp14">
   <w:abstractNum w:abstractNumId="0" w15:restartNumberingAfterBreak="0">
     <w:nsid w:val="325D5591"/>
     <w:multiLevelType w:val="hybridMultilevel"/>
@@ -3928,41 +3920,41 @@
       </w:rPr>
     </w:lvl>
   </w:abstractNum>
-  <w:num w:numId="1">
+  <w:num w:numId="1" w16cid:durableId="646864493">
     <w:abstractNumId w:val="4"/>
   </w:num>
-  <w:num w:numId="2">
+  <w:num w:numId="2" w16cid:durableId="331953770">
     <w:abstractNumId w:val="9"/>
   </w:num>
-  <w:num w:numId="3">
+  <w:num w:numId="3" w16cid:durableId="145632147">
     <w:abstractNumId w:val="2"/>
   </w:num>
-  <w:num w:numId="4">
+  <w:num w:numId="4" w16cid:durableId="2133865061">
     <w:abstractNumId w:val="8"/>
   </w:num>
-  <w:num w:numId="5">
+  <w:num w:numId="5" w16cid:durableId="514153434">
     <w:abstractNumId w:val="7"/>
   </w:num>
-  <w:num w:numId="6">
+  <w:num w:numId="6" w16cid:durableId="783111646">
     <w:abstractNumId w:val="1"/>
   </w:num>
-  <w:num w:numId="7">
+  <w:num w:numId="7" w16cid:durableId="395125123">
     <w:abstractNumId w:val="0"/>
   </w:num>
-  <w:num w:numId="8">
+  <w:num w:numId="8" w16cid:durableId="128868658">
     <w:abstractNumId w:val="6"/>
   </w:num>
-  <w:num w:numId="9">
+  <w:num w:numId="9" w16cid:durableId="1172570529">
     <w:abstractNumId w:val="5"/>
   </w:num>
-  <w:num w:numId="10">
+  <w:num w:numId="10" w16cid:durableId="200634400">
     <w:abstractNumId w:val="3"/>
   </w:num>
 </w:numbering>
 </file>
 
 <file path=word/styles.xml><?xml version="1.0" encoding="utf-8"?>
-<w:styles xmlns:mc="http://schemas.openxmlformats.org/markup-compatibility/2006" xmlns:r="http://schemas.openxmlformats.org/officeDocument/2006/relationships" xmlns:w="http://schemas.openxmlformats.org/wordprocessingml/2006/main" xmlns:w14="http://schemas.microsoft.com/office/word/2010/wordml" xmlns:w15="http://schemas.microsoft.com/office/word/2012/wordml" xmlns:w16cex="http://schemas.microsoft.com/office/word/2018/wordml/cex" xmlns:w16cid="http://schemas.microsoft.com/office/word/2016/wordml/cid" xmlns:w16="http://schemas.microsoft.com/office/word/2018/wordml" xmlns:w16se="http://schemas.microsoft.com/office/word/2015/wordml/symex" mc:Ignorable="w14 w15 w16se w16cid w16 w16cex">
+<w:styles xmlns:mc="http://schemas.openxmlformats.org/markup-compatibility/2006" xmlns:r="http://schemas.openxmlformats.org/officeDocument/2006/relationships" xmlns:w="http://schemas.openxmlformats.org/wordprocessingml/2006/main" xmlns:w14="http://schemas.microsoft.com/office/word/2010/wordml" xmlns:w15="http://schemas.microsoft.com/office/word/2012/wordml" xmlns:w16cex="http://schemas.microsoft.com/office/word/2018/wordml/cex" xmlns:w16cid="http://schemas.microsoft.com/office/word/2016/wordml/cid" xmlns:w16="http://schemas.microsoft.com/office/word/2018/wordml" xmlns:w16du="http://schemas.microsoft.com/office/word/2023/wordml/word16du" xmlns:w16sdtdh="http://schemas.microsoft.com/office/word/2020/wordml/sdtdatahash" xmlns:w16sdtfl="http://schemas.microsoft.com/office/word/2024/wordml/sdtformatlock" xmlns:w16se="http://schemas.microsoft.com/office/word/2015/wordml/symex" mc:Ignorable="w14 w15 w16se w16cid w16 w16cex w16sdtdh w16sdtfl w16du">
   <w:docDefaults>
     <w:rPrDefault>
       <w:rPr>

</xml_diff>

<commit_message>
correccion entrega1 y cambios formato
</commit_message>
<xml_diff>
--- a/TPI-ASI-2026.docx
+++ b/TPI-ASI-2026.docx
@@ -1,6 +1,6 @@
 
 <file path=word/document.xml><?xml version="1.0" encoding="utf-8"?>
-<w:document xmlns:wpc="http://schemas.microsoft.com/office/word/2010/wordprocessingCanvas" xmlns:cx="http://schemas.microsoft.com/office/drawing/2014/chartex" xmlns:cx1="http://schemas.microsoft.com/office/drawing/2015/9/8/chartex" xmlns:cx2="http://schemas.microsoft.com/office/drawing/2015/10/21/chartex" xmlns:cx3="http://schemas.microsoft.com/office/drawing/2016/5/9/chartex" xmlns:cx4="http://schemas.microsoft.com/office/drawing/2016/5/10/chartex" xmlns:cx5="http://schemas.microsoft.com/office/drawing/2016/5/11/chartex" xmlns:cx6="http://schemas.microsoft.com/office/drawing/2016/5/12/chartex" xmlns:cx7="http://schemas.microsoft.com/office/drawing/2016/5/13/chartex" xmlns:cx8="http://schemas.microsoft.com/office/drawing/2016/5/14/chartex" xmlns:mc="http://schemas.openxmlformats.org/markup-compatibility/2006" xmlns:aink="http://schemas.microsoft.com/office/drawing/2016/ink" xmlns:am3d="http://schemas.microsoft.com/office/drawing/2017/model3d" xmlns:o="urn:schemas-microsoft-com:office:office" xmlns:oel="http://schemas.microsoft.com/office/2019/extlst" xmlns:r="http://schemas.openxmlformats.org/officeDocument/2006/relationships" xmlns:m="http://schemas.openxmlformats.org/officeDocument/2006/math" xmlns:v="urn:schemas-microsoft-com:vml" xmlns:wp14="http://schemas.microsoft.com/office/word/2010/wordprocessingDrawing" xmlns:wp="http://schemas.openxmlformats.org/drawingml/2006/wordprocessingDrawing" xmlns:w10="urn:schemas-microsoft-com:office:word" xmlns:w="http://schemas.openxmlformats.org/wordprocessingml/2006/main" xmlns:w14="http://schemas.microsoft.com/office/word/2010/wordml" xmlns:w15="http://schemas.microsoft.com/office/word/2012/wordml" xmlns:w16cei="http://schemas.microsoft.com/office/word/2026/wordml/cei" xmlns:w16cex="http://schemas.microsoft.com/office/word/2018/wordml/cex" xmlns:w16cid="http://schemas.microsoft.com/office/word/2016/wordml/cid" xmlns:w16="http://schemas.microsoft.com/office/word/2018/wordml" xmlns:w16du="http://schemas.microsoft.com/office/word/2023/wordml/word16du" xmlns:w16sdtdh="http://schemas.microsoft.com/office/word/2020/wordml/sdtdatahash" xmlns:w16sdtfl="http://schemas.microsoft.com/office/word/2024/wordml/sdtformatlock" xmlns:w16se="http://schemas.microsoft.com/office/word/2015/wordml/symex" xmlns:wpg="http://schemas.microsoft.com/office/word/2010/wordprocessingGroup" xmlns:wpi="http://schemas.microsoft.com/office/word/2010/wordprocessingInk" xmlns:wne="http://schemas.microsoft.com/office/word/2006/wordml" xmlns:wps="http://schemas.microsoft.com/office/word/2010/wordprocessingShape" mc:Ignorable="w14 w15 w16se w16cid w16 w16cex w16sdtdh w16sdtfl w16du wp14">
+<w:document xmlns:wpc="http://schemas.microsoft.com/office/word/2010/wordprocessingCanvas" xmlns:cx="http://schemas.microsoft.com/office/drawing/2014/chartex" xmlns:cx1="http://schemas.microsoft.com/office/drawing/2015/9/8/chartex" xmlns:cx2="http://schemas.microsoft.com/office/drawing/2015/10/21/chartex" xmlns:cx3="http://schemas.microsoft.com/office/drawing/2016/5/9/chartex" xmlns:cx4="http://schemas.microsoft.com/office/drawing/2016/5/10/chartex" xmlns:cx5="http://schemas.microsoft.com/office/drawing/2016/5/11/chartex" xmlns:cx6="http://schemas.microsoft.com/office/drawing/2016/5/12/chartex" xmlns:cx7="http://schemas.microsoft.com/office/drawing/2016/5/13/chartex" xmlns:cx8="http://schemas.microsoft.com/office/drawing/2016/5/14/chartex" xmlns:mc="http://schemas.openxmlformats.org/markup-compatibility/2006" xmlns:aink="http://schemas.microsoft.com/office/drawing/2016/ink" xmlns:am3d="http://schemas.microsoft.com/office/drawing/2017/model3d" xmlns:o="urn:schemas-microsoft-com:office:office" xmlns:oel="http://schemas.microsoft.com/office/2019/extlst" xmlns:r="http://schemas.openxmlformats.org/officeDocument/2006/relationships" xmlns:m="http://schemas.openxmlformats.org/officeDocument/2006/math" xmlns:v="urn:schemas-microsoft-com:vml" xmlns:wp14="http://schemas.microsoft.com/office/word/2010/wordprocessingDrawing" xmlns:wp="http://schemas.openxmlformats.org/drawingml/2006/wordprocessingDrawing" xmlns:w10="urn:schemas-microsoft-com:office:word" xmlns:w="http://schemas.openxmlformats.org/wordprocessingml/2006/main" xmlns:w14="http://schemas.microsoft.com/office/word/2010/wordml" xmlns:w15="http://schemas.microsoft.com/office/word/2012/wordml" xmlns:w16cex="http://schemas.microsoft.com/office/word/2018/wordml/cex" xmlns:w16cid="http://schemas.microsoft.com/office/word/2016/wordml/cid" xmlns:w16="http://schemas.microsoft.com/office/word/2018/wordml" xmlns:w16du="http://schemas.microsoft.com/office/word/2023/wordml/word16du" xmlns:w16sdtdh="http://schemas.microsoft.com/office/word/2020/wordml/sdtdatahash" xmlns:w16sdtfl="http://schemas.microsoft.com/office/word/2024/wordml/sdtformatlock" xmlns:w16se="http://schemas.microsoft.com/office/word/2015/wordml/symex" xmlns:wpg="http://schemas.microsoft.com/office/word/2010/wordprocessingGroup" xmlns:wpi="http://schemas.microsoft.com/office/word/2010/wordprocessingInk" xmlns:wne="http://schemas.microsoft.com/office/word/2006/wordml" xmlns:wps="http://schemas.microsoft.com/office/word/2010/wordprocessingShape" mc:Ignorable="w14 w15 w16se w16cid w16 w16cex w16sdtdh w16sdtfl w16du wp14">
   <w:body>
     <w:p>
       <w:pPr>
@@ -400,7 +400,21 @@
           <w:lang w:val="pt-BR" w:eastAsia="es-AR"/>
           <w14:ligatures w14:val="none"/>
         </w:rPr>
-        <w:t>ENTREGA Nº1</w:t>
+        <w:t>ENTREGA Nº</w:t>
+      </w:r>
+      <w:r>
+        <w:rPr>
+          <w:rFonts w:ascii="Arial" w:eastAsia="Times New Roman" w:hAnsi="Arial" w:cs="Arial"/>
+          <w:b/>
+          <w:bCs/>
+          <w:color w:val="000000"/>
+          <w:kern w:val="0"/>
+          <w:sz w:val="24"/>
+          <w:szCs w:val="24"/>
+          <w:lang w:val="pt-BR" w:eastAsia="es-AR"/>
+          <w14:ligatures w14:val="none"/>
+        </w:rPr>
+        <w:t>2</w:t>
       </w:r>
     </w:p>
     <w:p>
@@ -828,6 +842,7 @@
         </w:rPr>
         <w:t xml:space="preserve">, </w:t>
       </w:r>
+      <w:proofErr w:type="gramStart"/>
       <w:r>
         <w:rPr>
           <w:rFonts w:ascii="Arial" w:eastAsia="Times New Roman" w:hAnsi="Arial" w:cs="Arial"/>
@@ -840,6 +855,7 @@
         </w:rPr>
         <w:t>Abril</w:t>
       </w:r>
+      <w:proofErr w:type="gramEnd"/>
       <w:r>
         <w:rPr>
           <w:rFonts w:ascii="Arial" w:eastAsia="Times New Roman" w:hAnsi="Arial" w:cs="Arial"/>
@@ -1179,7 +1195,7 @@
         <w:rPr>
           <w:color w:val="767171" w:themeColor="background2" w:themeShade="80"/>
         </w:rPr>
-        <w:t>9</w:t>
+        <w:t>17</w:t>
       </w:r>
       <w:r>
         <w:rPr>
@@ -1191,7 +1207,7 @@
         <w:rPr>
           <w:color w:val="767171" w:themeColor="background2" w:themeShade="80"/>
         </w:rPr>
-        <w:t>junio</w:t>
+        <w:t>agosto</w:t>
       </w:r>
       <w:r>
         <w:rPr>
@@ -1208,7 +1224,9 @@
     </w:p>
     <w:p>
       <w:pPr>
-        <w:rPr>
+        <w:jc w:val="both"/>
+        <w:rPr>
+          <w:rFonts w:cstheme="minorHAnsi"/>
           <w:b/>
           <w:bCs/>
           <w:sz w:val="24"/>
@@ -1218,6 +1236,7 @@
       </w:pPr>
       <w:r>
         <w:rPr>
+          <w:rFonts w:cstheme="minorHAnsi"/>
           <w:b/>
           <w:bCs/>
           <w:sz w:val="24"/>
@@ -1230,21 +1249,30 @@
     </w:p>
     <w:p>
       <w:pPr>
-        <w:rPr>
+        <w:jc w:val="both"/>
+        <w:rPr>
+          <w:rFonts w:cstheme="minorHAnsi"/>
           <w:i/>
           <w:iCs/>
           <w:u w:val="single"/>
         </w:rPr>
       </w:pPr>
       <w:r>
+        <w:rPr>
+          <w:rFonts w:cstheme="minorHAnsi"/>
+        </w:rPr>
         <w:t>Nombre:</w:t>
       </w:r>
       <w:r>
+        <w:rPr>
+          <w:rFonts w:cstheme="minorHAnsi"/>
+        </w:rPr>
         <w:t xml:space="preserve"> </w:t>
       </w:r>
       <w:proofErr w:type="spellStart"/>
       <w:r>
         <w:rPr>
+          <w:rFonts w:cstheme="minorHAnsi"/>
           <w:i/>
           <w:iCs/>
           <w:u w:val="single"/>
@@ -1254,6 +1282,7 @@
       <w:proofErr w:type="spellEnd"/>
       <w:r>
         <w:rPr>
+          <w:rFonts w:cstheme="minorHAnsi"/>
           <w:i/>
           <w:iCs/>
           <w:u w:val="single"/>
@@ -1263,6 +1292,7 @@
       <w:proofErr w:type="spellStart"/>
       <w:r>
         <w:rPr>
+          <w:rFonts w:cstheme="minorHAnsi"/>
           <w:i/>
           <w:iCs/>
           <w:u w:val="single"/>
@@ -1272,51 +1302,82 @@
       <w:proofErr w:type="spellEnd"/>
     </w:p>
     <w:p>
-      <w:r>
+      <w:pPr>
+        <w:jc w:val="both"/>
+        <w:rPr>
+          <w:rFonts w:cstheme="minorHAnsi"/>
+        </w:rPr>
+      </w:pPr>
+      <w:r>
+        <w:rPr>
+          <w:rFonts w:cstheme="minorHAnsi"/>
+        </w:rPr>
         <w:t>Presentación:</w:t>
       </w:r>
       <w:r>
-        <w:t xml:space="preserve"> </w:t>
-      </w:r>
-      <w:r>
-        <w:t>"Tu paz, organizada"</w:t>
-      </w:r>
-      <w:r>
-        <w:t xml:space="preserve">. </w:t>
-      </w:r>
-      <w:r>
-        <w:t xml:space="preserve">Somos una empresa de tecnología enfocada en el sector del bienestar. Desarrollamos </w:t>
+        <w:rPr>
+          <w:rFonts w:cstheme="minorHAnsi"/>
+        </w:rPr>
+        <w:t xml:space="preserve"> "Tu paz, organizada". Somos una empresa de tecnología enfocada en el sector del bienestar. Desarrollamos </w:t>
       </w:r>
       <w:proofErr w:type="spellStart"/>
       <w:r>
+        <w:rPr>
+          <w:rFonts w:cstheme="minorHAnsi"/>
+        </w:rPr>
         <w:t>ZenTrack</w:t>
       </w:r>
       <w:proofErr w:type="spellEnd"/>
       <w:r>
+        <w:rPr>
+          <w:rFonts w:cstheme="minorHAnsi"/>
+        </w:rPr>
         <w:t>, la aplicación móvil que transforma la forma en que las personas planifican su asistencia a retiros espirituales y de naturaleza.</w:t>
       </w:r>
     </w:p>
     <w:p>
-      <w:r>
+      <w:pPr>
+        <w:jc w:val="both"/>
+        <w:rPr>
+          <w:rFonts w:cstheme="minorHAnsi"/>
+        </w:rPr>
+      </w:pPr>
+      <w:r>
+        <w:rPr>
+          <w:rFonts w:cstheme="minorHAnsi"/>
+        </w:rPr>
         <w:t xml:space="preserve">Nuestro Producto: </w:t>
       </w:r>
       <w:proofErr w:type="spellStart"/>
       <w:r>
+        <w:rPr>
+          <w:rFonts w:cstheme="minorHAnsi"/>
+        </w:rPr>
         <w:t>ZenTrack</w:t>
       </w:r>
       <w:proofErr w:type="spellEnd"/>
       <w:r>
+        <w:rPr>
+          <w:rFonts w:cstheme="minorHAnsi"/>
+        </w:rPr>
         <w:t xml:space="preserve"> es un asistente digital diseñado para centralizar información dispersa de redes sociales. Con </w:t>
       </w:r>
       <w:proofErr w:type="spellStart"/>
       <w:r>
+        <w:rPr>
+          <w:rFonts w:cstheme="minorHAnsi"/>
+        </w:rPr>
         <w:t>ZenTrack</w:t>
       </w:r>
       <w:proofErr w:type="spellEnd"/>
       <w:r>
+        <w:rPr>
+          <w:rFonts w:cstheme="minorHAnsi"/>
+        </w:rPr>
         <w:t>, eliminamos el error humano y la pérdida de información en planillas manuales.</w:t>
       </w:r>
     </w:p>
+    <w:p/>
     <w:p>
       <w:r>
         <w:t>Logotipo:</w:t>
@@ -1333,9 +1394,25 @@
           <w:color w:val="000000"/>
         </w:rPr>
         <w:drawing>
-          <wp:inline distT="0" distB="0" distL="0" distR="0" wp14:anchorId="3B7AD8FF" wp14:editId="72E37BA9">
-            <wp:extent cx="3924725" cy="3105150"/>
-            <wp:effectExtent l="0" t="0" r="0" b="0"/>
+          <wp:anchor distT="0" distB="0" distL="114300" distR="114300" simplePos="0" relativeHeight="251665408" behindDoc="1" locked="0" layoutInCell="1" allowOverlap="1" wp14:anchorId="3B7AD8FF" wp14:editId="3C5F9FBB">
+            <wp:simplePos x="0" y="0"/>
+            <wp:positionH relativeFrom="column">
+              <wp:posOffset>984885</wp:posOffset>
+            </wp:positionH>
+            <wp:positionV relativeFrom="paragraph">
+              <wp:posOffset>43180</wp:posOffset>
+            </wp:positionV>
+            <wp:extent cx="3240405" cy="2563495"/>
+            <wp:effectExtent l="0" t="0" r="0" b="8255"/>
+            <wp:wrapTight wrapText="bothSides">
+              <wp:wrapPolygon edited="0">
+                <wp:start x="0" y="0"/>
+                <wp:lineTo x="0" y="21509"/>
+                <wp:lineTo x="21460" y="21509"/>
+                <wp:lineTo x="21460" y="0"/>
+                <wp:lineTo x="0" y="0"/>
+              </wp:wrapPolygon>
+            </wp:wrapTight>
             <wp:docPr id="2" name="Imagen 2"/>
             <wp:cNvGraphicFramePr>
               <a:graphicFrameLocks xmlns:a="http://schemas.openxmlformats.org/drawingml/2006/main" noChangeAspect="1"/>
@@ -1363,7 +1440,7 @@
                   <pic:spPr bwMode="auto">
                     <a:xfrm>
                       <a:off x="0" y="0"/>
-                      <a:ext cx="3931117" cy="3110207"/>
+                      <a:ext cx="3240405" cy="2563495"/>
                     </a:xfrm>
                     <a:prstGeom prst="rect">
                       <a:avLst/>
@@ -1381,7 +1458,13 @@
                 </pic:pic>
               </a:graphicData>
             </a:graphic>
-          </wp:inline>
+            <wp14:sizeRelH relativeFrom="margin">
+              <wp14:pctWidth>0</wp14:pctWidth>
+            </wp14:sizeRelH>
+            <wp14:sizeRelV relativeFrom="margin">
+              <wp14:pctHeight>0</wp14:pctHeight>
+            </wp14:sizeRelV>
+          </wp:anchor>
         </w:drawing>
       </w:r>
     </w:p>
@@ -1395,7 +1478,9 @@
           <w:u w:val="single"/>
         </w:rPr>
       </w:pPr>
-      <w:r>
+    </w:p>
+    <w:p>
+      <w:pPr>
         <w:rPr>
           <w:b/>
           <w:bCs/>
@@ -1403,8 +1488,7 @@
           <w:szCs w:val="24"/>
           <w:u w:val="single"/>
         </w:rPr>
-        <w:br w:type="page"/>
-      </w:r>
+      </w:pPr>
     </w:p>
     <w:p>
       <w:pPr>
@@ -1416,7 +1500,9 @@
           <w:u w:val="single"/>
         </w:rPr>
       </w:pPr>
-      <w:r>
+    </w:p>
+    <w:p>
+      <w:pPr>
         <w:rPr>
           <w:b/>
           <w:bCs/>
@@ -1424,27 +1510,103 @@
           <w:szCs w:val="24"/>
           <w:u w:val="single"/>
         </w:rPr>
-        <w:lastRenderedPageBreak/>
-        <w:t>Enunciado del caso</w:t>
-      </w:r>
-    </w:p>
-    <w:p>
-      <w:r>
-        <w:t>Caso: Sistema de Gestión y Descubrimiento de Retiros</w:t>
-      </w:r>
-      <w:r>
-        <w:br/>
-      </w:r>
-      <w:r>
+      </w:pPr>
+    </w:p>
+    <w:p>
+      <w:pPr>
         <w:rPr>
           <w:b/>
           <w:bCs/>
+          <w:sz w:val="24"/>
+          <w:szCs w:val="24"/>
+          <w:u w:val="single"/>
+        </w:rPr>
+      </w:pPr>
+    </w:p>
+    <w:p>
+      <w:pPr>
+        <w:rPr>
+          <w:b/>
+          <w:bCs/>
+          <w:sz w:val="24"/>
+          <w:szCs w:val="24"/>
+          <w:u w:val="single"/>
+        </w:rPr>
+      </w:pPr>
+    </w:p>
+    <w:p>
+      <w:pPr>
+        <w:rPr>
+          <w:b/>
+          <w:bCs/>
+          <w:sz w:val="24"/>
+          <w:szCs w:val="24"/>
+          <w:u w:val="single"/>
+        </w:rPr>
+      </w:pPr>
+    </w:p>
+    <w:p>
+      <w:pPr>
+        <w:rPr>
+          <w:b/>
+          <w:bCs/>
+          <w:sz w:val="24"/>
+          <w:szCs w:val="24"/>
+          <w:u w:val="single"/>
+        </w:rPr>
+      </w:pPr>
+    </w:p>
+    <w:p>
+      <w:pPr>
+        <w:rPr>
+          <w:b/>
+          <w:bCs/>
+          <w:sz w:val="24"/>
+          <w:szCs w:val="24"/>
+          <w:u w:val="single"/>
+        </w:rPr>
+      </w:pPr>
+    </w:p>
+    <w:p>
+      <w:pPr>
+        <w:jc w:val="both"/>
+        <w:rPr>
+          <w:b/>
+          <w:bCs/>
+          <w:sz w:val="24"/>
+          <w:szCs w:val="24"/>
+          <w:u w:val="single"/>
+        </w:rPr>
+      </w:pPr>
+      <w:r>
+        <w:rPr>
+          <w:b/>
+          <w:bCs/>
+          <w:sz w:val="24"/>
+          <w:szCs w:val="24"/>
+          <w:u w:val="single"/>
+        </w:rPr>
+        <w:t>Enunciado del caso</w:t>
+      </w:r>
+    </w:p>
+    <w:p>
+      <w:r>
+        <w:t>Caso: Sistema de Gestión y Descubrimiento de Retiros</w:t>
+      </w:r>
+      <w:r>
+        <w:br/>
+      </w:r>
+      <w:r>
+        <w:rPr>
+          <w:b/>
+          <w:bCs/>
         </w:rPr>
         <w:t>Contexto y Descripción del Problema</w:t>
       </w:r>
     </w:p>
     <w:p>
       <w:pPr>
+        <w:ind w:firstLine="708"/>
         <w:jc w:val="both"/>
       </w:pPr>
       <w:r>
@@ -1452,6 +1614,9 @@
       </w:r>
     </w:p>
     <w:p>
+      <w:pPr>
+        <w:jc w:val="both"/>
+      </w:pPr>
       <w:r>
         <w:t>Esta modalidad de trabajo manual presenta las siguientes problemáticas:</w:t>
       </w:r>
@@ -1524,6 +1689,7 @@
     </w:p>
     <w:p>
       <w:pPr>
+        <w:jc w:val="both"/>
         <w:rPr>
           <w:b/>
           <w:bCs/>
@@ -1534,12 +1700,14 @@
           <w:b/>
           <w:bCs/>
         </w:rPr>
+        <w:lastRenderedPageBreak/>
         <w:t>Necesidad del Sistema de Información</w:t>
       </w:r>
     </w:p>
     <w:p>
       <w:pPr>
         <w:spacing w:after="0"/>
+        <w:ind w:firstLine="708"/>
         <w:jc w:val="both"/>
       </w:pPr>
       <w:r>
@@ -1567,6 +1735,10 @@
     <w:p>
       <w:pPr>
         <w:jc w:val="both"/>
+        <w:rPr>
+          <w:b/>
+          <w:bCs/>
+        </w:rPr>
       </w:pPr>
     </w:p>
     <w:p>
@@ -1574,11 +1746,17 @@
         <w:spacing w:after="0"/>
         <w:jc w:val="both"/>
         <w:rPr>
+          <w:b/>
+          <w:bCs/>
           <w:sz w:val="20"/>
           <w:szCs w:val="20"/>
         </w:rPr>
       </w:pPr>
       <w:r>
+        <w:rPr>
+          <w:b/>
+          <w:bCs/>
+        </w:rPr>
         <w:t>Objetivos del Sistema</w:t>
       </w:r>
     </w:p>
@@ -1593,16 +1771,40 @@
       </w:pPr>
       <w:r>
         <w:rPr>
+          <w:u w:val="single"/>
+        </w:rPr>
+        <w:t>Optimizar la organización</w:t>
+      </w:r>
+      <w:r>
+        <w:rPr>
           <w:b/>
           <w:bCs/>
         </w:rPr>
-        <w:t>Optimizar la organización:</w:t>
+        <w:t>:</w:t>
       </w:r>
       <w:r>
         <w:t xml:space="preserve"> </w:t>
       </w:r>
       <w:r>
-        <w:t>Centralizar la información de los retiros de interés en una única plataforma para facilitar la toma de decisiones del usuario.</w:t>
+        <w:t xml:space="preserve">Permitir al usuario </w:t>
+      </w:r>
+      <w:r>
+        <w:t xml:space="preserve">registrar </w:t>
+      </w:r>
+      <w:r>
+        <w:t>retiros</w:t>
+      </w:r>
+      <w:r>
+        <w:t xml:space="preserve"> para poder </w:t>
+      </w:r>
+      <w:r>
+        <w:t>compar</w:t>
+      </w:r>
+      <w:r>
+        <w:t>ar</w:t>
+      </w:r>
+      <w:r>
+        <w:t xml:space="preserve"> sus características clave (costos, actividades, locación).</w:t>
       </w:r>
     </w:p>
     <w:p>
@@ -1616,10 +1818,16 @@
       </w:pPr>
       <w:r>
         <w:rPr>
+          <w:u w:val="single"/>
+        </w:rPr>
+        <w:t>Garantizar el control financiero</w:t>
+      </w:r>
+      <w:r>
+        <w:rPr>
           <w:b/>
           <w:bCs/>
         </w:rPr>
-        <w:t>Garantizar el control financiero:</w:t>
+        <w:t>:</w:t>
       </w:r>
       <w:r>
         <w:t xml:space="preserve"> </w:t>
@@ -1639,10 +1847,16 @@
       </w:pPr>
       <w:r>
         <w:rPr>
+          <w:u w:val="single"/>
+        </w:rPr>
+        <w:t>Mejorar la experiencia de planificación social</w:t>
+      </w:r>
+      <w:r>
+        <w:rPr>
           <w:b/>
           <w:bCs/>
         </w:rPr>
-        <w:t>Mejorar la experiencia de planificación social:</w:t>
+        <w:t>:</w:t>
       </w:r>
       <w:r>
         <w:t xml:space="preserve"> </w:t>
@@ -1662,8 +1876,7 @@
       </w:pPr>
       <w:r>
         <w:rPr>
-          <w:b/>
-          <w:bCs/>
+          <w:u w:val="single"/>
         </w:rPr>
         <w:t>Disminuir el olvido de eventos clave:</w:t>
       </w:r>
@@ -1676,6 +1889,7 @@
     </w:p>
     <w:p>
       <w:pPr>
+        <w:jc w:val="both"/>
         <w:rPr>
           <w:sz w:val="24"/>
           <w:szCs w:val="24"/>
@@ -1684,6 +1898,7 @@
     </w:p>
     <w:p>
       <w:pPr>
+        <w:jc w:val="both"/>
         <w:rPr>
           <w:b/>
           <w:bCs/>
@@ -1700,11 +1915,210 @@
           <w:szCs w:val="24"/>
           <w:u w:val="single"/>
         </w:rPr>
-        <w:br w:type="page"/>
-      </w:r>
-    </w:p>
-    <w:p>
-      <w:pPr>
+        <w:t>Listado de requerimientos funcionales</w:t>
+      </w:r>
+    </w:p>
+    <w:p>
+      <w:pPr>
+        <w:jc w:val="both"/>
+        <w:rPr>
+          <w:u w:val="single"/>
+        </w:rPr>
+      </w:pPr>
+      <w:r>
+        <w:rPr>
+          <w:u w:val="single"/>
+        </w:rPr>
+        <w:t>Gestión de retiros</w:t>
+      </w:r>
+    </w:p>
+    <w:p>
+      <w:pPr>
+        <w:jc w:val="both"/>
+      </w:pPr>
+      <w:r>
+        <w:t xml:space="preserve">RF1: </w:t>
+      </w:r>
+      <w:r>
+        <w:t>El sistema debe permitir al usuario registrar un nuevo retiro ingresando: fecha de inicio y fin, tipo de retiro, costo estimado, organizador, vía de contacto y metodologías de pago aceptadas.</w:t>
+      </w:r>
+    </w:p>
+    <w:p>
+      <w:pPr>
+        <w:jc w:val="both"/>
+      </w:pPr>
+      <w:r>
+        <w:t xml:space="preserve">RF2: El sistema debe permitir al usuario modificar o </w:t>
+      </w:r>
+      <w:r>
+        <w:t>dar de baja</w:t>
+      </w:r>
+      <w:r>
+        <w:t xml:space="preserve"> los retiros que ya han sido agendados.</w:t>
+      </w:r>
+    </w:p>
+    <w:p>
+      <w:pPr>
+        <w:jc w:val="both"/>
+      </w:pPr>
+      <w:r>
+        <w:t xml:space="preserve">RF3:  El sistema debe permitir al usuario </w:t>
+      </w:r>
+      <w:r>
+        <w:t>consultar</w:t>
+      </w:r>
+      <w:r>
+        <w:t xml:space="preserve"> los retiros que ha agendado permitiendo aplicar filtros para la búsqueda de </w:t>
+      </w:r>
+      <w:r>
+        <w:t>retiros según estado, tipo o fecha.</w:t>
+      </w:r>
+    </w:p>
+    <w:p>
+      <w:pPr>
+        <w:jc w:val="both"/>
+        <w:rPr>
+          <w:u w:val="single"/>
+        </w:rPr>
+      </w:pPr>
+      <w:r>
+        <w:rPr>
+          <w:u w:val="single"/>
+        </w:rPr>
+        <w:t>Control de gastos</w:t>
+      </w:r>
+    </w:p>
+    <w:p>
+      <w:pPr>
+        <w:jc w:val="both"/>
+      </w:pPr>
+      <w:r>
+        <w:t>RF</w:t>
+      </w:r>
+      <w:r>
+        <w:t>4</w:t>
+      </w:r>
+      <w:r>
+        <w:t xml:space="preserve">: El sistema debe permitir al usuario registrar los pagos realizados </w:t>
+      </w:r>
+      <w:r>
+        <w:t>registrando la fecha del pago, el monto y el estado correspondiente (Seña, Pago parcial o Pago total)</w:t>
+      </w:r>
+    </w:p>
+    <w:p>
+      <w:pPr>
+        <w:jc w:val="both"/>
+      </w:pPr>
+      <w:r>
+        <w:t>RF</w:t>
+      </w:r>
+      <w:r>
+        <w:t>5</w:t>
+      </w:r>
+      <w:r>
+        <w:t xml:space="preserve">: El sistema debe permitir al usuario </w:t>
+      </w:r>
+      <w:r>
+        <w:t>consultar</w:t>
+      </w:r>
+      <w:r>
+        <w:t xml:space="preserve"> el listado de pagos realizados</w:t>
+      </w:r>
+      <w:r>
+        <w:t>.</w:t>
+      </w:r>
+    </w:p>
+    <w:p>
+      <w:pPr>
+        <w:jc w:val="both"/>
+        <w:rPr>
+          <w:u w:val="single"/>
+        </w:rPr>
+      </w:pPr>
+      <w:r>
+        <w:rPr>
+          <w:u w:val="single"/>
+        </w:rPr>
+        <w:t>Alertas</w:t>
+      </w:r>
+    </w:p>
+    <w:p>
+      <w:pPr>
+        <w:jc w:val="both"/>
+      </w:pPr>
+      <w:r>
+        <w:t>RF</w:t>
+      </w:r>
+      <w:r>
+        <w:t>6</w:t>
+      </w:r>
+      <w:r>
+        <w:t>: El sistema debe enviar notificaciones al usuario para alertar sobre la proximidad de la fecha de inicio del retiro.</w:t>
+      </w:r>
+    </w:p>
+    <w:p>
+      <w:pPr>
+        <w:jc w:val="both"/>
+      </w:pPr>
+      <w:r>
+        <w:t>RF</w:t>
+      </w:r>
+      <w:r>
+        <w:t>7</w:t>
+      </w:r>
+      <w:r>
+        <w:t xml:space="preserve">: El sistema debe enviar notificaciones al usuario para recordar las fechas </w:t>
+      </w:r>
+      <w:r>
+        <w:t>límites</w:t>
+      </w:r>
+      <w:r>
+        <w:t xml:space="preserve"> de</w:t>
+      </w:r>
+      <w:r>
+        <w:t xml:space="preserve"> los compromisos de pago (vencimiento de reserva o cuotas pendientes)</w:t>
+      </w:r>
+    </w:p>
+    <w:p>
+      <w:pPr>
+        <w:jc w:val="both"/>
+        <w:rPr>
+          <w:u w:val="single"/>
+        </w:rPr>
+      </w:pPr>
+    </w:p>
+    <w:p>
+      <w:pPr>
+        <w:jc w:val="both"/>
+      </w:pPr>
+      <w:r>
+        <w:rPr>
+          <w:u w:val="single"/>
+        </w:rPr>
+        <w:lastRenderedPageBreak/>
+        <w:t>Valoraciones</w:t>
+      </w:r>
+    </w:p>
+    <w:p>
+      <w:pPr>
+        <w:jc w:val="both"/>
+      </w:pPr>
+      <w:r>
+        <w:t>RF</w:t>
+      </w:r>
+      <w:r>
+        <w:t>8</w:t>
+      </w:r>
+      <w:r>
+        <w:t>: El sistema debe permitir al usuario realizar una valoración de los retiros que ya han sido realizados permitiendo calificar su experiencia (mediante puntuación) y guardar sus comentarios personales sobre el retiro.</w:t>
+      </w:r>
+    </w:p>
+    <w:p/>
+    <w:p>
+      <w:pPr>
+        <w:jc w:val="both"/>
+      </w:pPr>
+      <w:r>
         <w:rPr>
           <w:b/>
           <w:bCs/>
@@ -1712,197 +2126,26 @@
           <w:szCs w:val="24"/>
           <w:u w:val="single"/>
         </w:rPr>
-      </w:pPr>
-      <w:r>
-        <w:rPr>
-          <w:b/>
-          <w:bCs/>
-          <w:sz w:val="24"/>
-          <w:szCs w:val="24"/>
+        <w:t>Elicitación</w:t>
+      </w:r>
+    </w:p>
+    <w:p>
+      <w:pPr>
+        <w:jc w:val="both"/>
+        <w:rPr>
           <w:u w:val="single"/>
         </w:rPr>
-        <w:lastRenderedPageBreak/>
-        <w:t>Listado de requerimientos funcionales</w:t>
-      </w:r>
-    </w:p>
-    <w:p>
-      <w:pPr>
+      </w:pPr>
+      <w:r>
         <w:rPr>
           <w:u w:val="single"/>
         </w:rPr>
-      </w:pPr>
-      <w:r>
-        <w:rPr>
-          <w:u w:val="single"/>
-        </w:rPr>
-        <w:t>Gestión de retiros</w:t>
-      </w:r>
-    </w:p>
-    <w:p>
-      <w:r>
-        <w:t xml:space="preserve">RF1: </w:t>
-      </w:r>
-      <w:r>
-        <w:t>El sistema debe permitir al usuario registrar un nuevo retiro ingresando: fecha de inicio y fin, tipo de retiro, costo estimado, organizador, vía de contacto y metodologías de pago aceptadas.</w:t>
-      </w:r>
-    </w:p>
-    <w:p>
-      <w:r>
-        <w:t xml:space="preserve">RF2: El sistema debe permitir al usuario modificar o </w:t>
-      </w:r>
-      <w:r>
-        <w:t>dar de baja</w:t>
-      </w:r>
-      <w:r>
-        <w:t xml:space="preserve"> los retiros que ya han sido agendados.</w:t>
-      </w:r>
-    </w:p>
-    <w:p>
-      <w:r>
-        <w:t xml:space="preserve">RF3:  El sistema debe permitir al usuario </w:t>
-      </w:r>
-      <w:r>
-        <w:t>consultar</w:t>
-      </w:r>
-      <w:r>
-        <w:t xml:space="preserve"> los retiros que ha agendado permitiendo aplicar filtros para la búsqueda de </w:t>
-      </w:r>
-      <w:r>
-        <w:t>retiros según estado, tipo o fecha.</w:t>
-      </w:r>
-    </w:p>
-    <w:p>
-      <w:pPr>
-        <w:rPr>
-          <w:u w:val="single"/>
-        </w:rPr>
-      </w:pPr>
-      <w:r>
-        <w:rPr>
-          <w:u w:val="single"/>
-        </w:rPr>
-        <w:t>Control de gastos</w:t>
-      </w:r>
-    </w:p>
-    <w:p>
-      <w:r>
-        <w:t>RF</w:t>
-      </w:r>
-      <w:r>
-        <w:t>4</w:t>
-      </w:r>
-      <w:r>
-        <w:t xml:space="preserve">: El sistema debe permitir al usuario registrar los pagos realizados </w:t>
-      </w:r>
-      <w:r>
-        <w:t>registrando la fecha del pago, el monto y el estado correspondiente (Seña, Pago parcial o Pago total)</w:t>
-      </w:r>
-    </w:p>
-    <w:p>
-      <w:r>
-        <w:t>RF</w:t>
-      </w:r>
-      <w:r>
-        <w:t>5</w:t>
-      </w:r>
-      <w:r>
-        <w:t>: El sistema debe permitir al usuario visualizar el listado de pagos realizados y calcular el monto total gastado en retiros filtrando por un rango de fechas determinado.</w:t>
-      </w:r>
-    </w:p>
-    <w:p>
-      <w:pPr>
-        <w:rPr>
-          <w:u w:val="single"/>
-        </w:rPr>
-      </w:pPr>
-      <w:r>
-        <w:rPr>
-          <w:u w:val="single"/>
-        </w:rPr>
-        <w:t>Alertas</w:t>
-      </w:r>
-    </w:p>
-    <w:p>
-      <w:r>
-        <w:t>RF</w:t>
-      </w:r>
-      <w:r>
-        <w:t>6</w:t>
-      </w:r>
-      <w:r>
-        <w:t>: El sistema debe enviar notificaciones al usuario para alertar sobre la proximidad de la fecha de inicio del retiro.</w:t>
-      </w:r>
-    </w:p>
-    <w:p>
-      <w:r>
-        <w:t>RF</w:t>
-      </w:r>
-      <w:r>
-        <w:t>7</w:t>
-      </w:r>
-      <w:r>
-        <w:t xml:space="preserve">: El sistema debe enviar notificaciones al usuario para recordar las fechas </w:t>
-      </w:r>
-      <w:r>
-        <w:t>límites</w:t>
-      </w:r>
-      <w:r>
-        <w:t xml:space="preserve"> de</w:t>
-      </w:r>
-      <w:r>
-        <w:t xml:space="preserve"> los compromisos de pago (vencimiento de reserva o cuotas pendientes)</w:t>
-      </w:r>
-    </w:p>
-    <w:p>
-      <w:r>
-        <w:rPr>
-          <w:u w:val="single"/>
-        </w:rPr>
-        <w:t>Valoraciones</w:t>
-      </w:r>
-    </w:p>
-    <w:p>
-      <w:r>
-        <w:t>RF</w:t>
-      </w:r>
-      <w:r>
-        <w:t>8</w:t>
-      </w:r>
-      <w:r>
-        <w:t>: El sistema debe permitir al usuario realizar una valoración de los retiros que ya han sido realizados permitiendo calificar su experiencia (mediante puntuación) y guardar sus comentarios personales sobre el retiro.</w:t>
-      </w:r>
-    </w:p>
-    <w:p>
-      <w:r>
-        <w:br w:type="page"/>
-      </w:r>
-      <w:r>
-        <w:rPr>
-          <w:b/>
-          <w:bCs/>
-          <w:sz w:val="24"/>
-          <w:szCs w:val="24"/>
-          <w:u w:val="single"/>
-        </w:rPr>
-        <w:lastRenderedPageBreak/>
-        <w:t>Elicitación</w:t>
-      </w:r>
-    </w:p>
-    <w:p>
-      <w:pPr>
-        <w:rPr>
-          <w:u w:val="single"/>
-        </w:rPr>
-      </w:pPr>
-      <w:r>
-        <w:rPr>
-          <w:u w:val="single"/>
-        </w:rPr>
         <w:t>Análisis de páginas web de retiros</w:t>
       </w:r>
     </w:p>
     <w:p>
       <w:pPr>
+        <w:jc w:val="both"/>
         <w:rPr>
           <w:lang w:val="en-US"/>
         </w:rPr>
@@ -1925,9 +2168,7 @@
     </w:p>
     <w:p>
       <w:pPr>
-        <w:rPr>
-          <w:lang w:val="en-US"/>
-        </w:rPr>
+        <w:jc w:val="both"/>
       </w:pPr>
       <w:r>
         <w:rPr>
@@ -1935,9 +2176,25 @@
           <w:lang w:val="en-US"/>
         </w:rPr>
         <w:drawing>
-          <wp:inline distT="0" distB="0" distL="0" distR="0" wp14:anchorId="48E73D54" wp14:editId="6A28AE1C">
-            <wp:extent cx="5400040" cy="2698115"/>
-            <wp:effectExtent l="0" t="0" r="0" b="6985"/>
+          <wp:anchor distT="0" distB="0" distL="114300" distR="114300" simplePos="0" relativeHeight="251660288" behindDoc="1" locked="0" layoutInCell="1" allowOverlap="1" wp14:anchorId="48E73D54" wp14:editId="30D02672">
+            <wp:simplePos x="0" y="0"/>
+            <wp:positionH relativeFrom="column">
+              <wp:posOffset>641985</wp:posOffset>
+            </wp:positionH>
+            <wp:positionV relativeFrom="page">
+              <wp:posOffset>3276600</wp:posOffset>
+            </wp:positionV>
+            <wp:extent cx="4411345" cy="2204085"/>
+            <wp:effectExtent l="0" t="0" r="8255" b="5715"/>
+            <wp:wrapTight wrapText="bothSides">
+              <wp:wrapPolygon edited="0">
+                <wp:start x="0" y="0"/>
+                <wp:lineTo x="0" y="21469"/>
+                <wp:lineTo x="21547" y="21469"/>
+                <wp:lineTo x="21547" y="0"/>
+                <wp:lineTo x="0" y="0"/>
+              </wp:wrapPolygon>
+            </wp:wrapTight>
             <wp:docPr id="4" name="Imagen 4"/>
             <wp:cNvGraphicFramePr>
               <a:graphicFrameLocks xmlns:a="http://schemas.openxmlformats.org/drawingml/2006/main" noChangeAspect="1"/>
@@ -1950,517 +2207,7 @@
                     <pic:cNvPicPr/>
                   </pic:nvPicPr>
                   <pic:blipFill>
-                    <a:blip r:embed="rId9"/>
-                    <a:stretch>
-                      <a:fillRect/>
-                    </a:stretch>
-                  </pic:blipFill>
-                  <pic:spPr>
-                    <a:xfrm>
-                      <a:off x="0" y="0"/>
-                      <a:ext cx="5400040" cy="2698115"/>
-                    </a:xfrm>
-                    <a:prstGeom prst="rect">
-                      <a:avLst/>
-                    </a:prstGeom>
-                  </pic:spPr>
-                </pic:pic>
-              </a:graphicData>
-            </a:graphic>
-          </wp:inline>
-        </w:drawing>
-      </w:r>
-    </w:p>
-    <w:p>
-      <w:r>
-        <w:t>Información relevada:</w:t>
-      </w:r>
-    </w:p>
-    <w:p>
-      <w:pPr>
-        <w:numPr>
-          <w:ilvl w:val="0"/>
-          <w:numId w:val="6"/>
-        </w:numPr>
-      </w:pPr>
-      <w:r>
-        <w:t>Existencia de múltiples retiros con distintas temáticas.</w:t>
-      </w:r>
-    </w:p>
-    <w:p>
-      <w:pPr>
-        <w:numPr>
-          <w:ilvl w:val="0"/>
-          <w:numId w:val="6"/>
-        </w:numPr>
-      </w:pPr>
-      <w:r>
-        <w:t>Información relevante para los usuarios: ubicación, fechas, duración, costos y actividades.</w:t>
-      </w:r>
-    </w:p>
-    <w:p>
-      <w:pPr>
-        <w:numPr>
-          <w:ilvl w:val="0"/>
-          <w:numId w:val="6"/>
-        </w:numPr>
-      </w:pPr>
-      <w:r>
-        <w:t>Necesidad de contar con una herramienta que centralice la información obtenida desde diferentes sitios web.</w:t>
-      </w:r>
-    </w:p>
-    <w:p>
-      <w:pPr>
-        <w:numPr>
-          <w:ilvl w:val="0"/>
-          <w:numId w:val="6"/>
-        </w:numPr>
-      </w:pPr>
-      <w:r>
-        <w:t>Base para los requerimientos RF1, RF3 y RF4.</w:t>
-      </w:r>
-    </w:p>
-    <w:p>
-      <w:r>
-        <w:t xml:space="preserve">Link: </w:t>
-      </w:r>
-      <w:hyperlink r:id="rId10" w:history="1">
-        <w:r>
-          <w:rPr>
-            <w:rStyle w:val="Hipervnculo"/>
-          </w:rPr>
-          <w:t>https://www.caminosalser.com/i64-retiro-espiritual-de-caminos-al-ser-en-capilla-del-monte-cordoba-argentina/?utm_source=chatgpt.com</w:t>
-        </w:r>
-      </w:hyperlink>
-    </w:p>
-    <w:p>
-      <w:pPr>
-        <w:rPr>
-          <w:lang w:val="en-US"/>
-        </w:rPr>
-      </w:pPr>
-      <w:r>
-        <w:rPr>
-          <w:noProof/>
-          <w:lang w:val="en-US"/>
-        </w:rPr>
-        <w:drawing>
-          <wp:inline distT="0" distB="0" distL="0" distR="0" wp14:anchorId="35AC45E8" wp14:editId="2D02B80A">
-            <wp:extent cx="5400040" cy="2692400"/>
-            <wp:effectExtent l="0" t="0" r="0" b="0"/>
-            <wp:docPr id="5" name="Imagen 5"/>
-            <wp:cNvGraphicFramePr>
-              <a:graphicFrameLocks xmlns:a="http://schemas.openxmlformats.org/drawingml/2006/main" noChangeAspect="1"/>
-            </wp:cNvGraphicFramePr>
-            <a:graphic xmlns:a="http://schemas.openxmlformats.org/drawingml/2006/main">
-              <a:graphicData uri="http://schemas.openxmlformats.org/drawingml/2006/picture">
-                <pic:pic xmlns:pic="http://schemas.openxmlformats.org/drawingml/2006/picture">
-                  <pic:nvPicPr>
-                    <pic:cNvPr id="1" name=""/>
-                    <pic:cNvPicPr/>
-                  </pic:nvPicPr>
-                  <pic:blipFill>
-                    <a:blip r:embed="rId11"/>
-                    <a:stretch>
-                      <a:fillRect/>
-                    </a:stretch>
-                  </pic:blipFill>
-                  <pic:spPr>
-                    <a:xfrm>
-                      <a:off x="0" y="0"/>
-                      <a:ext cx="5400040" cy="2692400"/>
-                    </a:xfrm>
-                    <a:prstGeom prst="rect">
-                      <a:avLst/>
-                    </a:prstGeom>
-                  </pic:spPr>
-                </pic:pic>
-              </a:graphicData>
-            </a:graphic>
-          </wp:inline>
-        </w:drawing>
-      </w:r>
-    </w:p>
-    <w:p>
-      <w:r>
-        <w:lastRenderedPageBreak/>
-        <w:t>Información relevada:</w:t>
-      </w:r>
-    </w:p>
-    <w:p>
-      <w:pPr>
-        <w:pStyle w:val="Prrafodelista"/>
-        <w:numPr>
-          <w:ilvl w:val="0"/>
-          <w:numId w:val="7"/>
-        </w:numPr>
-      </w:pPr>
-      <w:r>
-        <w:t>Publicación detallada de retiros con cronogramas, actividades y modalidades de pago.</w:t>
-      </w:r>
-    </w:p>
-    <w:p>
-      <w:pPr>
-        <w:pStyle w:val="Prrafodelista"/>
-        <w:numPr>
-          <w:ilvl w:val="0"/>
-          <w:numId w:val="7"/>
-        </w:numPr>
-      </w:pPr>
-      <w:r>
-        <w:t>Información sobre reservas, señas y pagos anticipados.</w:t>
-      </w:r>
-    </w:p>
-    <w:p>
-      <w:pPr>
-        <w:pStyle w:val="Prrafodelista"/>
-        <w:numPr>
-          <w:ilvl w:val="0"/>
-          <w:numId w:val="7"/>
-        </w:numPr>
-      </w:pPr>
-      <w:r>
-        <w:t>Importancia de disponer de recordatorios para fechas límite de pago y realización del evento.</w:t>
-      </w:r>
-    </w:p>
-    <w:p>
-      <w:pPr>
-        <w:pStyle w:val="Prrafodelista"/>
-        <w:numPr>
-          <w:ilvl w:val="0"/>
-          <w:numId w:val="7"/>
-        </w:numPr>
-      </w:pPr>
-      <w:r>
-        <w:t>Base para los requerimientos RF1, RF5, RF7 y RF8.</w:t>
-      </w:r>
-    </w:p>
-    <w:p/>
-    <w:p>
-      <w:pPr>
-        <w:rPr>
-          <w:u w:val="single"/>
-          <w:lang w:val="pt-BR"/>
-        </w:rPr>
-      </w:pPr>
-      <w:proofErr w:type="spellStart"/>
-      <w:r>
-        <w:rPr>
-          <w:u w:val="single"/>
-          <w:lang w:val="pt-BR"/>
-        </w:rPr>
-        <w:t>Análisis</w:t>
-      </w:r>
-      <w:proofErr w:type="spellEnd"/>
-      <w:r>
-        <w:rPr>
-          <w:u w:val="single"/>
-          <w:lang w:val="pt-BR"/>
-        </w:rPr>
-        <w:t xml:space="preserve"> de redes </w:t>
-      </w:r>
-      <w:proofErr w:type="spellStart"/>
-      <w:r>
-        <w:rPr>
-          <w:u w:val="single"/>
-          <w:lang w:val="pt-BR"/>
-        </w:rPr>
-        <w:t>sociales</w:t>
-      </w:r>
-      <w:proofErr w:type="spellEnd"/>
-    </w:p>
-    <w:p>
-      <w:pPr>
-        <w:rPr>
-          <w:lang w:val="pt-BR"/>
-        </w:rPr>
-      </w:pPr>
-      <w:r>
-        <w:rPr>
-          <w:lang w:val="pt-BR"/>
-        </w:rPr>
-        <w:t>Instagram:</w:t>
-      </w:r>
-    </w:p>
-    <w:p>
-      <w:pPr>
-        <w:rPr>
-          <w:lang w:val="pt-BR"/>
-        </w:rPr>
-      </w:pPr>
-      <w:r>
-        <w:rPr>
-          <w:lang w:val="pt-BR"/>
-        </w:rPr>
-        <w:t xml:space="preserve">Link: </w:t>
-      </w:r>
-      <w:hyperlink r:id="rId12" w:history="1">
-        <w:r>
-          <w:rPr>
-            <w:rStyle w:val="Hipervnculo"/>
-            <w:lang w:val="pt-BR"/>
-          </w:rPr>
-          <w:t>https://www.instagram.com/p/DTsmGVMFSHn/?img_index=1</w:t>
-        </w:r>
-      </w:hyperlink>
-    </w:p>
-    <w:p>
-      <w:pPr>
-        <w:rPr>
-          <w:lang w:val="en-US"/>
-        </w:rPr>
-      </w:pPr>
-      <w:r>
-        <w:rPr>
-          <w:noProof/>
-          <w:lang w:val="en-US"/>
-        </w:rPr>
-        <w:drawing>
-          <wp:inline distT="0" distB="0" distL="0" distR="0" wp14:anchorId="5C5B1A8B" wp14:editId="2E162834">
-            <wp:extent cx="5400040" cy="3358515"/>
-            <wp:effectExtent l="0" t="0" r="0" b="0"/>
-            <wp:docPr id="3" name="Imagen 3"/>
-            <wp:cNvGraphicFramePr>
-              <a:graphicFrameLocks xmlns:a="http://schemas.openxmlformats.org/drawingml/2006/main" noChangeAspect="1"/>
-            </wp:cNvGraphicFramePr>
-            <a:graphic xmlns:a="http://schemas.openxmlformats.org/drawingml/2006/main">
-              <a:graphicData uri="http://schemas.openxmlformats.org/drawingml/2006/picture">
-                <pic:pic xmlns:pic="http://schemas.openxmlformats.org/drawingml/2006/picture">
-                  <pic:nvPicPr>
-                    <pic:cNvPr id="1" name=""/>
-                    <pic:cNvPicPr/>
-                  </pic:nvPicPr>
-                  <pic:blipFill>
-                    <a:blip r:embed="rId13"/>
-                    <a:stretch>
-                      <a:fillRect/>
-                    </a:stretch>
-                  </pic:blipFill>
-                  <pic:spPr>
-                    <a:xfrm>
-                      <a:off x="0" y="0"/>
-                      <a:ext cx="5400040" cy="3358515"/>
-                    </a:xfrm>
-                    <a:prstGeom prst="rect">
-                      <a:avLst/>
-                    </a:prstGeom>
-                  </pic:spPr>
-                </pic:pic>
-              </a:graphicData>
-            </a:graphic>
-          </wp:inline>
-        </w:drawing>
-      </w:r>
-    </w:p>
-    <w:p>
-      <w:r>
-        <w:t>Información relevada:</w:t>
-      </w:r>
-    </w:p>
-    <w:p>
-      <w:pPr>
-        <w:numPr>
-          <w:ilvl w:val="0"/>
-          <w:numId w:val="8"/>
-        </w:numPr>
-      </w:pPr>
-      <w:r>
-        <w:t>Los usuarios suelen compartir experiencias y opiniones sobre los retiros realizados.</w:t>
-      </w:r>
-    </w:p>
-    <w:p>
-      <w:pPr>
-        <w:numPr>
-          <w:ilvl w:val="0"/>
-          <w:numId w:val="8"/>
-        </w:numPr>
-      </w:pPr>
-      <w:r>
-        <w:t>Las valoraciones ayudan a recordar experiencias pasadas y comparar eventos.</w:t>
-      </w:r>
-    </w:p>
-    <w:p>
-      <w:pPr>
-        <w:numPr>
-          <w:ilvl w:val="0"/>
-          <w:numId w:val="8"/>
-        </w:numPr>
-      </w:pPr>
-      <w:r>
-        <w:t>Se identificó la necesidad de incorporar un sistema de puntuación y comentarios personales.</w:t>
-      </w:r>
-    </w:p>
-    <w:p>
-      <w:pPr>
-        <w:numPr>
-          <w:ilvl w:val="0"/>
-          <w:numId w:val="8"/>
-        </w:numPr>
-      </w:pPr>
-      <w:r>
-        <w:t>Base para el requerimiento RF9.</w:t>
-      </w:r>
-    </w:p>
-    <w:p/>
-    <w:p>
-      <w:pPr>
-        <w:rPr>
-          <w:u w:val="single"/>
-        </w:rPr>
-      </w:pPr>
-      <w:r>
-        <w:rPr>
-          <w:u w:val="single"/>
-        </w:rPr>
-        <w:t>Análisis de herramientas de organización personal</w:t>
-      </w:r>
-    </w:p>
-    <w:p>
-      <w:pPr>
-        <w:rPr>
-          <w:lang w:val="en-US"/>
-        </w:rPr>
-      </w:pPr>
-      <w:r>
-        <w:rPr>
-          <w:lang w:val="en-US"/>
-        </w:rPr>
-        <w:t xml:space="preserve">Microsoft Excel: </w:t>
-      </w:r>
-    </w:p>
-    <w:p>
-      <w:r>
-        <w:rPr>
-          <w:noProof/>
-        </w:rPr>
-        <w:lastRenderedPageBreak/>
-        <w:drawing>
-          <wp:inline distT="0" distB="0" distL="0" distR="0" wp14:anchorId="23112756" wp14:editId="641EDCEA">
-            <wp:extent cx="5400040" cy="3255645"/>
-            <wp:effectExtent l="0" t="0" r="0" b="1905"/>
-            <wp:docPr id="1" name="Imagen 1"/>
-            <wp:cNvGraphicFramePr>
-              <a:graphicFrameLocks xmlns:a="http://schemas.openxmlformats.org/drawingml/2006/main" noChangeAspect="1"/>
-            </wp:cNvGraphicFramePr>
-            <a:graphic xmlns:a="http://schemas.openxmlformats.org/drawingml/2006/main">
-              <a:graphicData uri="http://schemas.openxmlformats.org/drawingml/2006/picture">
-                <pic:pic xmlns:pic="http://schemas.openxmlformats.org/drawingml/2006/picture">
-                  <pic:nvPicPr>
-                    <pic:cNvPr id="1" name=""/>
-                    <pic:cNvPicPr/>
-                  </pic:nvPicPr>
-                  <pic:blipFill>
-                    <a:blip r:embed="rId14"/>
-                    <a:stretch>
-                      <a:fillRect/>
-                    </a:stretch>
-                  </pic:blipFill>
-                  <pic:spPr>
-                    <a:xfrm>
-                      <a:off x="0" y="0"/>
-                      <a:ext cx="5400040" cy="3255645"/>
-                    </a:xfrm>
-                    <a:prstGeom prst="rect">
-                      <a:avLst/>
-                    </a:prstGeom>
-                  </pic:spPr>
-                </pic:pic>
-              </a:graphicData>
-            </a:graphic>
-          </wp:inline>
-        </w:drawing>
-      </w:r>
-    </w:p>
-    <w:p>
-      <w:r>
-        <w:t>Información relevada:</w:t>
-      </w:r>
-    </w:p>
-    <w:p>
-      <w:pPr>
-        <w:numPr>
-          <w:ilvl w:val="0"/>
-          <w:numId w:val="9"/>
-        </w:numPr>
-      </w:pPr>
-      <w:r>
-        <w:t>Actualmente los datos de retiros, pagos y fechas son gestionados manualmente mediante planillas.</w:t>
-      </w:r>
-    </w:p>
-    <w:p>
-      <w:pPr>
-        <w:numPr>
-          <w:ilvl w:val="0"/>
-          <w:numId w:val="9"/>
-        </w:numPr>
-      </w:pPr>
-      <w:r>
-        <w:t>El control manual genera riesgo de errores, olvidos y pérdida de información.</w:t>
-      </w:r>
-    </w:p>
-    <w:p>
-      <w:pPr>
-        <w:numPr>
-          <w:ilvl w:val="0"/>
-          <w:numId w:val="9"/>
-        </w:numPr>
-      </w:pPr>
-      <w:r>
-        <w:t>Se detectó la necesidad de automatizar cálculos de gastos y centralizar la información.</w:t>
-      </w:r>
-    </w:p>
-    <w:p>
-      <w:pPr>
-        <w:numPr>
-          <w:ilvl w:val="0"/>
-          <w:numId w:val="9"/>
-        </w:numPr>
-      </w:pPr>
-      <w:r>
-        <w:t>Base para los requerimientos RF2, RF5 y RF6.</w:t>
-      </w:r>
-    </w:p>
-    <w:p/>
-    <w:p>
-      <w:pPr>
-        <w:rPr>
-          <w:u w:val="single"/>
-        </w:rPr>
-      </w:pPr>
-      <w:r>
-        <w:rPr>
-          <w:u w:val="single"/>
-        </w:rPr>
-        <w:t>Consulta de material académico</w:t>
-      </w:r>
-    </w:p>
-    <w:p>
-      <w:r>
-        <w:t xml:space="preserve">Campus Virtual: </w:t>
-      </w:r>
-    </w:p>
-    <w:p>
-      <w:r>
-        <w:rPr>
-          <w:noProof/>
-        </w:rPr>
-        <w:drawing>
-          <wp:inline distT="0" distB="0" distL="0" distR="0" wp14:anchorId="0F0DF293" wp14:editId="251FA4A8">
-            <wp:extent cx="5400040" cy="2616200"/>
-            <wp:effectExtent l="0" t="0" r="0" b="0"/>
-            <wp:docPr id="8" name="Imagen 8"/>
-            <wp:cNvGraphicFramePr>
-              <a:graphicFrameLocks xmlns:a="http://schemas.openxmlformats.org/drawingml/2006/main" noChangeAspect="1"/>
-            </wp:cNvGraphicFramePr>
-            <a:graphic xmlns:a="http://schemas.openxmlformats.org/drawingml/2006/main">
-              <a:graphicData uri="http://schemas.openxmlformats.org/drawingml/2006/picture">
-                <pic:pic xmlns:pic="http://schemas.openxmlformats.org/drawingml/2006/picture">
-                  <pic:nvPicPr>
-                    <pic:cNvPr id="8" name="Imagen 8"/>
-                    <pic:cNvPicPr/>
-                  </pic:nvPicPr>
-                  <pic:blipFill>
-                    <a:blip r:embed="rId15" cstate="print">
+                    <a:blip r:embed="rId9" cstate="print">
                       <a:extLst>
                         <a:ext uri="{28A0092B-C50C-407E-A947-70E740481C1C}">
                           <a14:useLocalDpi xmlns:a14="http://schemas.microsoft.com/office/drawing/2010/main" val="0"/>
@@ -2474,7 +2221,7 @@
                   <pic:spPr>
                     <a:xfrm>
                       <a:off x="0" y="0"/>
-                      <a:ext cx="5400040" cy="2616200"/>
+                      <a:ext cx="4411345" cy="2204085"/>
                     </a:xfrm>
                     <a:prstGeom prst="rect">
                       <a:avLst/>
@@ -2483,11 +2230,723 @@
                 </pic:pic>
               </a:graphicData>
             </a:graphic>
-          </wp:inline>
+            <wp14:sizeRelH relativeFrom="margin">
+              <wp14:pctWidth>0</wp14:pctWidth>
+            </wp14:sizeRelH>
+            <wp14:sizeRelV relativeFrom="margin">
+              <wp14:pctHeight>0</wp14:pctHeight>
+            </wp14:sizeRelV>
+          </wp:anchor>
         </w:drawing>
       </w:r>
-    </w:p>
-    <w:p>
+      <w:r>
+        <w:t>Información relevada:</w:t>
+      </w:r>
+    </w:p>
+    <w:p>
+      <w:pPr>
+        <w:jc w:val="both"/>
+      </w:pPr>
+    </w:p>
+    <w:p>
+      <w:pPr>
+        <w:numPr>
+          <w:ilvl w:val="0"/>
+          <w:numId w:val="6"/>
+        </w:numPr>
+        <w:spacing w:after="0"/>
+        <w:jc w:val="both"/>
+      </w:pPr>
+      <w:r>
+        <w:t>Existencia de múltiples retiros con distintas temáticas.</w:t>
+      </w:r>
+    </w:p>
+    <w:p>
+      <w:pPr>
+        <w:numPr>
+          <w:ilvl w:val="0"/>
+          <w:numId w:val="6"/>
+        </w:numPr>
+        <w:spacing w:after="0"/>
+        <w:jc w:val="both"/>
+      </w:pPr>
+      <w:r>
+        <w:t>Información relevante para los usuarios: ubicación, fechas, duración, costos y actividades.</w:t>
+      </w:r>
+    </w:p>
+    <w:p>
+      <w:pPr>
+        <w:numPr>
+          <w:ilvl w:val="0"/>
+          <w:numId w:val="6"/>
+        </w:numPr>
+        <w:spacing w:after="0"/>
+        <w:jc w:val="both"/>
+      </w:pPr>
+      <w:r>
+        <w:t>Necesidad de contar con una herramienta que centralice la información obtenida desde diferentes sitios web.</w:t>
+      </w:r>
+    </w:p>
+    <w:p>
+      <w:pPr>
+        <w:numPr>
+          <w:ilvl w:val="0"/>
+          <w:numId w:val="6"/>
+        </w:numPr>
+        <w:spacing w:after="0"/>
+        <w:jc w:val="both"/>
+      </w:pPr>
+      <w:r>
+        <w:t>Base para los requerimientos RF1, RF3 y RF4.</w:t>
+      </w:r>
+    </w:p>
+    <w:p>
+      <w:pPr>
+        <w:jc w:val="both"/>
+      </w:pPr>
+    </w:p>
+    <w:p>
+      <w:pPr>
+        <w:jc w:val="both"/>
+      </w:pPr>
+      <w:r>
+        <w:t>Link</w:t>
+      </w:r>
+      <w:r>
+        <w:t>:</w:t>
+      </w:r>
+      <w:hyperlink r:id="rId10" w:history="1">
+        <w:r>
+          <w:rPr>
+            <w:rStyle w:val="Hipervnculo"/>
+          </w:rPr>
+          <w:t>https://www.caminosalser.com/i64-retiro-espiritual-de-caminos-al-ser-en-capilla-del-monte-cordoba-argentina/?utm_source=chatgpt.com</w:t>
+        </w:r>
+      </w:hyperlink>
+    </w:p>
+    <w:p>
+      <w:pPr>
+        <w:rPr>
+          <w:lang w:val="en-US"/>
+        </w:rPr>
+      </w:pPr>
+      <w:r>
+        <w:rPr>
+          <w:noProof/>
+          <w:lang w:val="en-US"/>
+        </w:rPr>
+        <w:drawing>
+          <wp:anchor distT="0" distB="0" distL="114300" distR="114300" simplePos="0" relativeHeight="251661312" behindDoc="1" locked="0" layoutInCell="1" allowOverlap="1" wp14:anchorId="35AC45E8" wp14:editId="5C93E54A">
+            <wp:simplePos x="0" y="0"/>
+            <wp:positionH relativeFrom="column">
+              <wp:posOffset>558165</wp:posOffset>
+            </wp:positionH>
+            <wp:positionV relativeFrom="paragraph">
+              <wp:posOffset>30480</wp:posOffset>
+            </wp:positionV>
+            <wp:extent cx="4434840" cy="2210435"/>
+            <wp:effectExtent l="0" t="0" r="3810" b="0"/>
+            <wp:wrapTight wrapText="bothSides">
+              <wp:wrapPolygon edited="0">
+                <wp:start x="0" y="0"/>
+                <wp:lineTo x="0" y="21408"/>
+                <wp:lineTo x="21526" y="21408"/>
+                <wp:lineTo x="21526" y="0"/>
+                <wp:lineTo x="0" y="0"/>
+              </wp:wrapPolygon>
+            </wp:wrapTight>
+            <wp:docPr id="5" name="Imagen 5"/>
+            <wp:cNvGraphicFramePr>
+              <a:graphicFrameLocks xmlns:a="http://schemas.openxmlformats.org/drawingml/2006/main" noChangeAspect="1"/>
+            </wp:cNvGraphicFramePr>
+            <a:graphic xmlns:a="http://schemas.openxmlformats.org/drawingml/2006/main">
+              <a:graphicData uri="http://schemas.openxmlformats.org/drawingml/2006/picture">
+                <pic:pic xmlns:pic="http://schemas.openxmlformats.org/drawingml/2006/picture">
+                  <pic:nvPicPr>
+                    <pic:cNvPr id="1" name=""/>
+                    <pic:cNvPicPr/>
+                  </pic:nvPicPr>
+                  <pic:blipFill>
+                    <a:blip r:embed="rId11" cstate="print">
+                      <a:extLst>
+                        <a:ext uri="{28A0092B-C50C-407E-A947-70E740481C1C}">
+                          <a14:useLocalDpi xmlns:a14="http://schemas.microsoft.com/office/drawing/2010/main" val="0"/>
+                        </a:ext>
+                      </a:extLst>
+                    </a:blip>
+                    <a:stretch>
+                      <a:fillRect/>
+                    </a:stretch>
+                  </pic:blipFill>
+                  <pic:spPr>
+                    <a:xfrm>
+                      <a:off x="0" y="0"/>
+                      <a:ext cx="4434840" cy="2210435"/>
+                    </a:xfrm>
+                    <a:prstGeom prst="rect">
+                      <a:avLst/>
+                    </a:prstGeom>
+                  </pic:spPr>
+                </pic:pic>
+              </a:graphicData>
+            </a:graphic>
+            <wp14:sizeRelH relativeFrom="margin">
+              <wp14:pctWidth>0</wp14:pctWidth>
+            </wp14:sizeRelH>
+            <wp14:sizeRelV relativeFrom="margin">
+              <wp14:pctHeight>0</wp14:pctHeight>
+            </wp14:sizeRelV>
+          </wp:anchor>
+        </w:drawing>
+      </w:r>
+    </w:p>
+    <w:p/>
+    <w:p>
+      <w:pPr>
+        <w:jc w:val="both"/>
+      </w:pPr>
+      <w:r>
+        <w:lastRenderedPageBreak/>
+        <w:t>Información relevada:</w:t>
+      </w:r>
+    </w:p>
+    <w:p>
+      <w:pPr>
+        <w:pStyle w:val="Prrafodelista"/>
+        <w:numPr>
+          <w:ilvl w:val="0"/>
+          <w:numId w:val="7"/>
+        </w:numPr>
+        <w:jc w:val="both"/>
+      </w:pPr>
+      <w:r>
+        <w:t>Publicación detallada de retiros con cronogramas, actividades y modalidades de pago.</w:t>
+      </w:r>
+    </w:p>
+    <w:p>
+      <w:pPr>
+        <w:pStyle w:val="Prrafodelista"/>
+        <w:numPr>
+          <w:ilvl w:val="0"/>
+          <w:numId w:val="7"/>
+        </w:numPr>
+        <w:jc w:val="both"/>
+      </w:pPr>
+      <w:r>
+        <w:t>Información sobre reservas, señas y pagos anticipados.</w:t>
+      </w:r>
+    </w:p>
+    <w:p>
+      <w:pPr>
+        <w:pStyle w:val="Prrafodelista"/>
+        <w:numPr>
+          <w:ilvl w:val="0"/>
+          <w:numId w:val="7"/>
+        </w:numPr>
+        <w:jc w:val="both"/>
+      </w:pPr>
+      <w:r>
+        <w:t>Importancia de disponer de recordatorios para fechas límite de pago y realización del evento.</w:t>
+      </w:r>
+    </w:p>
+    <w:p>
+      <w:pPr>
+        <w:pStyle w:val="Prrafodelista"/>
+        <w:numPr>
+          <w:ilvl w:val="0"/>
+          <w:numId w:val="7"/>
+        </w:numPr>
+        <w:jc w:val="both"/>
+      </w:pPr>
+      <w:r>
+        <w:t>Base para los requerimientos RF1, RF5, RF7 y RF8.</w:t>
+      </w:r>
+    </w:p>
+    <w:p>
+      <w:pPr>
+        <w:jc w:val="both"/>
+        <w:rPr>
+          <w:u w:val="single"/>
+          <w:lang w:val="pt-BR"/>
+        </w:rPr>
+      </w:pPr>
+    </w:p>
+    <w:p>
+      <w:pPr>
+        <w:jc w:val="both"/>
+      </w:pPr>
+      <w:proofErr w:type="spellStart"/>
+      <w:r>
+        <w:rPr>
+          <w:u w:val="single"/>
+          <w:lang w:val="pt-BR"/>
+        </w:rPr>
+        <w:t>Análisis</w:t>
+      </w:r>
+      <w:proofErr w:type="spellEnd"/>
+      <w:r>
+        <w:rPr>
+          <w:u w:val="single"/>
+          <w:lang w:val="pt-BR"/>
+        </w:rPr>
+        <w:t xml:space="preserve"> de redes </w:t>
+      </w:r>
+      <w:proofErr w:type="spellStart"/>
+      <w:r>
+        <w:rPr>
+          <w:u w:val="single"/>
+          <w:lang w:val="pt-BR"/>
+        </w:rPr>
+        <w:t>sociales</w:t>
+      </w:r>
+      <w:proofErr w:type="spellEnd"/>
+    </w:p>
+    <w:p>
+      <w:pPr>
+        <w:jc w:val="both"/>
+        <w:rPr>
+          <w:lang w:val="pt-BR"/>
+        </w:rPr>
+      </w:pPr>
+      <w:r>
+        <w:rPr>
+          <w:lang w:val="pt-BR"/>
+        </w:rPr>
+        <w:t>Instagram:</w:t>
+      </w:r>
+      <w:r>
+        <w:rPr>
+          <w:lang w:val="pt-BR"/>
+        </w:rPr>
+        <w:t xml:space="preserve"> </w:t>
+      </w:r>
+      <w:hyperlink r:id="rId12" w:history="1">
+        <w:r>
+          <w:rPr>
+            <w:rStyle w:val="Hipervnculo"/>
+            <w:lang w:val="pt-BR"/>
+          </w:rPr>
+          <w:t>https://www.instagram.com/p/DTsmGVMFSHn/?img_index=1</w:t>
+        </w:r>
+      </w:hyperlink>
+    </w:p>
+    <w:p>
+      <w:pPr>
+        <w:rPr>
+          <w:lang w:val="en-US"/>
+        </w:rPr>
+      </w:pPr>
+      <w:r>
+        <w:rPr>
+          <w:noProof/>
+          <w:lang w:val="en-US"/>
+        </w:rPr>
+        <w:drawing>
+          <wp:anchor distT="0" distB="0" distL="114300" distR="114300" simplePos="0" relativeHeight="251662336" behindDoc="1" locked="0" layoutInCell="1" allowOverlap="1" wp14:anchorId="5C5B1A8B" wp14:editId="721F9E82">
+            <wp:simplePos x="0" y="0"/>
+            <wp:positionH relativeFrom="column">
+              <wp:posOffset>741680</wp:posOffset>
+            </wp:positionH>
+            <wp:positionV relativeFrom="paragraph">
+              <wp:posOffset>25400</wp:posOffset>
+            </wp:positionV>
+            <wp:extent cx="4038600" cy="2511425"/>
+            <wp:effectExtent l="0" t="0" r="0" b="3175"/>
+            <wp:wrapSquare wrapText="bothSides"/>
+            <wp:docPr id="3" name="Imagen 3"/>
+            <wp:cNvGraphicFramePr>
+              <a:graphicFrameLocks xmlns:a="http://schemas.openxmlformats.org/drawingml/2006/main" noChangeAspect="1"/>
+            </wp:cNvGraphicFramePr>
+            <a:graphic xmlns:a="http://schemas.openxmlformats.org/drawingml/2006/main">
+              <a:graphicData uri="http://schemas.openxmlformats.org/drawingml/2006/picture">
+                <pic:pic xmlns:pic="http://schemas.openxmlformats.org/drawingml/2006/picture">
+                  <pic:nvPicPr>
+                    <pic:cNvPr id="1" name=""/>
+                    <pic:cNvPicPr/>
+                  </pic:nvPicPr>
+                  <pic:blipFill>
+                    <a:blip r:embed="rId13" cstate="print">
+                      <a:extLst>
+                        <a:ext uri="{28A0092B-C50C-407E-A947-70E740481C1C}">
+                          <a14:useLocalDpi xmlns:a14="http://schemas.microsoft.com/office/drawing/2010/main" val="0"/>
+                        </a:ext>
+                      </a:extLst>
+                    </a:blip>
+                    <a:stretch>
+                      <a:fillRect/>
+                    </a:stretch>
+                  </pic:blipFill>
+                  <pic:spPr>
+                    <a:xfrm>
+                      <a:off x="0" y="0"/>
+                      <a:ext cx="4038600" cy="2511425"/>
+                    </a:xfrm>
+                    <a:prstGeom prst="rect">
+                      <a:avLst/>
+                    </a:prstGeom>
+                  </pic:spPr>
+                </pic:pic>
+              </a:graphicData>
+            </a:graphic>
+            <wp14:sizeRelH relativeFrom="margin">
+              <wp14:pctWidth>0</wp14:pctWidth>
+            </wp14:sizeRelH>
+            <wp14:sizeRelV relativeFrom="margin">
+              <wp14:pctHeight>0</wp14:pctHeight>
+            </wp14:sizeRelV>
+          </wp:anchor>
+        </w:drawing>
+      </w:r>
+    </w:p>
+    <w:p>
+      <w:pPr>
+        <w:jc w:val="both"/>
+      </w:pPr>
+      <w:r>
+        <w:t>Información relevada:</w:t>
+      </w:r>
+    </w:p>
+    <w:p>
+      <w:pPr>
+        <w:numPr>
+          <w:ilvl w:val="0"/>
+          <w:numId w:val="8"/>
+        </w:numPr>
+        <w:spacing w:after="0"/>
+        <w:jc w:val="both"/>
+      </w:pPr>
+      <w:r>
+        <w:t>Los usuarios suelen compartir experiencias y opiniones sobre los retiros realizados.</w:t>
+      </w:r>
+    </w:p>
+    <w:p>
+      <w:pPr>
+        <w:numPr>
+          <w:ilvl w:val="0"/>
+          <w:numId w:val="8"/>
+        </w:numPr>
+        <w:spacing w:after="0"/>
+        <w:jc w:val="both"/>
+      </w:pPr>
+      <w:r>
+        <w:t>Las valoraciones ayudan a recordar experiencias pasadas y comparar eventos.</w:t>
+      </w:r>
+    </w:p>
+    <w:p>
+      <w:pPr>
+        <w:numPr>
+          <w:ilvl w:val="0"/>
+          <w:numId w:val="8"/>
+        </w:numPr>
+        <w:spacing w:after="0"/>
+        <w:jc w:val="both"/>
+      </w:pPr>
+      <w:r>
+        <w:t>Se identificó la necesidad de incorporar un sistema de puntuación y comentarios personales.</w:t>
+      </w:r>
+    </w:p>
+    <w:p>
+      <w:pPr>
+        <w:numPr>
+          <w:ilvl w:val="0"/>
+          <w:numId w:val="8"/>
+        </w:numPr>
+        <w:spacing w:after="0"/>
+        <w:jc w:val="both"/>
+      </w:pPr>
+      <w:r>
+        <w:t>Base para el requerimiento RF9.</w:t>
+      </w:r>
+    </w:p>
+    <w:p>
+      <w:pPr>
+        <w:jc w:val="both"/>
+      </w:pPr>
+    </w:p>
+    <w:p>
+      <w:pPr>
+        <w:jc w:val="both"/>
+        <w:rPr>
+          <w:u w:val="single"/>
+        </w:rPr>
+      </w:pPr>
+      <w:r>
+        <w:rPr>
+          <w:u w:val="single"/>
+        </w:rPr>
+        <w:t>Análisis de herramientas de organización personal</w:t>
+      </w:r>
+    </w:p>
+    <w:p>
+      <w:pPr>
+        <w:jc w:val="both"/>
+        <w:rPr>
+          <w:lang w:val="en-US"/>
+        </w:rPr>
+      </w:pPr>
+      <w:r>
+        <w:rPr>
+          <w:noProof/>
+        </w:rPr>
+        <w:drawing>
+          <wp:anchor distT="0" distB="0" distL="114300" distR="114300" simplePos="0" relativeHeight="251663360" behindDoc="1" locked="0" layoutInCell="1" allowOverlap="1" wp14:anchorId="23112756" wp14:editId="18ECF47D">
+            <wp:simplePos x="0" y="0"/>
+            <wp:positionH relativeFrom="column">
+              <wp:posOffset>1113790</wp:posOffset>
+            </wp:positionH>
+            <wp:positionV relativeFrom="paragraph">
+              <wp:posOffset>45085</wp:posOffset>
+            </wp:positionV>
+            <wp:extent cx="3665855" cy="2209800"/>
+            <wp:effectExtent l="0" t="0" r="0" b="0"/>
+            <wp:wrapSquare wrapText="bothSides"/>
+            <wp:docPr id="1" name="Imagen 1"/>
+            <wp:cNvGraphicFramePr>
+              <a:graphicFrameLocks xmlns:a="http://schemas.openxmlformats.org/drawingml/2006/main" noChangeAspect="1"/>
+            </wp:cNvGraphicFramePr>
+            <a:graphic xmlns:a="http://schemas.openxmlformats.org/drawingml/2006/main">
+              <a:graphicData uri="http://schemas.openxmlformats.org/drawingml/2006/picture">
+                <pic:pic xmlns:pic="http://schemas.openxmlformats.org/drawingml/2006/picture">
+                  <pic:nvPicPr>
+                    <pic:cNvPr id="1" name=""/>
+                    <pic:cNvPicPr/>
+                  </pic:nvPicPr>
+                  <pic:blipFill>
+                    <a:blip r:embed="rId14" cstate="print">
+                      <a:extLst>
+                        <a:ext uri="{28A0092B-C50C-407E-A947-70E740481C1C}">
+                          <a14:useLocalDpi xmlns:a14="http://schemas.microsoft.com/office/drawing/2010/main" val="0"/>
+                        </a:ext>
+                      </a:extLst>
+                    </a:blip>
+                    <a:stretch>
+                      <a:fillRect/>
+                    </a:stretch>
+                  </pic:blipFill>
+                  <pic:spPr>
+                    <a:xfrm>
+                      <a:off x="0" y="0"/>
+                      <a:ext cx="3665855" cy="2209800"/>
+                    </a:xfrm>
+                    <a:prstGeom prst="rect">
+                      <a:avLst/>
+                    </a:prstGeom>
+                  </pic:spPr>
+                </pic:pic>
+              </a:graphicData>
+            </a:graphic>
+            <wp14:sizeRelH relativeFrom="margin">
+              <wp14:pctWidth>0</wp14:pctWidth>
+            </wp14:sizeRelH>
+            <wp14:sizeRelV relativeFrom="margin">
+              <wp14:pctHeight>0</wp14:pctHeight>
+            </wp14:sizeRelV>
+          </wp:anchor>
+        </w:drawing>
+      </w:r>
+      <w:r>
+        <w:rPr>
+          <w:lang w:val="en-US"/>
+        </w:rPr>
+        <w:t xml:space="preserve">Microsoft Excel: </w:t>
+      </w:r>
+    </w:p>
+    <w:p/>
+    <w:p/>
+    <w:p/>
+    <w:p/>
+    <w:p/>
+    <w:p/>
+    <w:p/>
+    <w:p>
+      <w:pPr>
+        <w:jc w:val="both"/>
+      </w:pPr>
+      <w:r>
+        <w:lastRenderedPageBreak/>
+        <w:t>Información relevada:</w:t>
+      </w:r>
+    </w:p>
+    <w:p>
+      <w:pPr>
+        <w:numPr>
+          <w:ilvl w:val="0"/>
+          <w:numId w:val="9"/>
+        </w:numPr>
+        <w:spacing w:after="0"/>
+        <w:jc w:val="both"/>
+      </w:pPr>
+      <w:r>
+        <w:t>Actualmente los datos de retiros, pagos y fechas son gestionados manualmente mediante planillas.</w:t>
+      </w:r>
+    </w:p>
+    <w:p>
+      <w:pPr>
+        <w:numPr>
+          <w:ilvl w:val="0"/>
+          <w:numId w:val="9"/>
+        </w:numPr>
+        <w:spacing w:after="0"/>
+        <w:jc w:val="both"/>
+      </w:pPr>
+      <w:r>
+        <w:t>El control manual genera riesgo de errores, olvidos y pérdida de información.</w:t>
+      </w:r>
+    </w:p>
+    <w:p>
+      <w:pPr>
+        <w:numPr>
+          <w:ilvl w:val="0"/>
+          <w:numId w:val="9"/>
+        </w:numPr>
+        <w:spacing w:after="0"/>
+        <w:jc w:val="both"/>
+      </w:pPr>
+      <w:r>
+        <w:t>Se detectó la necesidad de automatizar cálculos de gastos y centralizar la información.</w:t>
+      </w:r>
+    </w:p>
+    <w:p>
+      <w:pPr>
+        <w:numPr>
+          <w:ilvl w:val="0"/>
+          <w:numId w:val="9"/>
+        </w:numPr>
+        <w:spacing w:after="0"/>
+        <w:jc w:val="both"/>
+      </w:pPr>
+      <w:r>
+        <w:t>Base para los requerimientos RF2, RF5 y RF6.</w:t>
+      </w:r>
+    </w:p>
+    <w:p>
+      <w:pPr>
+        <w:jc w:val="both"/>
+      </w:pPr>
+    </w:p>
+    <w:p>
+      <w:pPr>
+        <w:jc w:val="both"/>
+        <w:rPr>
+          <w:u w:val="single"/>
+        </w:rPr>
+      </w:pPr>
+      <w:r>
+        <w:rPr>
+          <w:u w:val="single"/>
+        </w:rPr>
+        <w:t>Consulta de material académico</w:t>
+      </w:r>
+    </w:p>
+    <w:p>
+      <w:r>
+        <w:rPr>
+          <w:noProof/>
+        </w:rPr>
+        <w:drawing>
+          <wp:anchor distT="0" distB="0" distL="114300" distR="114300" simplePos="0" relativeHeight="251664384" behindDoc="1" locked="0" layoutInCell="1" allowOverlap="1" wp14:anchorId="0F0DF293" wp14:editId="48DD7F36">
+            <wp:simplePos x="0" y="0"/>
+            <wp:positionH relativeFrom="column">
+              <wp:posOffset>1083945</wp:posOffset>
+            </wp:positionH>
+            <wp:positionV relativeFrom="paragraph">
+              <wp:posOffset>54610</wp:posOffset>
+            </wp:positionV>
+            <wp:extent cx="3291840" cy="2225675"/>
+            <wp:effectExtent l="0" t="0" r="3810" b="3175"/>
+            <wp:wrapSquare wrapText="bothSides"/>
+            <wp:docPr id="8" name="Imagen 8"/>
+            <wp:cNvGraphicFramePr>
+              <a:graphicFrameLocks xmlns:a="http://schemas.openxmlformats.org/drawingml/2006/main" noChangeAspect="1"/>
+            </wp:cNvGraphicFramePr>
+            <a:graphic xmlns:a="http://schemas.openxmlformats.org/drawingml/2006/main">
+              <a:graphicData uri="http://schemas.openxmlformats.org/drawingml/2006/picture">
+                <pic:pic xmlns:pic="http://schemas.openxmlformats.org/drawingml/2006/picture">
+                  <pic:nvPicPr>
+                    <pic:cNvPr id="8" name="Imagen 8"/>
+                    <pic:cNvPicPr/>
+                  </pic:nvPicPr>
+                  <pic:blipFill rotWithShape="1">
+                    <a:blip r:embed="rId15" cstate="print">
+                      <a:extLst>
+                        <a:ext uri="{28A0092B-C50C-407E-A947-70E740481C1C}">
+                          <a14:useLocalDpi xmlns:a14="http://schemas.microsoft.com/office/drawing/2010/main" val="0"/>
+                        </a:ext>
+                      </a:extLst>
+                    </a:blip>
+                    <a:srcRect r="28358"/>
+                    <a:stretch>
+                      <a:fillRect/>
+                    </a:stretch>
+                  </pic:blipFill>
+                  <pic:spPr bwMode="auto">
+                    <a:xfrm>
+                      <a:off x="0" y="0"/>
+                      <a:ext cx="3291840" cy="2225675"/>
+                    </a:xfrm>
+                    <a:prstGeom prst="rect">
+                      <a:avLst/>
+                    </a:prstGeom>
+                    <a:ln>
+                      <a:noFill/>
+                    </a:ln>
+                    <a:extLst>
+                      <a:ext uri="{53640926-AAD7-44D8-BBD7-CCE9431645EC}">
+                        <a14:shadowObscured xmlns:a14="http://schemas.microsoft.com/office/drawing/2010/main"/>
+                      </a:ext>
+                    </a:extLst>
+                  </pic:spPr>
+                </pic:pic>
+              </a:graphicData>
+            </a:graphic>
+            <wp14:sizeRelH relativeFrom="margin">
+              <wp14:pctWidth>0</wp14:pctWidth>
+            </wp14:sizeRelH>
+            <wp14:sizeRelV relativeFrom="margin">
+              <wp14:pctHeight>0</wp14:pctHeight>
+            </wp14:sizeRelV>
+          </wp:anchor>
+        </w:drawing>
+      </w:r>
+      <w:r>
+        <w:t xml:space="preserve">Campus Virtual: </w:t>
+      </w:r>
+    </w:p>
+    <w:p/>
+    <w:p>
+      <w:pPr>
+        <w:jc w:val="both"/>
+      </w:pPr>
+    </w:p>
+    <w:p>
+      <w:pPr>
+        <w:jc w:val="both"/>
+      </w:pPr>
+    </w:p>
+    <w:p>
+      <w:pPr>
+        <w:jc w:val="both"/>
+      </w:pPr>
+    </w:p>
+    <w:p>
+      <w:pPr>
+        <w:jc w:val="both"/>
+      </w:pPr>
+    </w:p>
+    <w:p>
+      <w:pPr>
+        <w:jc w:val="both"/>
+      </w:pPr>
+    </w:p>
+    <w:p>
+      <w:pPr>
+        <w:jc w:val="both"/>
+      </w:pPr>
+    </w:p>
+    <w:p>
+      <w:pPr>
+        <w:jc w:val="both"/>
+      </w:pPr>
       <w:r>
         <w:t>Información relevada:</w:t>
       </w:r>
@@ -2498,9 +2957,10 @@
           <w:ilvl w:val="0"/>
           <w:numId w:val="10"/>
         </w:numPr>
-      </w:pPr>
-      <w:r>
-        <w:lastRenderedPageBreak/>
+        <w:spacing w:after="0"/>
+        <w:jc w:val="both"/>
+      </w:pPr>
+      <w:r>
         <w:t>Se analizaron conceptos relacionados con requerimientos funcionales, gestión de información y sistemas de notificaciones.</w:t>
       </w:r>
     </w:p>
@@ -2510,6 +2970,8 @@
           <w:ilvl w:val="0"/>
           <w:numId w:val="10"/>
         </w:numPr>
+        <w:spacing w:after="0"/>
+        <w:jc w:val="both"/>
       </w:pPr>
       <w:r>
         <w:t>Se identificó la importancia de alertar al usuario sobre eventos próximos y vencimientos.</w:t>
@@ -2521,10 +2983,79 @@
           <w:ilvl w:val="0"/>
           <w:numId w:val="10"/>
         </w:numPr>
+        <w:spacing w:after="0"/>
+        <w:jc w:val="both"/>
       </w:pPr>
       <w:r>
         <w:t>Base para los requerimientos RF7 y RF8.</w:t>
       </w:r>
+    </w:p>
+    <w:p>
+      <w:pPr>
+        <w:spacing w:after="0"/>
+        <w:jc w:val="both"/>
+      </w:pPr>
+    </w:p>
+    <w:p>
+      <w:pPr>
+        <w:spacing w:after="0"/>
+        <w:jc w:val="both"/>
+      </w:pPr>
+    </w:p>
+    <w:p>
+      <w:pPr>
+        <w:spacing w:after="0"/>
+        <w:jc w:val="both"/>
+      </w:pPr>
+    </w:p>
+    <w:p>
+      <w:pPr>
+        <w:spacing w:after="0"/>
+        <w:jc w:val="both"/>
+        <w:rPr>
+          <w:sz w:val="24"/>
+          <w:szCs w:val="24"/>
+          <w:u w:val="single"/>
+        </w:rPr>
+      </w:pPr>
+      <w:r>
+        <w:rPr>
+          <w:b/>
+          <w:bCs/>
+          <w:sz w:val="24"/>
+          <w:szCs w:val="24"/>
+          <w:u w:val="single"/>
+        </w:rPr>
+        <w:t>Modelo de objetos del dominio del problema: </w:t>
+      </w:r>
+      <w:r>
+        <w:rPr>
+          <w:b/>
+          <w:bCs/>
+          <w:sz w:val="24"/>
+          <w:szCs w:val="24"/>
+          <w:u w:val="single"/>
+        </w:rPr>
+        <w:t>Diagrama de clases</w:t>
+      </w:r>
+      <w:r>
+        <w:rPr>
+          <w:sz w:val="24"/>
+          <w:szCs w:val="24"/>
+          <w:u w:val="single"/>
+        </w:rPr>
+        <w:t xml:space="preserve"> </w:t>
+      </w:r>
+    </w:p>
+    <w:p>
+      <w:pPr>
+        <w:spacing w:after="0"/>
+        <w:jc w:val="both"/>
+        <w:rPr>
+          <w:sz w:val="24"/>
+          <w:szCs w:val="24"/>
+        </w:rPr>
+      </w:pPr>
     </w:p>
     <w:sectPr>
       <w:pgSz w:w="11906" w:h="16838"/>
@@ -2537,12 +3068,12 @@
 </file>
 
 <file path=word/numbering.xml><?xml version="1.0" encoding="utf-8"?>
-<w:numbering xmlns:wpc="http://schemas.microsoft.com/office/word/2010/wordprocessingCanvas" xmlns:cx="http://schemas.microsoft.com/office/drawing/2014/chartex" xmlns:cx1="http://schemas.microsoft.com/office/drawing/2015/9/8/chartex" xmlns:cx2="http://schemas.microsoft.com/office/drawing/2015/10/21/chartex" xmlns:cx3="http://schemas.microsoft.com/office/drawing/2016/5/9/chartex" xmlns:cx4="http://schemas.microsoft.com/office/drawing/2016/5/10/chartex" xmlns:cx5="http://schemas.microsoft.com/office/drawing/2016/5/11/chartex" xmlns:cx6="http://schemas.microsoft.com/office/drawing/2016/5/12/chartex" xmlns:cx7="http://schemas.microsoft.com/office/drawing/2016/5/13/chartex" xmlns:cx8="http://schemas.microsoft.com/office/drawing/2016/5/14/chartex" xmlns:mc="http://schemas.openxmlformats.org/markup-compatibility/2006" xmlns:aink="http://schemas.microsoft.com/office/drawing/2016/ink" xmlns:am3d="http://schemas.microsoft.com/office/drawing/2017/model3d" xmlns:o="urn:schemas-microsoft-com:office:office" xmlns:oel="http://schemas.microsoft.com/office/2019/extlst" xmlns:r="http://schemas.openxmlformats.org/officeDocument/2006/relationships" xmlns:m="http://schemas.openxmlformats.org/officeDocument/2006/math" xmlns:v="urn:schemas-microsoft-com:vml" xmlns:wp14="http://schemas.microsoft.com/office/word/2010/wordprocessingDrawing" xmlns:wp="http://schemas.openxmlformats.org/drawingml/2006/wordprocessingDrawing" xmlns:w10="urn:schemas-microsoft-com:office:word" xmlns:w="http://schemas.openxmlformats.org/wordprocessingml/2006/main" xmlns:w14="http://schemas.microsoft.com/office/word/2010/wordml" xmlns:w15="http://schemas.microsoft.com/office/word/2012/wordml" xmlns:w16cei="http://schemas.microsoft.com/office/word/2026/wordml/cei" xmlns:w16cex="http://schemas.microsoft.com/office/word/2018/wordml/cex" xmlns:w16cid="http://schemas.microsoft.com/office/word/2016/wordml/cid" xmlns:w16="http://schemas.microsoft.com/office/word/2018/wordml" xmlns:w16du="http://schemas.microsoft.com/office/word/2023/wordml/word16du" xmlns:w16sdtdh="http://schemas.microsoft.com/office/word/2020/wordml/sdtdatahash" xmlns:w16sdtfl="http://schemas.microsoft.com/office/word/2024/wordml/sdtformatlock" xmlns:w16se="http://schemas.microsoft.com/office/word/2015/wordml/symex" xmlns:wpg="http://schemas.microsoft.com/office/word/2010/wordprocessingGroup" xmlns:wpi="http://schemas.microsoft.com/office/word/2010/wordprocessingInk" xmlns:wne="http://schemas.microsoft.com/office/word/2006/wordml" xmlns:wps="http://schemas.microsoft.com/office/word/2010/wordprocessingShape" mc:Ignorable="w14 w15 w16se w16cid w16 w16cex w16sdtdh w16sdtfl w16du wp14">
+<w:numbering xmlns:wpc="http://schemas.microsoft.com/office/word/2010/wordprocessingCanvas" xmlns:cx="http://schemas.microsoft.com/office/drawing/2014/chartex" xmlns:cx1="http://schemas.microsoft.com/office/drawing/2015/9/8/chartex" xmlns:cx2="http://schemas.microsoft.com/office/drawing/2015/10/21/chartex" xmlns:cx3="http://schemas.microsoft.com/office/drawing/2016/5/9/chartex" xmlns:cx4="http://schemas.microsoft.com/office/drawing/2016/5/10/chartex" xmlns:cx5="http://schemas.microsoft.com/office/drawing/2016/5/11/chartex" xmlns:cx6="http://schemas.microsoft.com/office/drawing/2016/5/12/chartex" xmlns:cx7="http://schemas.microsoft.com/office/drawing/2016/5/13/chartex" xmlns:cx8="http://schemas.microsoft.com/office/drawing/2016/5/14/chartex" xmlns:mc="http://schemas.openxmlformats.org/markup-compatibility/2006" xmlns:aink="http://schemas.microsoft.com/office/drawing/2016/ink" xmlns:am3d="http://schemas.microsoft.com/office/drawing/2017/model3d" xmlns:o="urn:schemas-microsoft-com:office:office" xmlns:oel="http://schemas.microsoft.com/office/2019/extlst" xmlns:r="http://schemas.openxmlformats.org/officeDocument/2006/relationships" xmlns:m="http://schemas.openxmlformats.org/officeDocument/2006/math" xmlns:v="urn:schemas-microsoft-com:vml" xmlns:wp14="http://schemas.microsoft.com/office/word/2010/wordprocessingDrawing" xmlns:wp="http://schemas.openxmlformats.org/drawingml/2006/wordprocessingDrawing" xmlns:w10="urn:schemas-microsoft-com:office:word" xmlns:w="http://schemas.openxmlformats.org/wordprocessingml/2006/main" xmlns:w14="http://schemas.microsoft.com/office/word/2010/wordml" xmlns:w15="http://schemas.microsoft.com/office/word/2012/wordml" xmlns:w16cex="http://schemas.microsoft.com/office/word/2018/wordml/cex" xmlns:w16cid="http://schemas.microsoft.com/office/word/2016/wordml/cid" xmlns:w16="http://schemas.microsoft.com/office/word/2018/wordml" xmlns:w16du="http://schemas.microsoft.com/office/word/2023/wordml/word16du" xmlns:w16sdtdh="http://schemas.microsoft.com/office/word/2020/wordml/sdtdatahash" xmlns:w16sdtfl="http://schemas.microsoft.com/office/word/2024/wordml/sdtformatlock" xmlns:w16se="http://schemas.microsoft.com/office/word/2015/wordml/symex" xmlns:wpg="http://schemas.microsoft.com/office/word/2010/wordprocessingGroup" xmlns:wpi="http://schemas.microsoft.com/office/word/2010/wordprocessingInk" xmlns:wne="http://schemas.microsoft.com/office/word/2006/wordml" xmlns:wps="http://schemas.microsoft.com/office/word/2010/wordprocessingShape" mc:Ignorable="w14 w15 w16se w16cid w16 w16cex w16sdtdh w16sdtfl w16du wp14">
   <w:abstractNum w:abstractNumId="0" w15:restartNumberingAfterBreak="0">
     <w:nsid w:val="325D5591"/>
     <w:multiLevelType w:val="hybridMultilevel"/>
-    <w:tmpl w:val="CC16F3F4"/>
-    <w:lvl w:ilvl="0" w:tplc="2C0A0001">
+    <w:tmpl w:val="97285448"/>
+    <w:lvl w:ilvl="0" w:tplc="A4922334">
       <w:start w:val="1"/>
       <w:numFmt w:val="bullet"/>
       <w:lvlText w:val=""/>
@@ -2552,6 +3083,8 @@
       </w:pPr>
       <w:rPr>
         <w:rFonts w:ascii="Symbol" w:hAnsi="Symbol" w:hint="default"/>
+        <w:sz w:val="18"/>
+        <w:szCs w:val="18"/>
       </w:rPr>
     </w:lvl>
     <w:lvl w:ilvl="1" w:tplc="2C0A0003" w:tentative="1">

</xml_diff>